<commit_message>
Documentatie aangepast, pitch toegevoegd, button header aangepast
</commit_message>
<xml_diff>
--- a/Documentatie/Disney Dimensions.docx
+++ b/Documentatie/Disney Dimensions.docx
@@ -8257,7 +8257,7 @@
           <w:noProof/>
         </w:rPr>
         <w:drawing>
-          <wp:inline distT="0" distB="0" distL="0" distR="0" wp14:anchorId="49A6505F" wp14:editId="42E7E20F">
+          <wp:inline distT="0" distB="0" distL="0" distR="0" wp14:anchorId="49A6505F" wp14:editId="074D81CF">
             <wp:extent cx="5731510" cy="4079240"/>
             <wp:effectExtent l="0" t="0" r="0" b="0"/>
             <wp:docPr id="69312833" name="Picture 2"/>
@@ -9405,10 +9405,66 @@
       </w:r>
       <w:proofErr w:type="spellEnd"/>
       <w:r>
-        <w:t xml:space="preserve"> van de AR-omgeving nog mist. Die ben ik inderdaad vergeten</w:t>
-      </w:r>
-      <w:r>
-        <w:t xml:space="preserve"> en zal in een volgende iteratie worden toegepast. Ook de feedback van Wessel</w:t>
+        <w:t xml:space="preserve"> van de AR-omgeving nog mist. </w:t>
+      </w:r>
+      <w:r>
+        <w:t xml:space="preserve">Ik heb bewust besloten om de </w:t>
+      </w:r>
+      <w:proofErr w:type="spellStart"/>
+      <w:r>
+        <w:t>onboarding</w:t>
+      </w:r>
+      <w:proofErr w:type="spellEnd"/>
+      <w:r>
+        <w:t xml:space="preserve"> niet te implementeren, omdat de focus van dit eindproject ligt op het aantonen van AR-kennis. De </w:t>
+      </w:r>
+      <w:proofErr w:type="spellStart"/>
+      <w:r>
+        <w:t>onboarding</w:t>
+      </w:r>
+      <w:proofErr w:type="spellEnd"/>
+      <w:r>
+        <w:t xml:space="preserve"> is daarom verplaatst van </w:t>
+      </w:r>
+      <w:r>
+        <w:t>‘m</w:t>
+      </w:r>
+      <w:r>
+        <w:t>ust</w:t>
+      </w:r>
+      <w:r>
+        <w:t>’</w:t>
+      </w:r>
+      <w:r>
+        <w:t xml:space="preserve"> naar </w:t>
+      </w:r>
+      <w:r>
+        <w:t>‘</w:t>
+      </w:r>
+      <w:proofErr w:type="spellStart"/>
+      <w:r>
+        <w:t>c</w:t>
+      </w:r>
+      <w:r>
+        <w:t>ould</w:t>
+      </w:r>
+      <w:proofErr w:type="spellEnd"/>
+      <w:r>
+        <w:t>’</w:t>
+      </w:r>
+      <w:r>
+        <w:t xml:space="preserve"> in de </w:t>
+      </w:r>
+      <w:proofErr w:type="spellStart"/>
+      <w:r>
+        <w:t>requirements</w:t>
+      </w:r>
+      <w:proofErr w:type="spellEnd"/>
+      <w:r>
+        <w:t xml:space="preserve">. </w:t>
+      </w:r>
+      <w:r>
+        <w:t>Ook de feedback van Wessel</w:t>
       </w:r>
       <w:r>
         <w:t xml:space="preserve"> uit de peer-checklist</w:t>
@@ -9459,6 +9515,9 @@
       </w:r>
       <w:r>
         <w:t>bij het eind prototype namelijk vooral om dat ik mijn AR-kennis aantoon.</w:t>
+      </w:r>
+      <w:r>
+        <w:t xml:space="preserve"> Om deze </w:t>
       </w:r>
     </w:p>
     <w:p>
@@ -10245,35 +10304,386 @@
       <w:proofErr w:type="spellEnd"/>
     </w:p>
     <w:p>
+      <w:r>
+        <w:t xml:space="preserve">Bij het ontwerpen van de AR-interactie in Disney </w:t>
+      </w:r>
+      <w:proofErr w:type="spellStart"/>
+      <w:r>
+        <w:t>Dimensions</w:t>
+      </w:r>
+      <w:proofErr w:type="spellEnd"/>
+      <w:r>
+        <w:t xml:space="preserve"> is gekozen voor een aanraak</w:t>
+      </w:r>
+      <w:r>
+        <w:t>-</w:t>
+      </w:r>
+      <w:r>
+        <w:t>interactie waarbij de gebruiker op Sneeuwwitje klikt om haar outfit te veranderen. Dit sluit aan bij het manipulatie-interactietype: de gebruiker handelt direct op een virtueel object</w:t>
+      </w:r>
+      <w:r>
+        <w:t xml:space="preserve"> </w:t>
+      </w:r>
+      <w:r>
+        <w:t>(</w:t>
+      </w:r>
+      <w:r>
+        <w:t xml:space="preserve">Bron: </w:t>
+      </w:r>
+      <w:r>
+        <w:t xml:space="preserve">Les 6, </w:t>
+      </w:r>
+      <w:proofErr w:type="spellStart"/>
+      <w:r>
+        <w:t>Interaction</w:t>
+      </w:r>
+      <w:proofErr w:type="spellEnd"/>
+      <w:r>
+        <w:t xml:space="preserve"> Types).</w:t>
+      </w:r>
+    </w:p>
+    <w:p/>
+    <w:p>
       <w:pPr>
         <w:rPr>
-          <w:lang w:val="en-US"/>
+          <w:b/>
+          <w:bCs/>
         </w:rPr>
       </w:pPr>
       <w:r>
         <w:rPr>
-          <w:lang w:val="en-US"/>
+          <w:b/>
+          <w:bCs/>
         </w:rPr>
-        <w:t xml:space="preserve">Interaction metaphors </w:t>
-      </w:r>
-      <w:proofErr w:type="spellStart"/>
-      <w:r>
-        <w:rPr>
-          <w:lang w:val="en-US"/>
-        </w:rPr>
-        <w:t>uitleggen</w:t>
-      </w:r>
-      <w:proofErr w:type="spellEnd"/>
-      <w:r>
-        <w:rPr>
-          <w:lang w:val="en-US"/>
-        </w:rPr>
-        <w:t>.</w:t>
+        <w:t>Conceptueel model en metafoor</w:t>
       </w:r>
     </w:p>
     <w:p>
       <w:r>
-        <w:br w:type="page"/>
+        <w:t xml:space="preserve">De interactie is gebaseerd op een herkenbare metafoor: het "aankleden" van een personage, vergelijkbaar met fysiek kleding wisselen. Gebruikers begrijpen intuïtief dat klikken op Sneeuwwitje iets verandert aan haar verschijning. Dit verlaagt de leercurve en sluit aan bij het principe van interface </w:t>
+      </w:r>
+      <w:proofErr w:type="spellStart"/>
+      <w:r>
+        <w:t>metaphors</w:t>
+      </w:r>
+      <w:proofErr w:type="spellEnd"/>
+      <w:r>
+        <w:t>:</w:t>
+      </w:r>
+      <w:r>
+        <w:t xml:space="preserve"> een bekende ervaring als analogie gebruiken om AR begrijpelijk te maken.</w:t>
+      </w:r>
+    </w:p>
+    <w:p/>
+    <w:p>
+      <w:pPr>
+        <w:rPr>
+          <w:b/>
+          <w:bCs/>
+        </w:rPr>
+      </w:pPr>
+      <w:r>
+        <w:rPr>
+          <w:b/>
+          <w:bCs/>
+        </w:rPr>
+        <w:t>Feedback</w:t>
+      </w:r>
+    </w:p>
+    <w:p>
+      <w:r>
+        <w:lastRenderedPageBreak/>
+        <w:t>Na het klikken krijgt de gebruiker twee gelijktijdige feedbackvormen:</w:t>
+      </w:r>
+    </w:p>
+    <w:p>
+      <w:pPr>
+        <w:pStyle w:val="ListParagraph"/>
+        <w:numPr>
+          <w:ilvl w:val="0"/>
+          <w:numId w:val="58"/>
+        </w:numPr>
+      </w:pPr>
+      <w:r>
+        <w:t>Visuele feedback: de outfit van Sneeuwwitje wisselt</w:t>
+      </w:r>
+      <w:r>
+        <w:t xml:space="preserve"> zichtbaar</w:t>
+      </w:r>
+      <w:r>
+        <w:t xml:space="preserve"> van haar klassieke filmjurk naar haar casual outfit uit Disney Magic Kingdoms.</w:t>
+      </w:r>
+    </w:p>
+    <w:p>
+      <w:pPr>
+        <w:pStyle w:val="ListParagraph"/>
+        <w:numPr>
+          <w:ilvl w:val="0"/>
+          <w:numId w:val="58"/>
+        </w:numPr>
+      </w:pPr>
+      <w:r>
+        <w:t xml:space="preserve">Tekstuele feedback: een balloon </w:t>
+      </w:r>
+      <w:proofErr w:type="spellStart"/>
+      <w:r>
+        <w:t>message</w:t>
+      </w:r>
+      <w:proofErr w:type="spellEnd"/>
+      <w:r>
+        <w:t xml:space="preserve"> verschijnt met de boodschap "In Disney Magic Kingdoms draagt Sneeuwwitje casual kleding!", geïmplementeerd via </w:t>
+      </w:r>
+      <w:proofErr w:type="spellStart"/>
+      <w:proofErr w:type="gramStart"/>
+      <w:r>
+        <w:t>showBalloonMessage</w:t>
+      </w:r>
+      <w:proofErr w:type="spellEnd"/>
+      <w:r>
+        <w:t>(</w:t>
+      </w:r>
+      <w:proofErr w:type="gramEnd"/>
+      <w:r>
+        <w:t xml:space="preserve">) uit </w:t>
+      </w:r>
+      <w:proofErr w:type="spellStart"/>
+      <w:r>
+        <w:t>Needle</w:t>
+      </w:r>
+      <w:proofErr w:type="spellEnd"/>
+      <w:r>
+        <w:t xml:space="preserve"> Engine.</w:t>
+      </w:r>
+    </w:p>
+    <w:p/>
+    <w:p>
+      <w:r>
+        <w:t>Dit is een voorbeeld van multimodale feedback, waarbij meerdere kanalen tegelijk bevestigen dat de interactie geslaagd is (</w:t>
+      </w:r>
+      <w:r>
+        <w:t xml:space="preserve">Bron: </w:t>
+      </w:r>
+      <w:r>
+        <w:t>Les 6, Feedbackprincipes).</w:t>
+      </w:r>
+    </w:p>
+    <w:p/>
+    <w:p>
+      <w:pPr>
+        <w:rPr>
+          <w:b/>
+          <w:bCs/>
+        </w:rPr>
+      </w:pPr>
+      <w:r>
+        <w:rPr>
+          <w:b/>
+          <w:bCs/>
+        </w:rPr>
+        <w:t>Emotionele interactie</w:t>
+      </w:r>
+    </w:p>
+    <w:p>
+      <w:r>
+        <w:t>De outfit-wissel wekt verwondering bij de gebruiker: het toont dat hetzelfde personage in verschillende contexten (</w:t>
+      </w:r>
+      <w:r>
+        <w:t xml:space="preserve">de </w:t>
+      </w:r>
+      <w:r>
+        <w:t xml:space="preserve">film </w:t>
+      </w:r>
+      <w:r>
+        <w:t>en een</w:t>
+      </w:r>
+      <w:r>
+        <w:t xml:space="preserve"> game) anders gepresenteerd wordt. Dit sluit aan bij het principe van </w:t>
+      </w:r>
+      <w:proofErr w:type="spellStart"/>
+      <w:r>
+        <w:t>expressive</w:t>
+      </w:r>
+      <w:proofErr w:type="spellEnd"/>
+      <w:r>
+        <w:t xml:space="preserve"> interfaces</w:t>
+      </w:r>
+      <w:r>
+        <w:t xml:space="preserve">: </w:t>
+      </w:r>
+      <w:r>
+        <w:t>de AR-ervaring draagt een boodschap uit die zonder AR niet op dezelfde manier over zou komen. De interactie is bewust eenmalig en direct, zodat de gebruiker niet overweldigd wordt.</w:t>
+      </w:r>
+    </w:p>
+    <w:p/>
+    <w:p>
+      <w:pPr>
+        <w:rPr>
+          <w:b/>
+          <w:bCs/>
+        </w:rPr>
+      </w:pPr>
+      <w:proofErr w:type="spellStart"/>
+      <w:r>
+        <w:rPr>
+          <w:b/>
+          <w:bCs/>
+        </w:rPr>
+        <w:t>Affordance</w:t>
+      </w:r>
+      <w:proofErr w:type="spellEnd"/>
+      <w:r>
+        <w:rPr>
+          <w:b/>
+          <w:bCs/>
+        </w:rPr>
+        <w:t xml:space="preserve"> en </w:t>
+      </w:r>
+      <w:proofErr w:type="spellStart"/>
+      <w:r>
+        <w:rPr>
+          <w:b/>
+          <w:bCs/>
+        </w:rPr>
+        <w:t>visibility</w:t>
+      </w:r>
+      <w:proofErr w:type="spellEnd"/>
+    </w:p>
+    <w:p>
+      <w:r>
+        <w:t xml:space="preserve">Omdat het AR-object het enige interactieve element in de scène is, is de </w:t>
+      </w:r>
+      <w:proofErr w:type="spellStart"/>
+      <w:r>
+        <w:t>affordance</w:t>
+      </w:r>
+      <w:proofErr w:type="spellEnd"/>
+      <w:r>
+        <w:t xml:space="preserve"> impliciet aanwezig: de gebruiker wordt uitgenodigd te klikken. In een verdere iteratie zou het object licht kunnen oplichten of subtiel bewegen om de interactiviteit nog duidelijker te signaleren (principe van </w:t>
+      </w:r>
+      <w:proofErr w:type="spellStart"/>
+      <w:r>
+        <w:t>visibility</w:t>
+      </w:r>
+      <w:proofErr w:type="spellEnd"/>
+      <w:r>
+        <w:t>: het systeem laat zien wat mogelijk is)</w:t>
+      </w:r>
+      <w:r>
+        <w:t xml:space="preserve"> </w:t>
+      </w:r>
+      <w:r>
+        <w:t>(</w:t>
+      </w:r>
+      <w:r>
+        <w:t xml:space="preserve">Bron: </w:t>
+      </w:r>
+      <w:r>
+        <w:t xml:space="preserve">Les 6, </w:t>
+      </w:r>
+      <w:proofErr w:type="spellStart"/>
+      <w:r>
+        <w:t>Visibility</w:t>
+      </w:r>
+      <w:proofErr w:type="spellEnd"/>
+      <w:r>
+        <w:t xml:space="preserve"> &amp; </w:t>
+      </w:r>
+      <w:proofErr w:type="spellStart"/>
+      <w:r>
+        <w:t>Constraints</w:t>
+      </w:r>
+      <w:proofErr w:type="spellEnd"/>
+      <w:r>
+        <w:t>).</w:t>
+      </w:r>
+    </w:p>
+    <w:p/>
+    <w:p>
+      <w:pPr>
+        <w:rPr>
+          <w:b/>
+          <w:bCs/>
+        </w:rPr>
+      </w:pPr>
+      <w:r>
+        <w:rPr>
+          <w:b/>
+          <w:bCs/>
+        </w:rPr>
+        <w:t>Technische implementatie</w:t>
+      </w:r>
+    </w:p>
+    <w:p>
+      <w:r>
+        <w:t xml:space="preserve">De interactie is gebouwd met </w:t>
+      </w:r>
+      <w:proofErr w:type="spellStart"/>
+      <w:r>
+        <w:t>Needle</w:t>
+      </w:r>
+      <w:proofErr w:type="spellEnd"/>
+      <w:r>
+        <w:t xml:space="preserve"> Engine in </w:t>
+      </w:r>
+      <w:proofErr w:type="spellStart"/>
+      <w:r>
+        <w:t>Unity</w:t>
+      </w:r>
+      <w:proofErr w:type="spellEnd"/>
+      <w:r>
+        <w:t>, waarbij gebruik is gemaakt van de Clickable-component</w:t>
+      </w:r>
+      <w:r>
+        <w:t xml:space="preserve"> die is aangeleverd in de les. Deze code is aangepast </w:t>
+      </w:r>
+      <w:r>
+        <w:t>zodat bij het klikken op Sneeuwwitje het actieve 3D-object wordt verborgen en een tweede object met de casual outfit zichtbaar wordt gemaakt</w:t>
+      </w:r>
+      <w:r>
+        <w:t xml:space="preserve">. </w:t>
+      </w:r>
+      <w:r>
+        <w:t xml:space="preserve">De balloon </w:t>
+      </w:r>
+      <w:proofErr w:type="spellStart"/>
+      <w:r>
+        <w:t>message</w:t>
+      </w:r>
+      <w:proofErr w:type="spellEnd"/>
+      <w:r>
+        <w:t xml:space="preserve"> via </w:t>
+      </w:r>
+      <w:proofErr w:type="spellStart"/>
+      <w:proofErr w:type="gramStart"/>
+      <w:r>
+        <w:t>showBalloonMessage</w:t>
+      </w:r>
+      <w:proofErr w:type="spellEnd"/>
+      <w:r>
+        <w:t>(</w:t>
+      </w:r>
+      <w:proofErr w:type="gramEnd"/>
+      <w:r>
+        <w:t>)</w:t>
+      </w:r>
+      <w:r>
+        <w:t xml:space="preserve"> is daarnaast aangepast naar een </w:t>
+      </w:r>
+      <w:proofErr w:type="spellStart"/>
+      <w:r>
+        <w:t>fun</w:t>
+      </w:r>
+      <w:proofErr w:type="spellEnd"/>
+      <w:r>
+        <w:t xml:space="preserve"> </w:t>
+      </w:r>
+      <w:proofErr w:type="spellStart"/>
+      <w:r>
+        <w:t>fact</w:t>
+      </w:r>
+      <w:proofErr w:type="spellEnd"/>
+      <w:r>
+        <w:t xml:space="preserve"> die past bij persona Rick.</w:t>
       </w:r>
     </w:p>
     <w:p>
@@ -10320,7 +10730,10 @@
       </w:pPr>
       <w:proofErr w:type="gramStart"/>
       <w:r>
-        <w:t>home.html</w:t>
+        <w:t>index</w:t>
+      </w:r>
+      <w:r>
+        <w:t>.html</w:t>
       </w:r>
       <w:proofErr w:type="gramEnd"/>
       <w:r>
@@ -10396,7 +10809,10 @@
       </w:pPr>
       <w:proofErr w:type="gramStart"/>
       <w:r>
-        <w:t>script.js</w:t>
+        <w:t>headerloader</w:t>
+      </w:r>
+      <w:r>
+        <w:t>.js</w:t>
       </w:r>
       <w:proofErr w:type="gramEnd"/>
       <w:r>
@@ -10822,13 +11238,7 @@
       </w:r>
       <w:proofErr w:type="spellEnd"/>
       <w:r>
-        <w:t> klasse</w:t>
-      </w:r>
-      <w:r>
-        <w:t xml:space="preserve"> voor gedeelde stijlen zoals</w:t>
-      </w:r>
-      <w:r>
-        <w:t> font-</w:t>
+        <w:t> klasse voor gedeelde stijlen zoals font-</w:t>
       </w:r>
       <w:proofErr w:type="spellStart"/>
       <w:r>
@@ -10844,19 +11254,13 @@
       </w:r>
       <w:proofErr w:type="spellEnd"/>
       <w:r>
-        <w:t> en border</w:t>
-      </w:r>
-      <w:r>
-        <w:t xml:space="preserve">. De trailer-knop en de CTA-knop hebben daarnaast </w:t>
+        <w:t xml:space="preserve"> en border. De trailer-knop en de CTA-knop hebben daarnaast </w:t>
       </w:r>
       <w:r>
         <w:t>een</w:t>
       </w:r>
       <w:r>
-        <w:t xml:space="preserve"> eigen klasse voor afwijkende stijlen zoals achtergrondkleur en afmetingen</w:t>
-      </w:r>
-      <w:r>
-        <w:t>.</w:t>
+        <w:t xml:space="preserve"> eigen klasse voor afwijkende stijlen zoals achtergrondkleur en afmetingen.</w:t>
       </w:r>
     </w:p>
     <w:p>
@@ -10876,14 +11280,115 @@
       <w:bookmarkEnd w:id="43"/>
     </w:p>
     <w:p>
-      <w:pPr>
-        <w:rPr>
-          <w:rFonts w:asciiTheme="majorHAnsi" w:eastAsiaTheme="majorEastAsia" w:hAnsiTheme="majorHAnsi" w:cstheme="majorBidi"/>
-          <w:color w:val="0F4761" w:themeColor="accent1" w:themeShade="BF"/>
-          <w:sz w:val="40"/>
-          <w:szCs w:val="40"/>
-        </w:rPr>
-      </w:pPr>
+      <w:r>
+        <w:t xml:space="preserve">Het doel van deze opdracht was het ontwerpen en bouwen van een AR-ervaring gekoppeld aan een website, met als thema Disney of </w:t>
+      </w:r>
+      <w:proofErr w:type="spellStart"/>
+      <w:r>
+        <w:t>Wednesday</w:t>
+      </w:r>
+      <w:proofErr w:type="spellEnd"/>
+      <w:r>
+        <w:t xml:space="preserve">. Eerlijk gezegd heb ik niet veel met deze thema’s, wat maakte dat ik het soms lastig vond om gemotiveerd te blijven. Later begreep ik wel dat thema’s als The Simpsons ook </w:t>
+      </w:r>
+      <w:r>
+        <w:t>mogelijk</w:t>
+      </w:r>
+      <w:r>
+        <w:t xml:space="preserve"> waren</w:t>
+      </w:r>
+      <w:r>
+        <w:t>. Als ik de opdracht opnieuw zou moeten doen, dan zou ik meer assertiviteit tonen op het gebied van het thema van de opdracht. Ik had de opdracht veel leuker gevonden als ik iets mocht maken wat ik ook daadwerkelijk interessant en/of nuttig vind.</w:t>
+      </w:r>
+    </w:p>
+    <w:p>
+      <w:r>
+        <w:t xml:space="preserve">Het bouwen van het front-end van de website vond ik het leukste. Hier ligt ook grotendeels mijn interesse. Na het bouwen van de website heb ik een studiegenoot die software engineering studeert om feedback gevraagd. Hij wees mij erop dat een div met </w:t>
+      </w:r>
+      <w:proofErr w:type="spellStart"/>
+      <w:r>
+        <w:t>onclick</w:t>
+      </w:r>
+      <w:proofErr w:type="spellEnd"/>
+      <w:r>
+        <w:t xml:space="preserve"> geen tab-navigatie ondersteunt, en dat een </w:t>
+      </w:r>
+      <w:r>
+        <w:t>a-</w:t>
+      </w:r>
+      <w:r>
+        <w:t>tag voor een knop beter vervangen kon worden door een button, zodat screenreaders er ook correct mee omgaan. Daar had ik zelf nog niet over nagedacht en was dus een goede les.</w:t>
+      </w:r>
+      <w:r>
+        <w:t xml:space="preserve"> </w:t>
+      </w:r>
+      <w:r>
+        <w:t>Deze feedback heb ik verwerkt door de div-</w:t>
+      </w:r>
+      <w:r>
+        <w:t>tags</w:t>
+      </w:r>
+      <w:r>
+        <w:t xml:space="preserve"> met </w:t>
+      </w:r>
+      <w:proofErr w:type="spellStart"/>
+      <w:r>
+        <w:t>onclick</w:t>
+      </w:r>
+      <w:proofErr w:type="spellEnd"/>
+      <w:r>
+        <w:t xml:space="preserve"> te vervangen door a-tags met een </w:t>
+      </w:r>
+      <w:proofErr w:type="spellStart"/>
+      <w:r>
+        <w:t>href</w:t>
+      </w:r>
+      <w:proofErr w:type="spellEnd"/>
+      <w:r>
+        <w:t xml:space="preserve">, en de a-tag van de </w:t>
+      </w:r>
+      <w:r>
+        <w:t>knoppen</w:t>
+      </w:r>
+      <w:r>
+        <w:t xml:space="preserve"> om te zetten naar een button</w:t>
+      </w:r>
+      <w:r>
+        <w:t>-</w:t>
+      </w:r>
+      <w:r>
+        <w:t>tag</w:t>
+      </w:r>
+      <w:r>
+        <w:t>.</w:t>
+      </w:r>
+    </w:p>
+    <w:p>
+      <w:r>
+        <w:t>Het lastigste onderdeel vond ik het maken van het 3D-object. Het vinden van geschikte Disney-assets kost</w:t>
+      </w:r>
+      <w:r>
+        <w:t>t</w:t>
+      </w:r>
+      <w:r>
+        <w:t xml:space="preserve">e erg veel tijd. Er zijn niet veel Disney 3D-objecten en als ze er wel zijn, zijn ze over het algemeen niet gratis. </w:t>
+      </w:r>
+      <w:r>
+        <w:t xml:space="preserve">Daarnaast waren de lessen al zo lang geleden dat ik niet goed meer wist hoe ik mijn </w:t>
+      </w:r>
+      <w:proofErr w:type="spellStart"/>
+      <w:r>
+        <w:t>Unity</w:t>
+      </w:r>
+      <w:proofErr w:type="spellEnd"/>
+      <w:r>
+        <w:t>-project het beste kon opbouwen, waardoor me dat ook veel tijd kostte.</w:t>
+      </w:r>
+    </w:p>
+    <w:p>
+      <w:r>
+        <w:t>Wat ik meeneem uit dit project is vooral het besef dat toegankelijkheid al begint bij kleine keuzes in de HTML en dat het loont om iemand te vragen die even met je meekijkt.</w:t>
+      </w:r>
       <w:r>
         <w:br w:type="page"/>
       </w:r>
@@ -22171,6 +22676,119 @@
     </w:lvl>
   </w:abstractNum>
   <w:abstractNum w:abstractNumId="41" w15:restartNumberingAfterBreak="0">
+    <w:nsid w:val="5C8936BD"/>
+    <w:multiLevelType w:val="hybridMultilevel"/>
+    <w:tmpl w:val="4926C6E4"/>
+    <w:lvl w:ilvl="0" w:tplc="04090001">
+      <w:start w:val="1"/>
+      <w:numFmt w:val="bullet"/>
+      <w:lvlText w:val=""/>
+      <w:lvlJc w:val="left"/>
+      <w:pPr>
+        <w:ind w:left="720" w:hanging="360"/>
+      </w:pPr>
+      <w:rPr>
+        <w:rFonts w:ascii="Symbol" w:hAnsi="Symbol" w:hint="default"/>
+      </w:rPr>
+    </w:lvl>
+    <w:lvl w:ilvl="1" w:tplc="04090003" w:tentative="1">
+      <w:start w:val="1"/>
+      <w:numFmt w:val="bullet"/>
+      <w:lvlText w:val="o"/>
+      <w:lvlJc w:val="left"/>
+      <w:pPr>
+        <w:ind w:left="1440" w:hanging="360"/>
+      </w:pPr>
+      <w:rPr>
+        <w:rFonts w:ascii="Courier New" w:hAnsi="Courier New" w:cs="Courier New" w:hint="default"/>
+      </w:rPr>
+    </w:lvl>
+    <w:lvl w:ilvl="2" w:tplc="04090005" w:tentative="1">
+      <w:start w:val="1"/>
+      <w:numFmt w:val="bullet"/>
+      <w:lvlText w:val=""/>
+      <w:lvlJc w:val="left"/>
+      <w:pPr>
+        <w:ind w:left="2160" w:hanging="360"/>
+      </w:pPr>
+      <w:rPr>
+        <w:rFonts w:ascii="Wingdings" w:hAnsi="Wingdings" w:hint="default"/>
+      </w:rPr>
+    </w:lvl>
+    <w:lvl w:ilvl="3" w:tplc="04090001" w:tentative="1">
+      <w:start w:val="1"/>
+      <w:numFmt w:val="bullet"/>
+      <w:lvlText w:val=""/>
+      <w:lvlJc w:val="left"/>
+      <w:pPr>
+        <w:ind w:left="2880" w:hanging="360"/>
+      </w:pPr>
+      <w:rPr>
+        <w:rFonts w:ascii="Symbol" w:hAnsi="Symbol" w:hint="default"/>
+      </w:rPr>
+    </w:lvl>
+    <w:lvl w:ilvl="4" w:tplc="04090003" w:tentative="1">
+      <w:start w:val="1"/>
+      <w:numFmt w:val="bullet"/>
+      <w:lvlText w:val="o"/>
+      <w:lvlJc w:val="left"/>
+      <w:pPr>
+        <w:ind w:left="3600" w:hanging="360"/>
+      </w:pPr>
+      <w:rPr>
+        <w:rFonts w:ascii="Courier New" w:hAnsi="Courier New" w:cs="Courier New" w:hint="default"/>
+      </w:rPr>
+    </w:lvl>
+    <w:lvl w:ilvl="5" w:tplc="04090005" w:tentative="1">
+      <w:start w:val="1"/>
+      <w:numFmt w:val="bullet"/>
+      <w:lvlText w:val=""/>
+      <w:lvlJc w:val="left"/>
+      <w:pPr>
+        <w:ind w:left="4320" w:hanging="360"/>
+      </w:pPr>
+      <w:rPr>
+        <w:rFonts w:ascii="Wingdings" w:hAnsi="Wingdings" w:hint="default"/>
+      </w:rPr>
+    </w:lvl>
+    <w:lvl w:ilvl="6" w:tplc="04090001" w:tentative="1">
+      <w:start w:val="1"/>
+      <w:numFmt w:val="bullet"/>
+      <w:lvlText w:val=""/>
+      <w:lvlJc w:val="left"/>
+      <w:pPr>
+        <w:ind w:left="5040" w:hanging="360"/>
+      </w:pPr>
+      <w:rPr>
+        <w:rFonts w:ascii="Symbol" w:hAnsi="Symbol" w:hint="default"/>
+      </w:rPr>
+    </w:lvl>
+    <w:lvl w:ilvl="7" w:tplc="04090003" w:tentative="1">
+      <w:start w:val="1"/>
+      <w:numFmt w:val="bullet"/>
+      <w:lvlText w:val="o"/>
+      <w:lvlJc w:val="left"/>
+      <w:pPr>
+        <w:ind w:left="5760" w:hanging="360"/>
+      </w:pPr>
+      <w:rPr>
+        <w:rFonts w:ascii="Courier New" w:hAnsi="Courier New" w:cs="Courier New" w:hint="default"/>
+      </w:rPr>
+    </w:lvl>
+    <w:lvl w:ilvl="8" w:tplc="04090005" w:tentative="1">
+      <w:start w:val="1"/>
+      <w:numFmt w:val="bullet"/>
+      <w:lvlText w:val=""/>
+      <w:lvlJc w:val="left"/>
+      <w:pPr>
+        <w:ind w:left="6480" w:hanging="360"/>
+      </w:pPr>
+      <w:rPr>
+        <w:rFonts w:ascii="Wingdings" w:hAnsi="Wingdings" w:hint="default"/>
+      </w:rPr>
+    </w:lvl>
+  </w:abstractNum>
+  <w:abstractNum w:abstractNumId="42" w15:restartNumberingAfterBreak="0">
     <w:nsid w:val="5E1B0439"/>
     <w:multiLevelType w:val="multilevel"/>
     <w:tmpl w:val="572C91AC"/>
@@ -22319,7 +22937,7 @@
       </w:rPr>
     </w:lvl>
   </w:abstractNum>
-  <w:abstractNum w:abstractNumId="42" w15:restartNumberingAfterBreak="0">
+  <w:abstractNum w:abstractNumId="43" w15:restartNumberingAfterBreak="0">
     <w:nsid w:val="635F76CE"/>
     <w:multiLevelType w:val="hybridMultilevel"/>
     <w:tmpl w:val="272C13CC"/>
@@ -22405,7 +23023,7 @@
       </w:pPr>
     </w:lvl>
   </w:abstractNum>
-  <w:abstractNum w:abstractNumId="43" w15:restartNumberingAfterBreak="0">
+  <w:abstractNum w:abstractNumId="44" w15:restartNumberingAfterBreak="0">
     <w:nsid w:val="662D197A"/>
     <w:multiLevelType w:val="hybridMultilevel"/>
     <w:tmpl w:val="FFFFFFFF"/>
@@ -22491,7 +23109,7 @@
       </w:pPr>
     </w:lvl>
   </w:abstractNum>
-  <w:abstractNum w:abstractNumId="44" w15:restartNumberingAfterBreak="0">
+  <w:abstractNum w:abstractNumId="45" w15:restartNumberingAfterBreak="0">
     <w:nsid w:val="688B6915"/>
     <w:multiLevelType w:val="hybridMultilevel"/>
     <w:tmpl w:val="ADCAB500"/>
@@ -22577,7 +23195,7 @@
       </w:pPr>
     </w:lvl>
   </w:abstractNum>
-  <w:abstractNum w:abstractNumId="45" w15:restartNumberingAfterBreak="0">
+  <w:abstractNum w:abstractNumId="46" w15:restartNumberingAfterBreak="0">
     <w:nsid w:val="68AA9DFA"/>
     <w:multiLevelType w:val="hybridMultilevel"/>
     <w:tmpl w:val="FFFFFFFF"/>
@@ -22690,7 +23308,7 @@
       </w:rPr>
     </w:lvl>
   </w:abstractNum>
-  <w:abstractNum w:abstractNumId="46" w15:restartNumberingAfterBreak="0">
+  <w:abstractNum w:abstractNumId="47" w15:restartNumberingAfterBreak="0">
     <w:nsid w:val="6959468E"/>
     <w:multiLevelType w:val="hybridMultilevel"/>
     <w:tmpl w:val="FF4C8B3A"/>
@@ -22803,7 +23421,7 @@
       </w:rPr>
     </w:lvl>
   </w:abstractNum>
-  <w:abstractNum w:abstractNumId="47" w15:restartNumberingAfterBreak="0">
+  <w:abstractNum w:abstractNumId="48" w15:restartNumberingAfterBreak="0">
     <w:nsid w:val="6A5A3BE9"/>
     <w:multiLevelType w:val="multilevel"/>
     <w:tmpl w:val="F1E8E92A"/>
@@ -22919,7 +23537,7 @@
       </w:rPr>
     </w:lvl>
   </w:abstractNum>
-  <w:abstractNum w:abstractNumId="48" w15:restartNumberingAfterBreak="0">
+  <w:abstractNum w:abstractNumId="49" w15:restartNumberingAfterBreak="0">
     <w:nsid w:val="6CC76D86"/>
     <w:multiLevelType w:val="hybridMultilevel"/>
     <w:tmpl w:val="E76EFA9C"/>
@@ -23032,7 +23650,7 @@
       </w:rPr>
     </w:lvl>
   </w:abstractNum>
-  <w:abstractNum w:abstractNumId="49" w15:restartNumberingAfterBreak="0">
+  <w:abstractNum w:abstractNumId="50" w15:restartNumberingAfterBreak="0">
     <w:nsid w:val="6D75648B"/>
     <w:multiLevelType w:val="multilevel"/>
     <w:tmpl w:val="C988046C"/>
@@ -23181,7 +23799,7 @@
       </w:rPr>
     </w:lvl>
   </w:abstractNum>
-  <w:abstractNum w:abstractNumId="50" w15:restartNumberingAfterBreak="0">
+  <w:abstractNum w:abstractNumId="51" w15:restartNumberingAfterBreak="0">
     <w:nsid w:val="6E64BA29"/>
     <w:multiLevelType w:val="hybridMultilevel"/>
     <w:tmpl w:val="FFFFFFFF"/>
@@ -23267,7 +23885,7 @@
       </w:pPr>
     </w:lvl>
   </w:abstractNum>
-  <w:abstractNum w:abstractNumId="51" w15:restartNumberingAfterBreak="0">
+  <w:abstractNum w:abstractNumId="52" w15:restartNumberingAfterBreak="0">
     <w:nsid w:val="6FE1619B"/>
     <w:multiLevelType w:val="multilevel"/>
     <w:tmpl w:val="51940888"/>
@@ -23383,7 +24001,7 @@
       </w:rPr>
     </w:lvl>
   </w:abstractNum>
-  <w:abstractNum w:abstractNumId="52" w15:restartNumberingAfterBreak="0">
+  <w:abstractNum w:abstractNumId="53" w15:restartNumberingAfterBreak="0">
     <w:nsid w:val="75AF0EEE"/>
     <w:multiLevelType w:val="hybridMultilevel"/>
     <w:tmpl w:val="F7FE784E"/>
@@ -23496,7 +24114,7 @@
       </w:rPr>
     </w:lvl>
   </w:abstractNum>
-  <w:abstractNum w:abstractNumId="53" w15:restartNumberingAfterBreak="0">
+  <w:abstractNum w:abstractNumId="54" w15:restartNumberingAfterBreak="0">
     <w:nsid w:val="76EBDEA2"/>
     <w:multiLevelType w:val="hybridMultilevel"/>
     <w:tmpl w:val="FFFFFFFF"/>
@@ -23609,7 +24227,7 @@
       </w:rPr>
     </w:lvl>
   </w:abstractNum>
-  <w:abstractNum w:abstractNumId="54" w15:restartNumberingAfterBreak="0">
+  <w:abstractNum w:abstractNumId="55" w15:restartNumberingAfterBreak="0">
     <w:nsid w:val="78787441"/>
     <w:multiLevelType w:val="multilevel"/>
     <w:tmpl w:val="44DCF932"/>
@@ -23758,7 +24376,7 @@
       </w:rPr>
     </w:lvl>
   </w:abstractNum>
-  <w:abstractNum w:abstractNumId="55" w15:restartNumberingAfterBreak="0">
+  <w:abstractNum w:abstractNumId="56" w15:restartNumberingAfterBreak="0">
     <w:nsid w:val="7FA3754E"/>
     <w:multiLevelType w:val="multilevel"/>
     <w:tmpl w:val="E37485DE"/>
@@ -23877,7 +24495,7 @@
     <w:abstractNumId w:val="6"/>
   </w:num>
   <w:num w:numId="2" w16cid:durableId="1435902850">
-    <w:abstractNumId w:val="51"/>
+    <w:abstractNumId w:val="52"/>
   </w:num>
   <w:num w:numId="3" w16cid:durableId="1742175652">
     <w:abstractNumId w:val="3"/>
@@ -23895,7 +24513,7 @@
     <w:abstractNumId w:val="15"/>
   </w:num>
   <w:num w:numId="8" w16cid:durableId="151994573">
-    <w:abstractNumId w:val="55"/>
+    <w:abstractNumId w:val="56"/>
   </w:num>
   <w:num w:numId="9" w16cid:durableId="1185095058">
     <w:abstractNumId w:val="33"/>
@@ -23904,7 +24522,7 @@
     <w:abstractNumId w:val="11"/>
   </w:num>
   <w:num w:numId="11" w16cid:durableId="409035788">
-    <w:abstractNumId w:val="47"/>
+    <w:abstractNumId w:val="48"/>
   </w:num>
   <w:num w:numId="12" w16cid:durableId="1593508544">
     <w:abstractNumId w:val="31"/>
@@ -23953,19 +24571,19 @@
     <w:abstractNumId w:val="7"/>
   </w:num>
   <w:num w:numId="18" w16cid:durableId="931857561">
-    <w:abstractNumId w:val="48"/>
+    <w:abstractNumId w:val="49"/>
   </w:num>
   <w:num w:numId="19" w16cid:durableId="1341009025">
     <w:abstractNumId w:val="8"/>
   </w:num>
   <w:num w:numId="20" w16cid:durableId="1109399185">
-    <w:abstractNumId w:val="45"/>
+    <w:abstractNumId w:val="46"/>
   </w:num>
   <w:num w:numId="21" w16cid:durableId="588123578">
     <w:abstractNumId w:val="29"/>
   </w:num>
   <w:num w:numId="22" w16cid:durableId="1225679690">
-    <w:abstractNumId w:val="53"/>
+    <w:abstractNumId w:val="54"/>
   </w:num>
   <w:num w:numId="23" w16cid:durableId="112092813">
     <w:abstractNumId w:val="20"/>
@@ -23974,10 +24592,10 @@
     <w:abstractNumId w:val="22"/>
   </w:num>
   <w:num w:numId="25" w16cid:durableId="1926763347">
-    <w:abstractNumId w:val="49"/>
+    <w:abstractNumId w:val="50"/>
   </w:num>
   <w:num w:numId="26" w16cid:durableId="1581136763">
-    <w:abstractNumId w:val="54"/>
+    <w:abstractNumId w:val="55"/>
   </w:num>
   <w:num w:numId="27" w16cid:durableId="803306979">
     <w:abstractNumId w:val="10"/>
@@ -23989,7 +24607,7 @@
     <w:abstractNumId w:val="0"/>
   </w:num>
   <w:num w:numId="30" w16cid:durableId="3746330">
-    <w:abstractNumId w:val="41"/>
+    <w:abstractNumId w:val="42"/>
   </w:num>
   <w:num w:numId="31" w16cid:durableId="2111584313">
     <w:abstractNumId w:val="37"/>
@@ -24001,7 +24619,7 @@
     <w:abstractNumId w:val="12"/>
   </w:num>
   <w:num w:numId="34" w16cid:durableId="1420709325">
-    <w:abstractNumId w:val="52"/>
+    <w:abstractNumId w:val="53"/>
   </w:num>
   <w:num w:numId="35" w16cid:durableId="1879077090">
     <w:abstractNumId w:val="39"/>
@@ -24028,7 +24646,7 @@
     <w:abstractNumId w:val="38"/>
   </w:num>
   <w:num w:numId="43" w16cid:durableId="1874876867">
-    <w:abstractNumId w:val="50"/>
+    <w:abstractNumId w:val="51"/>
   </w:num>
   <w:num w:numId="44" w16cid:durableId="225722342">
     <w:abstractNumId w:val="40"/>
@@ -24043,13 +24661,13 @@
     <w:abstractNumId w:val="34"/>
   </w:num>
   <w:num w:numId="48" w16cid:durableId="469905026">
+    <w:abstractNumId w:val="45"/>
+  </w:num>
+  <w:num w:numId="49" w16cid:durableId="378750612">
     <w:abstractNumId w:val="44"/>
   </w:num>
-  <w:num w:numId="49" w16cid:durableId="378750612">
+  <w:num w:numId="50" w16cid:durableId="256135409">
     <w:abstractNumId w:val="43"/>
-  </w:num>
-  <w:num w:numId="50" w16cid:durableId="256135409">
-    <w:abstractNumId w:val="42"/>
   </w:num>
   <w:num w:numId="51" w16cid:durableId="1499661895">
     <w:abstractNumId w:val="26"/>
@@ -24070,7 +24688,10 @@
     <w:abstractNumId w:val="5"/>
   </w:num>
   <w:num w:numId="57" w16cid:durableId="718168753">
-    <w:abstractNumId w:val="46"/>
+    <w:abstractNumId w:val="47"/>
+  </w:num>
+  <w:num w:numId="58" w16cid:durableId="1355155611">
+    <w:abstractNumId w:val="41"/>
   </w:num>
   <w:numIdMacAtCleanup w:val="49"/>
 </w:numbering>
@@ -26200,12 +26821,6 @@
 </file>
 
 <file path=customXml/item1.xml><?xml version="1.0" encoding="utf-8"?>
-<p:properties xmlns:p="http://schemas.microsoft.com/office/2006/metadata/properties" xmlns:xsi="http://www.w3.org/2001/XMLSchema-instance" xmlns:pc="http://schemas.microsoft.com/office/infopath/2007/PartnerControls">
-  <documentManagement/>
-</p:properties>
-</file>
-
-<file path=customXml/item2.xml><?xml version="1.0" encoding="utf-8"?>
 <b:Sources xmlns:b="http://schemas.openxmlformats.org/officeDocument/2006/bibliography" xmlns="http://schemas.openxmlformats.org/officeDocument/2006/bibliography" SelectedStyle="/APASixthEditionOfficeOnline.xsl" StyleName="APA" Version="6">
   <b:Source>
     <b:Tag>Vin22</b:Tag>
@@ -26300,16 +26915,13 @@
 </b:Sources>
 </file>
 
-<file path=customXml/item3.xml><?xml version="1.0" encoding="utf-8"?>
-<?mso-contentType ?>
-<FormTemplates xmlns="http://schemas.microsoft.com/sharepoint/v3/contenttype/forms">
-  <Display>DocumentLibraryForm</Display>
-  <Edit>DocumentLibraryForm</Edit>
-  <New>DocumentLibraryForm</New>
-</FormTemplates>
+<file path=customXml/item2.xml><?xml version="1.0" encoding="utf-8"?>
+<p:properties xmlns:p="http://schemas.microsoft.com/office/2006/metadata/properties" xmlns:xsi="http://www.w3.org/2001/XMLSchema-instance" xmlns:pc="http://schemas.microsoft.com/office/infopath/2007/PartnerControls">
+  <documentManagement/>
+</p:properties>
 </file>
 
-<file path=customXml/item4.xml><?xml version="1.0" encoding="utf-8"?>
+<file path=customXml/item3.xml><?xml version="1.0" encoding="utf-8"?>
 <ct:contentTypeSchema xmlns:ct="http://schemas.microsoft.com/office/2006/metadata/contentType" xmlns:ma="http://schemas.microsoft.com/office/2006/metadata/properties/metaAttributes" ct:_="" ma:_="" ma:contentTypeName="Document" ma:contentTypeID="0x010100D0BB77D65DB97745B835076E0EF123F1" ma:contentTypeVersion="3" ma:contentTypeDescription="Een nieuw document maken." ma:contentTypeScope="" ma:versionID="f5e20feff643aae03d305ed3501b9de7">
   <xsd:schema xmlns:xsd="http://www.w3.org/2001/XMLSchema" xmlns:xs="http://www.w3.org/2001/XMLSchema" xmlns:p="http://schemas.microsoft.com/office/2006/metadata/properties" xmlns:ns2="9c4fc8d7-28d9-45de-9015-6a9b5ed128f7" targetNamespace="http://schemas.microsoft.com/office/2006/metadata/properties" ma:root="true" ma:fieldsID="e4c8b2eb8dfeb271dd91865265868f5e" ns2:_="">
     <xsd:import namespace="9c4fc8d7-28d9-45de-9015-6a9b5ed128f7"/>
@@ -26447,7 +27059,24 @@
 </ct:contentTypeSchema>
 </file>
 
+<file path=customXml/item4.xml><?xml version="1.0" encoding="utf-8"?>
+<?mso-contentType ?>
+<FormTemplates xmlns="http://schemas.microsoft.com/sharepoint/v3/contenttype/forms">
+  <Display>DocumentLibraryForm</Display>
+  <Edit>DocumentLibraryForm</Edit>
+  <New>DocumentLibraryForm</New>
+</FormTemplates>
+</file>
+
 <file path=customXml/itemProps1.xml><?xml version="1.0" encoding="utf-8"?>
+<ds:datastoreItem xmlns:ds="http://schemas.openxmlformats.org/officeDocument/2006/customXml" ds:itemID="{8C6B7691-150B-3140-AF98-66DE9E0B84E1}">
+  <ds:schemaRefs>
+    <ds:schemaRef ds:uri="http://schemas.openxmlformats.org/officeDocument/2006/bibliography"/>
+  </ds:schemaRefs>
+</ds:datastoreItem>
+</file>
+
+<file path=customXml/itemProps2.xml><?xml version="1.0" encoding="utf-8"?>
 <ds:datastoreItem xmlns:ds="http://schemas.openxmlformats.org/officeDocument/2006/customXml" ds:itemID="{F6733805-3435-4F94-A33F-6225E5CBCD31}">
   <ds:schemaRefs>
     <ds:schemaRef ds:uri="http://schemas.microsoft.com/office/2006/metadata/properties"/>
@@ -26456,23 +27085,7 @@
 </ds:datastoreItem>
 </file>
 
-<file path=customXml/itemProps2.xml><?xml version="1.0" encoding="utf-8"?>
-<ds:datastoreItem xmlns:ds="http://schemas.openxmlformats.org/officeDocument/2006/customXml" ds:itemID="{8C6B7691-150B-3140-AF98-66DE9E0B84E1}">
-  <ds:schemaRefs>
-    <ds:schemaRef ds:uri="http://schemas.openxmlformats.org/officeDocument/2006/bibliography"/>
-  </ds:schemaRefs>
-</ds:datastoreItem>
-</file>
-
 <file path=customXml/itemProps3.xml><?xml version="1.0" encoding="utf-8"?>
-<ds:datastoreItem xmlns:ds="http://schemas.openxmlformats.org/officeDocument/2006/customXml" ds:itemID="{82D9BFC6-F333-43E5-9205-C8904E48ED3D}">
-  <ds:schemaRefs>
-    <ds:schemaRef ds:uri="http://schemas.microsoft.com/sharepoint/v3/contenttype/forms"/>
-  </ds:schemaRefs>
-</ds:datastoreItem>
-</file>
-
-<file path=customXml/itemProps4.xml><?xml version="1.0" encoding="utf-8"?>
 <ds:datastoreItem xmlns:ds="http://schemas.openxmlformats.org/officeDocument/2006/customXml" ds:itemID="{BCB0D87B-C877-4F66-B5F5-352EF415DDF1}">
   <ds:schemaRefs>
     <ds:schemaRef ds:uri="http://schemas.microsoft.com/office/2006/metadata/contentType"/>
@@ -26490,6 +27103,14 @@
 </ds:datastoreItem>
 </file>
 
+<file path=customXml/itemProps4.xml><?xml version="1.0" encoding="utf-8"?>
+<ds:datastoreItem xmlns:ds="http://schemas.openxmlformats.org/officeDocument/2006/customXml" ds:itemID="{82D9BFC6-F333-43E5-9205-C8904E48ED3D}">
+  <ds:schemaRefs>
+    <ds:schemaRef ds:uri="http://schemas.microsoft.com/sharepoint/v3/contenttype/forms"/>
+  </ds:schemaRefs>
+</ds:datastoreItem>
+</file>
+
 <file path=docMetadata/LabelInfo.xml><?xml version="1.0" encoding="utf-8"?>
 <clbl:labelList xmlns:clbl="http://schemas.microsoft.com/office/2020/mipLabelMetadata">
   <clbl:label id="{e36377b7-70c4-4493-a338-095918d327e9}" enabled="0" method="" siteId="{e36377b7-70c4-4493-a338-095918d327e9}" removed="1"/>

</xml_diff>

<commit_message>
Peer checklist aangevuld Jor & Wessel
</commit_message>
<xml_diff>
--- a/Documentatie/Disney Dimensions.docx
+++ b/Documentatie/Disney Dimensions.docx
@@ -8257,7 +8257,7 @@
           <w:noProof/>
         </w:rPr>
         <w:drawing>
-          <wp:inline distT="0" distB="0" distL="0" distR="0" wp14:anchorId="49A6505F" wp14:editId="074D81CF">
+          <wp:inline distT="0" distB="0" distL="0" distR="0" wp14:anchorId="49A6505F" wp14:editId="7B4E0F44">
             <wp:extent cx="5731510" cy="4079240"/>
             <wp:effectExtent l="0" t="0" r="0" b="0"/>
             <wp:docPr id="69312833" name="Picture 2"/>
@@ -9424,36 +9424,15 @@
       </w:r>
       <w:proofErr w:type="spellEnd"/>
       <w:r>
-        <w:t xml:space="preserve"> is daarom verplaatst van </w:t>
-      </w:r>
-      <w:r>
-        <w:t>‘m</w:t>
-      </w:r>
-      <w:r>
-        <w:t>ust</w:t>
-      </w:r>
-      <w:r>
-        <w:t>’</w:t>
-      </w:r>
-      <w:r>
-        <w:t xml:space="preserve"> naar </w:t>
-      </w:r>
-      <w:r>
-        <w:t>‘</w:t>
+        <w:t xml:space="preserve"> is daarom verplaatst van ‘must’ naar ‘</w:t>
       </w:r>
       <w:proofErr w:type="spellStart"/>
       <w:r>
-        <w:t>c</w:t>
-      </w:r>
-      <w:r>
-        <w:t>ould</w:t>
+        <w:t>could</w:t>
       </w:r>
       <w:proofErr w:type="spellEnd"/>
       <w:r>
-        <w:t>’</w:t>
-      </w:r>
-      <w:r>
-        <w:t xml:space="preserve"> in de </w:t>
+        <w:t xml:space="preserve">’ in de </w:t>
       </w:r>
       <w:proofErr w:type="spellStart"/>
       <w:r>
@@ -14486,58 +14465,7 @@
                 <w:szCs w:val="27"/>
               </w:rPr>
             </w:pPr>
-          </w:p>
-        </w:tc>
-        <w:tc>
-          <w:tcPr>
-            <w:tcW w:w="2837" w:type="dxa"/>
-          </w:tcPr>
-          <w:p>
-            <w:pPr>
-              <w:rPr>
-                <w:color w:val="000000"/>
-              </w:rPr>
-            </w:pPr>
-          </w:p>
-        </w:tc>
-        <w:tc>
-          <w:tcPr>
-            <w:tcW w:w="1325" w:type="dxa"/>
-          </w:tcPr>
-          <w:p/>
-        </w:tc>
-      </w:tr>
-      <w:tr>
-        <w:tc>
-          <w:tcPr>
-            <w:tcW w:w="1829" w:type="dxa"/>
-          </w:tcPr>
-          <w:p>
-            <w:pPr>
-              <w:rPr>
-                <w:b/>
-                <w:bCs/>
-              </w:rPr>
-            </w:pPr>
-          </w:p>
-        </w:tc>
-        <w:tc>
-          <w:tcPr>
-            <w:tcW w:w="2578" w:type="dxa"/>
-          </w:tcPr>
-          <w:p>
-            <w:r>
-              <w:t>De pagina’s zijn responsief (werken op desktop en mobiel).</w:t>
-            </w:r>
-          </w:p>
-        </w:tc>
-        <w:tc>
-          <w:tcPr>
-            <w:tcW w:w="778" w:type="dxa"/>
-          </w:tcPr>
-          <w:p>
-            <w:pPr>
-              <w:jc w:val="center"/>
+            <w:r>
               <w:rPr>
                 <w:rFonts w:ascii="Segoe UI Symbol" w:hAnsi="Segoe UI Symbol" w:cs="Segoe UI Symbol"/>
                 <w:b/>
@@ -14546,7 +14474,8 @@
                 <w:sz w:val="27"/>
                 <w:szCs w:val="27"/>
               </w:rPr>
-            </w:pPr>
+              <w:t>✓</w:t>
+            </w:r>
           </w:p>
         </w:tc>
         <w:tc>
@@ -14559,6 +14488,12 @@
                 <w:color w:val="000000"/>
               </w:rPr>
             </w:pPr>
+            <w:r>
+              <w:t>Leuke trailer knop</w:t>
+            </w:r>
+            <w:r>
+              <w:t>.</w:t>
+            </w:r>
           </w:p>
         </w:tc>
         <w:tc>
@@ -14588,7 +14523,7 @@
           </w:tcPr>
           <w:p>
             <w:r>
-              <w:t>Interacties of animaties zijn technisch correct geïmplementeerd.</w:t>
+              <w:t>De pagina’s zijn responsief (werken op desktop en mobiel).</w:t>
             </w:r>
           </w:p>
         </w:tc>
@@ -14608,65 +14543,7 @@
                 <w:szCs w:val="27"/>
               </w:rPr>
             </w:pPr>
-          </w:p>
-        </w:tc>
-        <w:tc>
-          <w:tcPr>
-            <w:tcW w:w="2837" w:type="dxa"/>
-          </w:tcPr>
-          <w:p>
-            <w:pPr>
-              <w:rPr>
-                <w:color w:val="000000"/>
-              </w:rPr>
-            </w:pPr>
-          </w:p>
-        </w:tc>
-        <w:tc>
-          <w:tcPr>
-            <w:tcW w:w="1325" w:type="dxa"/>
-          </w:tcPr>
-          <w:p/>
-        </w:tc>
-      </w:tr>
-      <w:tr>
-        <w:tc>
-          <w:tcPr>
-            <w:tcW w:w="1829" w:type="dxa"/>
-          </w:tcPr>
-          <w:p>
-            <w:pPr>
-              <w:rPr>
-                <w:b/>
-                <w:bCs/>
-              </w:rPr>
-            </w:pPr>
-            <w:r>
-              <w:rPr>
-                <w:b/>
-                <w:bCs/>
-              </w:rPr>
-              <w:t>Innovatie &amp; AR-component</w:t>
-            </w:r>
-          </w:p>
-        </w:tc>
-        <w:tc>
-          <w:tcPr>
-            <w:tcW w:w="2578" w:type="dxa"/>
-          </w:tcPr>
-          <w:p>
-            <w:r>
-              <w:t>Er is minimaal één innovatief element aanwezig (AR of alternatief).</w:t>
-            </w:r>
-          </w:p>
-        </w:tc>
-        <w:tc>
-          <w:tcPr>
-            <w:tcW w:w="778" w:type="dxa"/>
-          </w:tcPr>
-          <w:p>
-            <w:pPr>
-              <w:jc w:val="center"/>
+            <w:r>
               <w:rPr>
                 <w:rFonts w:ascii="Segoe UI Symbol" w:hAnsi="Segoe UI Symbol" w:cs="Segoe UI Symbol"/>
                 <w:b/>
@@ -14675,7 +14552,8 @@
                 <w:sz w:val="27"/>
                 <w:szCs w:val="27"/>
               </w:rPr>
-            </w:pPr>
+              <w:t>✓</w:t>
+            </w:r>
           </w:p>
         </w:tc>
         <w:tc>
@@ -14688,6 +14566,12 @@
                 <w:color w:val="000000"/>
               </w:rPr>
             </w:pPr>
+            <w:r>
+              <w:t>App schaalt niet op desktop</w:t>
+            </w:r>
+            <w:r>
+              <w:t>.</w:t>
+            </w:r>
           </w:p>
         </w:tc>
         <w:tc>
@@ -14717,7 +14601,7 @@
           </w:tcPr>
           <w:p>
             <w:r>
-              <w:t>De AR-ervaring versterkt de gebruikersbeleving.</w:t>
+              <w:t>Interacties of animaties zijn technisch correct geïmplementeerd.</w:t>
             </w:r>
           </w:p>
         </w:tc>
@@ -14737,65 +14621,7 @@
                 <w:szCs w:val="27"/>
               </w:rPr>
             </w:pPr>
-          </w:p>
-        </w:tc>
-        <w:tc>
-          <w:tcPr>
-            <w:tcW w:w="2837" w:type="dxa"/>
-          </w:tcPr>
-          <w:p>
-            <w:pPr>
-              <w:rPr>
-                <w:color w:val="000000"/>
-              </w:rPr>
-            </w:pPr>
-          </w:p>
-        </w:tc>
-        <w:tc>
-          <w:tcPr>
-            <w:tcW w:w="1325" w:type="dxa"/>
-          </w:tcPr>
-          <w:p/>
-        </w:tc>
-      </w:tr>
-      <w:tr>
-        <w:tc>
-          <w:tcPr>
-            <w:tcW w:w="1829" w:type="dxa"/>
-          </w:tcPr>
-          <w:p>
-            <w:pPr>
-              <w:rPr>
-                <w:b/>
-                <w:bCs/>
-              </w:rPr>
-            </w:pPr>
-            <w:r>
-              <w:rPr>
-                <w:b/>
-                <w:bCs/>
-              </w:rPr>
-              <w:t>Presentatievorm</w:t>
-            </w:r>
-          </w:p>
-        </w:tc>
-        <w:tc>
-          <w:tcPr>
-            <w:tcW w:w="2578" w:type="dxa"/>
-          </w:tcPr>
-          <w:p>
-            <w:r>
-              <w:t>De presentatie is creatief en sluit aan bij het gekozen concept.</w:t>
-            </w:r>
-          </w:p>
-        </w:tc>
-        <w:tc>
-          <w:tcPr>
-            <w:tcW w:w="778" w:type="dxa"/>
-          </w:tcPr>
-          <w:p>
-            <w:pPr>
-              <w:jc w:val="center"/>
+            <w:r>
               <w:rPr>
                 <w:rFonts w:ascii="Segoe UI Symbol" w:hAnsi="Segoe UI Symbol" w:cs="Segoe UI Symbol"/>
                 <w:b/>
@@ -14804,7 +14630,8 @@
                 <w:sz w:val="27"/>
                 <w:szCs w:val="27"/>
               </w:rPr>
-            </w:pPr>
+              <w:t>✓</w:t>
+            </w:r>
           </w:p>
         </w:tc>
         <w:tc>
@@ -14817,6 +14644,12 @@
                 <w:color w:val="000000"/>
               </w:rPr>
             </w:pPr>
+            <w:r>
+              <w:t>Leuke interacties</w:t>
+            </w:r>
+            <w:r>
+              <w:t>.</w:t>
+            </w:r>
           </w:p>
         </w:tc>
         <w:tc>
@@ -14838,6 +14671,13 @@
                 <w:bCs/>
               </w:rPr>
             </w:pPr>
+            <w:r>
+              <w:rPr>
+                <w:b/>
+                <w:bCs/>
+              </w:rPr>
+              <w:t>Innovatie &amp; AR-component</w:t>
+            </w:r>
           </w:p>
         </w:tc>
         <w:tc>
@@ -14846,15 +14686,7 @@
           </w:tcPr>
           <w:p>
             <w:r>
-              <w:t xml:space="preserve">De vorm (video, </w:t>
-            </w:r>
-            <w:proofErr w:type="spellStart"/>
-            <w:r>
-              <w:t>walkthrough</w:t>
-            </w:r>
-            <w:proofErr w:type="spellEnd"/>
-            <w:r>
-              <w:t>, pitch) versterkt het verhaal.</w:t>
+              <w:t>Er is minimaal één innovatief element aanwezig (AR of alternatief).</w:t>
             </w:r>
           </w:p>
         </w:tc>
@@ -14874,58 +14706,7 @@
                 <w:szCs w:val="27"/>
               </w:rPr>
             </w:pPr>
-          </w:p>
-        </w:tc>
-        <w:tc>
-          <w:tcPr>
-            <w:tcW w:w="2837" w:type="dxa"/>
-          </w:tcPr>
-          <w:p>
-            <w:pPr>
-              <w:rPr>
-                <w:color w:val="000000"/>
-              </w:rPr>
-            </w:pPr>
-          </w:p>
-        </w:tc>
-        <w:tc>
-          <w:tcPr>
-            <w:tcW w:w="1325" w:type="dxa"/>
-          </w:tcPr>
-          <w:p/>
-        </w:tc>
-      </w:tr>
-      <w:tr>
-        <w:tc>
-          <w:tcPr>
-            <w:tcW w:w="1829" w:type="dxa"/>
-          </w:tcPr>
-          <w:p>
-            <w:pPr>
-              <w:rPr>
-                <w:b/>
-                <w:bCs/>
-              </w:rPr>
-            </w:pPr>
-          </w:p>
-        </w:tc>
-        <w:tc>
-          <w:tcPr>
-            <w:tcW w:w="2578" w:type="dxa"/>
-          </w:tcPr>
-          <w:p>
-            <w:r>
-              <w:t>Er is aandacht voor theatrale of visuele impact.</w:t>
-            </w:r>
-          </w:p>
-        </w:tc>
-        <w:tc>
-          <w:tcPr>
-            <w:tcW w:w="778" w:type="dxa"/>
-          </w:tcPr>
-          <w:p>
-            <w:pPr>
-              <w:jc w:val="center"/>
+            <w:r>
               <w:rPr>
                 <w:rFonts w:ascii="Segoe UI Symbol" w:hAnsi="Segoe UI Symbol" w:cs="Segoe UI Symbol"/>
                 <w:b/>
@@ -14934,7 +14715,8 @@
                 <w:sz w:val="27"/>
                 <w:szCs w:val="27"/>
               </w:rPr>
-            </w:pPr>
+              <w:t>✓</w:t>
+            </w:r>
           </w:p>
         </w:tc>
         <w:tc>
@@ -14968,13 +14750,6 @@
                 <w:bCs/>
               </w:rPr>
             </w:pPr>
-            <w:r>
-              <w:rPr>
-                <w:b/>
-                <w:bCs/>
-              </w:rPr>
-              <w:t>Reflectie &amp; onderbouwing</w:t>
-            </w:r>
           </w:p>
         </w:tc>
         <w:tc>
@@ -14983,7 +14758,7 @@
           </w:tcPr>
           <w:p>
             <w:r>
-              <w:t>Keuzes zijn inhoudelijk onderbouwd (visueel én functioneel).</w:t>
+              <w:t>De AR-ervaring versterkt de gebruikersbeleving.</w:t>
             </w:r>
           </w:p>
         </w:tc>
@@ -15003,58 +14778,7 @@
                 <w:szCs w:val="27"/>
               </w:rPr>
             </w:pPr>
-          </w:p>
-        </w:tc>
-        <w:tc>
-          <w:tcPr>
-            <w:tcW w:w="2837" w:type="dxa"/>
-          </w:tcPr>
-          <w:p>
-            <w:pPr>
-              <w:rPr>
-                <w:color w:val="000000"/>
-              </w:rPr>
-            </w:pPr>
-          </w:p>
-        </w:tc>
-        <w:tc>
-          <w:tcPr>
-            <w:tcW w:w="1325" w:type="dxa"/>
-          </w:tcPr>
-          <w:p/>
-        </w:tc>
-      </w:tr>
-      <w:tr>
-        <w:tc>
-          <w:tcPr>
-            <w:tcW w:w="1829" w:type="dxa"/>
-          </w:tcPr>
-          <w:p>
-            <w:pPr>
-              <w:rPr>
-                <w:b/>
-                <w:bCs/>
-              </w:rPr>
-            </w:pPr>
-          </w:p>
-        </w:tc>
-        <w:tc>
-          <w:tcPr>
-            <w:tcW w:w="2578" w:type="dxa"/>
-          </w:tcPr>
-          <w:p>
-            <w:r>
-              <w:t>De student reflecteert op het proces, feedback en leerpunten.</w:t>
-            </w:r>
-          </w:p>
-        </w:tc>
-        <w:tc>
-          <w:tcPr>
-            <w:tcW w:w="778" w:type="dxa"/>
-          </w:tcPr>
-          <w:p>
-            <w:pPr>
-              <w:jc w:val="center"/>
+            <w:r>
               <w:rPr>
                 <w:rFonts w:ascii="Segoe UI Symbol" w:hAnsi="Segoe UI Symbol" w:cs="Segoe UI Symbol"/>
                 <w:b/>
@@ -15063,7 +14787,8 @@
                 <w:sz w:val="27"/>
                 <w:szCs w:val="27"/>
               </w:rPr>
-            </w:pPr>
+              <w:t>✓</w:t>
+            </w:r>
           </w:p>
         </w:tc>
         <w:tc>
@@ -15097,6 +14822,13 @@
                 <w:bCs/>
               </w:rPr>
             </w:pPr>
+            <w:r>
+              <w:rPr>
+                <w:b/>
+                <w:bCs/>
+              </w:rPr>
+              <w:t>Presentatievorm</w:t>
+            </w:r>
           </w:p>
         </w:tc>
         <w:tc>
@@ -15105,7 +14837,7 @@
           </w:tcPr>
           <w:p>
             <w:r>
-              <w:t>Verwerkte feedback is aantoonbaar zichtbaar in het eindproduct.</w:t>
+              <w:t>De presentatie is creatief en sluit aan bij het gekozen concept.</w:t>
             </w:r>
           </w:p>
         </w:tc>
@@ -15125,6 +14857,404 @@
                 <w:szCs w:val="27"/>
               </w:rPr>
             </w:pPr>
+            <w:r>
+              <w:rPr>
+                <w:rFonts w:ascii="Segoe UI Symbol" w:hAnsi="Segoe UI Symbol" w:cs="Segoe UI Symbol"/>
+                <w:b/>
+                <w:bCs/>
+                <w:color w:val="000000"/>
+                <w:sz w:val="27"/>
+                <w:szCs w:val="27"/>
+              </w:rPr>
+              <w:t>✓</w:t>
+            </w:r>
+          </w:p>
+        </w:tc>
+        <w:tc>
+          <w:tcPr>
+            <w:tcW w:w="2837" w:type="dxa"/>
+          </w:tcPr>
+          <w:p>
+            <w:pPr>
+              <w:rPr>
+                <w:color w:val="000000"/>
+              </w:rPr>
+            </w:pPr>
+          </w:p>
+        </w:tc>
+        <w:tc>
+          <w:tcPr>
+            <w:tcW w:w="1325" w:type="dxa"/>
+          </w:tcPr>
+          <w:p/>
+        </w:tc>
+      </w:tr>
+      <w:tr>
+        <w:tc>
+          <w:tcPr>
+            <w:tcW w:w="1829" w:type="dxa"/>
+          </w:tcPr>
+          <w:p>
+            <w:pPr>
+              <w:rPr>
+                <w:b/>
+                <w:bCs/>
+              </w:rPr>
+            </w:pPr>
+          </w:p>
+        </w:tc>
+        <w:tc>
+          <w:tcPr>
+            <w:tcW w:w="2578" w:type="dxa"/>
+          </w:tcPr>
+          <w:p>
+            <w:r>
+              <w:t xml:space="preserve">De vorm (video, </w:t>
+            </w:r>
+            <w:proofErr w:type="spellStart"/>
+            <w:r>
+              <w:t>walkthrough</w:t>
+            </w:r>
+            <w:proofErr w:type="spellEnd"/>
+            <w:r>
+              <w:t>, pitch) versterkt het verhaal.</w:t>
+            </w:r>
+          </w:p>
+        </w:tc>
+        <w:tc>
+          <w:tcPr>
+            <w:tcW w:w="778" w:type="dxa"/>
+          </w:tcPr>
+          <w:p>
+            <w:pPr>
+              <w:jc w:val="center"/>
+              <w:rPr>
+                <w:rFonts w:ascii="Segoe UI Symbol" w:hAnsi="Segoe UI Symbol" w:cs="Segoe UI Symbol"/>
+                <w:b/>
+                <w:bCs/>
+                <w:color w:val="000000"/>
+                <w:sz w:val="27"/>
+                <w:szCs w:val="27"/>
+              </w:rPr>
+            </w:pPr>
+            <w:r>
+              <w:rPr>
+                <w:rFonts w:ascii="Segoe UI Symbol" w:hAnsi="Segoe UI Symbol" w:cs="Segoe UI Symbol"/>
+                <w:b/>
+                <w:bCs/>
+                <w:color w:val="000000"/>
+                <w:sz w:val="27"/>
+                <w:szCs w:val="27"/>
+              </w:rPr>
+              <w:t>✓</w:t>
+            </w:r>
+          </w:p>
+        </w:tc>
+        <w:tc>
+          <w:tcPr>
+            <w:tcW w:w="2837" w:type="dxa"/>
+          </w:tcPr>
+          <w:p>
+            <w:pPr>
+              <w:rPr>
+                <w:color w:val="000000"/>
+              </w:rPr>
+            </w:pPr>
+            <w:r>
+              <w:t>Voeg nog wat technieken toe</w:t>
+            </w:r>
+            <w:r>
+              <w:t>.</w:t>
+            </w:r>
+          </w:p>
+        </w:tc>
+        <w:tc>
+          <w:tcPr>
+            <w:tcW w:w="1325" w:type="dxa"/>
+          </w:tcPr>
+          <w:p/>
+        </w:tc>
+      </w:tr>
+      <w:tr>
+        <w:tc>
+          <w:tcPr>
+            <w:tcW w:w="1829" w:type="dxa"/>
+          </w:tcPr>
+          <w:p>
+            <w:pPr>
+              <w:rPr>
+                <w:b/>
+                <w:bCs/>
+              </w:rPr>
+            </w:pPr>
+          </w:p>
+        </w:tc>
+        <w:tc>
+          <w:tcPr>
+            <w:tcW w:w="2578" w:type="dxa"/>
+          </w:tcPr>
+          <w:p>
+            <w:r>
+              <w:t>Er is aandacht voor theatrale of visuele impact.</w:t>
+            </w:r>
+          </w:p>
+        </w:tc>
+        <w:tc>
+          <w:tcPr>
+            <w:tcW w:w="778" w:type="dxa"/>
+          </w:tcPr>
+          <w:p>
+            <w:pPr>
+              <w:jc w:val="center"/>
+              <w:rPr>
+                <w:rFonts w:ascii="Segoe UI Symbol" w:hAnsi="Segoe UI Symbol" w:cs="Segoe UI Symbol"/>
+                <w:b/>
+                <w:bCs/>
+                <w:color w:val="000000"/>
+                <w:sz w:val="27"/>
+                <w:szCs w:val="27"/>
+              </w:rPr>
+            </w:pPr>
+            <w:r>
+              <w:rPr>
+                <w:rFonts w:ascii="Segoe UI Symbol" w:hAnsi="Segoe UI Symbol" w:cs="Segoe UI Symbol"/>
+                <w:b/>
+                <w:bCs/>
+                <w:color w:val="000000"/>
+                <w:sz w:val="27"/>
+                <w:szCs w:val="27"/>
+              </w:rPr>
+              <w:t>✓</w:t>
+            </w:r>
+          </w:p>
+        </w:tc>
+        <w:tc>
+          <w:tcPr>
+            <w:tcW w:w="2837" w:type="dxa"/>
+          </w:tcPr>
+          <w:p>
+            <w:pPr>
+              <w:rPr>
+                <w:color w:val="000000"/>
+              </w:rPr>
+            </w:pPr>
+            <w:r>
+              <w:t>PowerPoint in Disney-stijl</w:t>
+            </w:r>
+            <w:r>
+              <w:t>.</w:t>
+            </w:r>
+          </w:p>
+        </w:tc>
+        <w:tc>
+          <w:tcPr>
+            <w:tcW w:w="1325" w:type="dxa"/>
+          </w:tcPr>
+          <w:p/>
+        </w:tc>
+      </w:tr>
+      <w:tr>
+        <w:tc>
+          <w:tcPr>
+            <w:tcW w:w="1829" w:type="dxa"/>
+          </w:tcPr>
+          <w:p>
+            <w:pPr>
+              <w:rPr>
+                <w:b/>
+                <w:bCs/>
+              </w:rPr>
+            </w:pPr>
+            <w:r>
+              <w:rPr>
+                <w:b/>
+                <w:bCs/>
+              </w:rPr>
+              <w:t>Reflectie &amp; onderbouwing</w:t>
+            </w:r>
+          </w:p>
+        </w:tc>
+        <w:tc>
+          <w:tcPr>
+            <w:tcW w:w="2578" w:type="dxa"/>
+          </w:tcPr>
+          <w:p>
+            <w:r>
+              <w:t>Keuzes zijn inhoudelijk onderbouwd (visueel én functioneel).</w:t>
+            </w:r>
+          </w:p>
+        </w:tc>
+        <w:tc>
+          <w:tcPr>
+            <w:tcW w:w="778" w:type="dxa"/>
+          </w:tcPr>
+          <w:p>
+            <w:pPr>
+              <w:jc w:val="center"/>
+              <w:rPr>
+                <w:rFonts w:ascii="Segoe UI Symbol" w:hAnsi="Segoe UI Symbol" w:cs="Segoe UI Symbol"/>
+                <w:b/>
+                <w:bCs/>
+                <w:color w:val="000000"/>
+                <w:sz w:val="27"/>
+                <w:szCs w:val="27"/>
+              </w:rPr>
+            </w:pPr>
+            <w:r>
+              <w:rPr>
+                <w:rFonts w:ascii="Segoe UI Symbol" w:hAnsi="Segoe UI Symbol" w:cs="Segoe UI Symbol"/>
+                <w:b/>
+                <w:bCs/>
+                <w:color w:val="000000"/>
+                <w:sz w:val="27"/>
+                <w:szCs w:val="27"/>
+              </w:rPr>
+              <w:t>✓</w:t>
+            </w:r>
+          </w:p>
+        </w:tc>
+        <w:tc>
+          <w:tcPr>
+            <w:tcW w:w="2837" w:type="dxa"/>
+          </w:tcPr>
+          <w:p>
+            <w:pPr>
+              <w:rPr>
+                <w:color w:val="000000"/>
+              </w:rPr>
+            </w:pPr>
+          </w:p>
+        </w:tc>
+        <w:tc>
+          <w:tcPr>
+            <w:tcW w:w="1325" w:type="dxa"/>
+          </w:tcPr>
+          <w:p/>
+        </w:tc>
+      </w:tr>
+      <w:tr>
+        <w:tc>
+          <w:tcPr>
+            <w:tcW w:w="1829" w:type="dxa"/>
+          </w:tcPr>
+          <w:p>
+            <w:pPr>
+              <w:rPr>
+                <w:b/>
+                <w:bCs/>
+              </w:rPr>
+            </w:pPr>
+          </w:p>
+        </w:tc>
+        <w:tc>
+          <w:tcPr>
+            <w:tcW w:w="2578" w:type="dxa"/>
+          </w:tcPr>
+          <w:p>
+            <w:r>
+              <w:t>De student reflecteert op het proces, feedback en leerpunten.</w:t>
+            </w:r>
+          </w:p>
+        </w:tc>
+        <w:tc>
+          <w:tcPr>
+            <w:tcW w:w="778" w:type="dxa"/>
+          </w:tcPr>
+          <w:p>
+            <w:pPr>
+              <w:jc w:val="center"/>
+              <w:rPr>
+                <w:rFonts w:ascii="Segoe UI Symbol" w:hAnsi="Segoe UI Symbol" w:cs="Segoe UI Symbol"/>
+                <w:b/>
+                <w:bCs/>
+                <w:color w:val="000000"/>
+                <w:sz w:val="27"/>
+                <w:szCs w:val="27"/>
+              </w:rPr>
+            </w:pPr>
+            <w:r>
+              <w:rPr>
+                <w:rFonts w:ascii="Segoe UI Symbol" w:hAnsi="Segoe UI Symbol" w:cs="Segoe UI Symbol"/>
+                <w:b/>
+                <w:bCs/>
+                <w:color w:val="000000"/>
+                <w:sz w:val="27"/>
+                <w:szCs w:val="27"/>
+              </w:rPr>
+              <w:t>✓</w:t>
+            </w:r>
+          </w:p>
+        </w:tc>
+        <w:tc>
+          <w:tcPr>
+            <w:tcW w:w="2837" w:type="dxa"/>
+          </w:tcPr>
+          <w:p>
+            <w:pPr>
+              <w:rPr>
+                <w:color w:val="000000"/>
+              </w:rPr>
+            </w:pPr>
+          </w:p>
+        </w:tc>
+        <w:tc>
+          <w:tcPr>
+            <w:tcW w:w="1325" w:type="dxa"/>
+          </w:tcPr>
+          <w:p/>
+        </w:tc>
+      </w:tr>
+      <w:tr>
+        <w:tc>
+          <w:tcPr>
+            <w:tcW w:w="1829" w:type="dxa"/>
+          </w:tcPr>
+          <w:p>
+            <w:pPr>
+              <w:rPr>
+                <w:b/>
+                <w:bCs/>
+              </w:rPr>
+            </w:pPr>
+          </w:p>
+        </w:tc>
+        <w:tc>
+          <w:tcPr>
+            <w:tcW w:w="2578" w:type="dxa"/>
+          </w:tcPr>
+          <w:p>
+            <w:r>
+              <w:t>Verwerkte feedback is aantoonbaar zichtbaar in het eindproduct.</w:t>
+            </w:r>
+          </w:p>
+        </w:tc>
+        <w:tc>
+          <w:tcPr>
+            <w:tcW w:w="778" w:type="dxa"/>
+          </w:tcPr>
+          <w:p>
+            <w:pPr>
+              <w:jc w:val="center"/>
+              <w:rPr>
+                <w:rFonts w:ascii="Segoe UI Symbol" w:hAnsi="Segoe UI Symbol" w:cs="Segoe UI Symbol"/>
+                <w:b/>
+                <w:bCs/>
+                <w:color w:val="000000"/>
+                <w:sz w:val="27"/>
+                <w:szCs w:val="27"/>
+              </w:rPr>
+            </w:pPr>
+            <w:r>
+              <w:rPr>
+                <w:rFonts w:ascii="Segoe UI Symbol" w:hAnsi="Segoe UI Symbol" w:cs="Segoe UI Symbol"/>
+                <w:b/>
+                <w:bCs/>
+                <w:color w:val="000000"/>
+                <w:sz w:val="27"/>
+                <w:szCs w:val="27"/>
+              </w:rPr>
+              <w:t>✓</w:t>
+            </w:r>
           </w:p>
         </w:tc>
         <w:tc>
@@ -16271,58 +16401,7 @@
                 <w:szCs w:val="27"/>
               </w:rPr>
             </w:pPr>
-          </w:p>
-        </w:tc>
-        <w:tc>
-          <w:tcPr>
-            <w:tcW w:w="2837" w:type="dxa"/>
-          </w:tcPr>
-          <w:p>
-            <w:pPr>
-              <w:rPr>
-                <w:color w:val="000000"/>
-              </w:rPr>
-            </w:pPr>
-          </w:p>
-        </w:tc>
-        <w:tc>
-          <w:tcPr>
-            <w:tcW w:w="1325" w:type="dxa"/>
-          </w:tcPr>
-          <w:p/>
-        </w:tc>
-      </w:tr>
-      <w:tr>
-        <w:tc>
-          <w:tcPr>
-            <w:tcW w:w="1829" w:type="dxa"/>
-          </w:tcPr>
-          <w:p>
-            <w:pPr>
-              <w:rPr>
-                <w:b/>
-                <w:bCs/>
-              </w:rPr>
-            </w:pPr>
-          </w:p>
-        </w:tc>
-        <w:tc>
-          <w:tcPr>
-            <w:tcW w:w="2578" w:type="dxa"/>
-          </w:tcPr>
-          <w:p>
-            <w:r>
-              <w:t>De pagina’s zijn responsief (werken op desktop en mobiel).</w:t>
-            </w:r>
-          </w:p>
-        </w:tc>
-        <w:tc>
-          <w:tcPr>
-            <w:tcW w:w="778" w:type="dxa"/>
-          </w:tcPr>
-          <w:p>
-            <w:pPr>
-              <w:jc w:val="center"/>
+            <w:r>
               <w:rPr>
                 <w:rFonts w:ascii="Segoe UI Symbol" w:hAnsi="Segoe UI Symbol" w:cs="Segoe UI Symbol"/>
                 <w:b/>
@@ -16331,7 +16410,8 @@
                 <w:sz w:val="27"/>
                 <w:szCs w:val="27"/>
               </w:rPr>
-            </w:pPr>
+              <w:t>✓</w:t>
+            </w:r>
           </w:p>
         </w:tc>
         <w:tc>
@@ -16344,13 +16424,34 @@
                 <w:color w:val="000000"/>
               </w:rPr>
             </w:pPr>
+            <w:r>
+              <w:rPr>
+                <w:color w:val="000000"/>
+              </w:rPr>
+              <w:t>Werkende flow met meerdere pagina’s en duidelijke navigatie</w:t>
+            </w:r>
+            <w:r>
+              <w:rPr>
+                <w:color w:val="000000"/>
+              </w:rPr>
+              <w:t>.</w:t>
+            </w:r>
           </w:p>
         </w:tc>
         <w:tc>
           <w:tcPr>
             <w:tcW w:w="1325" w:type="dxa"/>
           </w:tcPr>
-          <w:p/>
+          <w:p>
+            <w:r>
+              <w:t>26-06-2026</w:t>
+            </w:r>
+          </w:p>
+          <w:p>
+            <w:pPr>
+              <w:jc w:val="center"/>
+            </w:pPr>
+          </w:p>
         </w:tc>
       </w:tr>
       <w:tr>
@@ -16373,7 +16474,7 @@
           </w:tcPr>
           <w:p>
             <w:r>
-              <w:t>Interacties of animaties zijn technisch correct geïmplementeerd.</w:t>
+              <w:t>De pagina’s zijn responsief (werken op desktop en mobiel).</w:t>
             </w:r>
           </w:p>
         </w:tc>
@@ -16393,69 +16494,7 @@
                 <w:szCs w:val="27"/>
               </w:rPr>
             </w:pPr>
-          </w:p>
-        </w:tc>
-        <w:tc>
-          <w:tcPr>
-            <w:tcW w:w="2837" w:type="dxa"/>
-          </w:tcPr>
-          <w:p>
-            <w:pPr>
-              <w:rPr>
-                <w:color w:val="000000"/>
-              </w:rPr>
-            </w:pPr>
-          </w:p>
-        </w:tc>
-        <w:tc>
-          <w:tcPr>
-            <w:tcW w:w="1325" w:type="dxa"/>
-          </w:tcPr>
-          <w:p/>
-        </w:tc>
-      </w:tr>
-      <w:tr>
-        <w:tc>
-          <w:tcPr>
-            <w:tcW w:w="1829" w:type="dxa"/>
-          </w:tcPr>
-          <w:p>
-            <w:pPr>
-              <w:rPr>
-                <w:b/>
-                <w:bCs/>
-              </w:rPr>
-            </w:pPr>
-            <w:r>
-              <w:rPr>
-                <w:b/>
-                <w:bCs/>
-              </w:rPr>
-              <w:t>Innovatie &amp; AR-component</w:t>
-            </w:r>
-          </w:p>
-        </w:tc>
-        <w:tc>
-          <w:tcPr>
-            <w:tcW w:w="2578" w:type="dxa"/>
-          </w:tcPr>
-          <w:p>
-            <w:r>
-              <w:t xml:space="preserve">Er is minimaal één innovatief element </w:t>
-            </w:r>
-            <w:r>
-              <w:lastRenderedPageBreak/>
-              <w:t>aanwezig (AR of alternatief).</w:t>
-            </w:r>
-          </w:p>
-        </w:tc>
-        <w:tc>
-          <w:tcPr>
-            <w:tcW w:w="778" w:type="dxa"/>
-          </w:tcPr>
-          <w:p>
-            <w:pPr>
-              <w:jc w:val="center"/>
+            <w:r>
               <w:rPr>
                 <w:rFonts w:ascii="Segoe UI Symbol" w:hAnsi="Segoe UI Symbol" w:cs="Segoe UI Symbol"/>
                 <w:b/>
@@ -16464,7 +16503,8 @@
                 <w:sz w:val="27"/>
                 <w:szCs w:val="27"/>
               </w:rPr>
-            </w:pPr>
+              <w:t>✓</w:t>
+            </w:r>
           </w:p>
         </w:tc>
         <w:tc>
@@ -16477,13 +16517,59 @@
                 <w:color w:val="000000"/>
               </w:rPr>
             </w:pPr>
+            <w:r>
+              <w:rPr>
+                <w:color w:val="000000"/>
+              </w:rPr>
+              <w:t>Pagina</w:t>
+            </w:r>
+            <w:r>
+              <w:rPr>
+                <w:color w:val="000000"/>
+              </w:rPr>
+              <w:t>’</w:t>
+            </w:r>
+            <w:r>
+              <w:rPr>
+                <w:color w:val="000000"/>
+              </w:rPr>
+              <w:t xml:space="preserve">s </w:t>
+            </w:r>
+            <w:r>
+              <w:rPr>
+                <w:color w:val="000000"/>
+              </w:rPr>
+              <w:t xml:space="preserve">werken op desktop en mobiel, maar </w:t>
+            </w:r>
+            <w:r>
+              <w:rPr>
+                <w:color w:val="000000"/>
+              </w:rPr>
+              <w:t xml:space="preserve">houden </w:t>
+            </w:r>
+            <w:r>
+              <w:rPr>
+                <w:color w:val="000000"/>
+              </w:rPr>
+              <w:t xml:space="preserve">qua ontwerp </w:t>
+            </w:r>
+            <w:r>
+              <w:rPr>
+                <w:color w:val="000000"/>
+              </w:rPr>
+              <w:t>alleen mobiel aan.</w:t>
+            </w:r>
           </w:p>
         </w:tc>
         <w:tc>
           <w:tcPr>
             <w:tcW w:w="1325" w:type="dxa"/>
           </w:tcPr>
-          <w:p/>
+          <w:p>
+            <w:r>
+              <w:t>26-06-2026</w:t>
+            </w:r>
+          </w:p>
         </w:tc>
       </w:tr>
       <w:tr>
@@ -16506,7 +16592,7 @@
           </w:tcPr>
           <w:p>
             <w:r>
-              <w:t>De AR-ervaring versterkt de gebruikersbeleving.</w:t>
+              <w:t>Interacties of animaties zijn technisch correct geïmplementeerd.</w:t>
             </w:r>
           </w:p>
         </w:tc>
@@ -16526,65 +16612,7 @@
                 <w:szCs w:val="27"/>
               </w:rPr>
             </w:pPr>
-          </w:p>
-        </w:tc>
-        <w:tc>
-          <w:tcPr>
-            <w:tcW w:w="2837" w:type="dxa"/>
-          </w:tcPr>
-          <w:p>
-            <w:pPr>
-              <w:rPr>
-                <w:color w:val="000000"/>
-              </w:rPr>
-            </w:pPr>
-          </w:p>
-        </w:tc>
-        <w:tc>
-          <w:tcPr>
-            <w:tcW w:w="1325" w:type="dxa"/>
-          </w:tcPr>
-          <w:p/>
-        </w:tc>
-      </w:tr>
-      <w:tr>
-        <w:tc>
-          <w:tcPr>
-            <w:tcW w:w="1829" w:type="dxa"/>
-          </w:tcPr>
-          <w:p>
-            <w:pPr>
-              <w:rPr>
-                <w:b/>
-                <w:bCs/>
-              </w:rPr>
-            </w:pPr>
-            <w:r>
-              <w:rPr>
-                <w:b/>
-                <w:bCs/>
-              </w:rPr>
-              <w:t>Presentatievorm</w:t>
-            </w:r>
-          </w:p>
-        </w:tc>
-        <w:tc>
-          <w:tcPr>
-            <w:tcW w:w="2578" w:type="dxa"/>
-          </w:tcPr>
-          <w:p>
-            <w:r>
-              <w:t>De presentatie is creatief en sluit aan bij het gekozen concept.</w:t>
-            </w:r>
-          </w:p>
-        </w:tc>
-        <w:tc>
-          <w:tcPr>
-            <w:tcW w:w="778" w:type="dxa"/>
-          </w:tcPr>
-          <w:p>
-            <w:pPr>
-              <w:jc w:val="center"/>
+            <w:r>
               <w:rPr>
                 <w:rFonts w:ascii="Segoe UI Symbol" w:hAnsi="Segoe UI Symbol" w:cs="Segoe UI Symbol"/>
                 <w:b/>
@@ -16593,7 +16621,8 @@
                 <w:sz w:val="27"/>
                 <w:szCs w:val="27"/>
               </w:rPr>
-            </w:pPr>
+              <w:t>✓</w:t>
+            </w:r>
           </w:p>
         </w:tc>
         <w:tc>
@@ -16612,7 +16641,11 @@
           <w:tcPr>
             <w:tcW w:w="1325" w:type="dxa"/>
           </w:tcPr>
-          <w:p/>
+          <w:p>
+            <w:r>
+              <w:t>26-06-2026</w:t>
+            </w:r>
+          </w:p>
         </w:tc>
       </w:tr>
       <w:tr>
@@ -16627,6 +16660,13 @@
                 <w:bCs/>
               </w:rPr>
             </w:pPr>
+            <w:r>
+              <w:rPr>
+                <w:b/>
+                <w:bCs/>
+              </w:rPr>
+              <w:t>Innovatie &amp; AR-component</w:t>
+            </w:r>
           </w:p>
         </w:tc>
         <w:tc>
@@ -16635,15 +16675,11 @@
           </w:tcPr>
           <w:p>
             <w:r>
-              <w:t xml:space="preserve">De vorm (video, </w:t>
-            </w:r>
-            <w:proofErr w:type="spellStart"/>
-            <w:r>
-              <w:t>walkthrough</w:t>
-            </w:r>
-            <w:proofErr w:type="spellEnd"/>
-            <w:r>
-              <w:t>, pitch) versterkt het verhaal.</w:t>
+              <w:t xml:space="preserve">Er is minimaal één innovatief element </w:t>
+            </w:r>
+            <w:r>
+              <w:lastRenderedPageBreak/>
+              <w:t>aanwezig (AR of alternatief).</w:t>
             </w:r>
           </w:p>
         </w:tc>
@@ -16663,58 +16699,7 @@
                 <w:szCs w:val="27"/>
               </w:rPr>
             </w:pPr>
-          </w:p>
-        </w:tc>
-        <w:tc>
-          <w:tcPr>
-            <w:tcW w:w="2837" w:type="dxa"/>
-          </w:tcPr>
-          <w:p>
-            <w:pPr>
-              <w:rPr>
-                <w:color w:val="000000"/>
-              </w:rPr>
-            </w:pPr>
-          </w:p>
-        </w:tc>
-        <w:tc>
-          <w:tcPr>
-            <w:tcW w:w="1325" w:type="dxa"/>
-          </w:tcPr>
-          <w:p/>
-        </w:tc>
-      </w:tr>
-      <w:tr>
-        <w:tc>
-          <w:tcPr>
-            <w:tcW w:w="1829" w:type="dxa"/>
-          </w:tcPr>
-          <w:p>
-            <w:pPr>
-              <w:rPr>
-                <w:b/>
-                <w:bCs/>
-              </w:rPr>
-            </w:pPr>
-          </w:p>
-        </w:tc>
-        <w:tc>
-          <w:tcPr>
-            <w:tcW w:w="2578" w:type="dxa"/>
-          </w:tcPr>
-          <w:p>
-            <w:r>
-              <w:t>Er is aandacht voor theatrale of visuele impact.</w:t>
-            </w:r>
-          </w:p>
-        </w:tc>
-        <w:tc>
-          <w:tcPr>
-            <w:tcW w:w="778" w:type="dxa"/>
-          </w:tcPr>
-          <w:p>
-            <w:pPr>
-              <w:jc w:val="center"/>
+            <w:r>
               <w:rPr>
                 <w:rFonts w:ascii="Segoe UI Symbol" w:hAnsi="Segoe UI Symbol" w:cs="Segoe UI Symbol"/>
                 <w:b/>
@@ -16723,7 +16708,9 @@
                 <w:sz w:val="27"/>
                 <w:szCs w:val="27"/>
               </w:rPr>
-            </w:pPr>
+              <w:lastRenderedPageBreak/>
+              <w:t>✓</w:t>
+            </w:r>
           </w:p>
         </w:tc>
         <w:tc>
@@ -16736,13 +16723,23 @@
                 <w:color w:val="000000"/>
               </w:rPr>
             </w:pPr>
+            <w:r>
+              <w:rPr>
+                <w:color w:val="000000"/>
+              </w:rPr>
+              <w:t>Er is 1 AR implementatie toegevoegd.</w:t>
+            </w:r>
           </w:p>
         </w:tc>
         <w:tc>
           <w:tcPr>
             <w:tcW w:w="1325" w:type="dxa"/>
           </w:tcPr>
-          <w:p/>
+          <w:p>
+            <w:r>
+              <w:t>26-06-2026</w:t>
+            </w:r>
+          </w:p>
         </w:tc>
       </w:tr>
       <w:tr>
@@ -16757,13 +16754,6 @@
                 <w:bCs/>
               </w:rPr>
             </w:pPr>
-            <w:r>
-              <w:rPr>
-                <w:b/>
-                <w:bCs/>
-              </w:rPr>
-              <w:t>Reflectie &amp; onderbouwing</w:t>
-            </w:r>
           </w:p>
         </w:tc>
         <w:tc>
@@ -16772,7 +16762,7 @@
           </w:tcPr>
           <w:p>
             <w:r>
-              <w:t>Keuzes zijn inhoudelijk onderbouwd (visueel én functioneel).</w:t>
+              <w:t>De AR-ervaring versterkt de gebruikersbeleving.</w:t>
             </w:r>
           </w:p>
         </w:tc>
@@ -16792,58 +16782,7 @@
                 <w:szCs w:val="27"/>
               </w:rPr>
             </w:pPr>
-          </w:p>
-        </w:tc>
-        <w:tc>
-          <w:tcPr>
-            <w:tcW w:w="2837" w:type="dxa"/>
-          </w:tcPr>
-          <w:p>
-            <w:pPr>
-              <w:rPr>
-                <w:color w:val="000000"/>
-              </w:rPr>
-            </w:pPr>
-          </w:p>
-        </w:tc>
-        <w:tc>
-          <w:tcPr>
-            <w:tcW w:w="1325" w:type="dxa"/>
-          </w:tcPr>
-          <w:p/>
-        </w:tc>
-      </w:tr>
-      <w:tr>
-        <w:tc>
-          <w:tcPr>
-            <w:tcW w:w="1829" w:type="dxa"/>
-          </w:tcPr>
-          <w:p>
-            <w:pPr>
-              <w:rPr>
-                <w:b/>
-                <w:bCs/>
-              </w:rPr>
-            </w:pPr>
-          </w:p>
-        </w:tc>
-        <w:tc>
-          <w:tcPr>
-            <w:tcW w:w="2578" w:type="dxa"/>
-          </w:tcPr>
-          <w:p>
-            <w:r>
-              <w:t>De student reflecteert op het proces, feedback en leerpunten.</w:t>
-            </w:r>
-          </w:p>
-        </w:tc>
-        <w:tc>
-          <w:tcPr>
-            <w:tcW w:w="778" w:type="dxa"/>
-          </w:tcPr>
-          <w:p>
-            <w:pPr>
-              <w:jc w:val="center"/>
+            <w:r>
               <w:rPr>
                 <w:rFonts w:ascii="Segoe UI Symbol" w:hAnsi="Segoe UI Symbol" w:cs="Segoe UI Symbol"/>
                 <w:b/>
@@ -16852,7 +16791,8 @@
                 <w:sz w:val="27"/>
                 <w:szCs w:val="27"/>
               </w:rPr>
-            </w:pPr>
+              <w:t>✓</w:t>
+            </w:r>
           </w:p>
         </w:tc>
         <w:tc>
@@ -16861,17 +16801,30 @@
           </w:tcPr>
           <w:p>
             <w:pPr>
+              <w:tabs>
+                <w:tab w:val="left" w:pos="892"/>
+              </w:tabs>
               <w:rPr>
                 <w:color w:val="000000"/>
               </w:rPr>
             </w:pPr>
+            <w:r>
+              <w:rPr>
+                <w:color w:val="000000"/>
+              </w:rPr>
+              <w:t>De AR ervaring is een leuke toevoeging.</w:t>
+            </w:r>
           </w:p>
         </w:tc>
         <w:tc>
           <w:tcPr>
             <w:tcW w:w="1325" w:type="dxa"/>
           </w:tcPr>
-          <w:p/>
+          <w:p>
+            <w:r>
+              <w:t>26-06-2026</w:t>
+            </w:r>
+          </w:p>
         </w:tc>
       </w:tr>
       <w:tr>
@@ -16886,6 +16839,13 @@
                 <w:bCs/>
               </w:rPr>
             </w:pPr>
+            <w:r>
+              <w:rPr>
+                <w:b/>
+                <w:bCs/>
+              </w:rPr>
+              <w:t>Presentatievorm</w:t>
+            </w:r>
           </w:p>
         </w:tc>
         <w:tc>
@@ -16894,7 +16854,7 @@
           </w:tcPr>
           <w:p>
             <w:r>
-              <w:t>Verwerkte feedback is aantoonbaar zichtbaar in het eindproduct.</w:t>
+              <w:t>De presentatie is creatief en sluit aan bij het gekozen concept.</w:t>
             </w:r>
           </w:p>
         </w:tc>
@@ -16914,6 +16874,17 @@
                 <w:szCs w:val="27"/>
               </w:rPr>
             </w:pPr>
+            <w:r>
+              <w:rPr>
+                <w:rFonts w:ascii="Segoe UI Symbol" w:hAnsi="Segoe UI Symbol" w:cs="Segoe UI Symbol"/>
+                <w:b/>
+                <w:bCs/>
+                <w:color w:val="000000"/>
+                <w:sz w:val="27"/>
+                <w:szCs w:val="27"/>
+              </w:rPr>
+              <w:t>✓</w:t>
+            </w:r>
           </w:p>
         </w:tc>
         <w:tc>
@@ -16926,13 +16897,460 @@
                 <w:color w:val="000000"/>
               </w:rPr>
             </w:pPr>
+            <w:r>
+              <w:rPr>
+                <w:color w:val="000000"/>
+              </w:rPr>
+              <w:t>Zelfde thema is doorgevoerd in de slides</w:t>
+            </w:r>
+            <w:r>
+              <w:rPr>
+                <w:color w:val="000000"/>
+              </w:rPr>
+              <w:t>.</w:t>
+            </w:r>
           </w:p>
         </w:tc>
         <w:tc>
           <w:tcPr>
             <w:tcW w:w="1325" w:type="dxa"/>
           </w:tcPr>
-          <w:p/>
+          <w:p>
+            <w:r>
+              <w:t>26-06-2026</w:t>
+            </w:r>
+          </w:p>
+        </w:tc>
+      </w:tr>
+      <w:tr>
+        <w:tc>
+          <w:tcPr>
+            <w:tcW w:w="1829" w:type="dxa"/>
+          </w:tcPr>
+          <w:p>
+            <w:pPr>
+              <w:rPr>
+                <w:b/>
+                <w:bCs/>
+              </w:rPr>
+            </w:pPr>
+          </w:p>
+        </w:tc>
+        <w:tc>
+          <w:tcPr>
+            <w:tcW w:w="2578" w:type="dxa"/>
+          </w:tcPr>
+          <w:p>
+            <w:r>
+              <w:t xml:space="preserve">De vorm (video, </w:t>
+            </w:r>
+            <w:proofErr w:type="spellStart"/>
+            <w:r>
+              <w:t>walkthrough</w:t>
+            </w:r>
+            <w:proofErr w:type="spellEnd"/>
+            <w:r>
+              <w:t>, pitch) versterkt het verhaal.</w:t>
+            </w:r>
+          </w:p>
+        </w:tc>
+        <w:tc>
+          <w:tcPr>
+            <w:tcW w:w="778" w:type="dxa"/>
+          </w:tcPr>
+          <w:p>
+            <w:pPr>
+              <w:jc w:val="center"/>
+              <w:rPr>
+                <w:rFonts w:ascii="Segoe UI Symbol" w:hAnsi="Segoe UI Symbol" w:cs="Segoe UI Symbol"/>
+                <w:b/>
+                <w:bCs/>
+                <w:color w:val="000000"/>
+                <w:sz w:val="27"/>
+                <w:szCs w:val="27"/>
+              </w:rPr>
+            </w:pPr>
+            <w:r>
+              <w:rPr>
+                <w:rFonts w:ascii="Segoe UI Symbol" w:hAnsi="Segoe UI Symbol" w:cs="Segoe UI Symbol"/>
+                <w:b/>
+                <w:bCs/>
+                <w:color w:val="000000"/>
+                <w:sz w:val="27"/>
+                <w:szCs w:val="27"/>
+              </w:rPr>
+              <w:t>✓</w:t>
+            </w:r>
+          </w:p>
+        </w:tc>
+        <w:tc>
+          <w:tcPr>
+            <w:tcW w:w="2837" w:type="dxa"/>
+          </w:tcPr>
+          <w:p>
+            <w:pPr>
+              <w:rPr>
+                <w:color w:val="000000"/>
+              </w:rPr>
+            </w:pPr>
+            <w:r>
+              <w:rPr>
+                <w:color w:val="000000"/>
+              </w:rPr>
+              <w:t>Er is een live demo aanwezig</w:t>
+            </w:r>
+            <w:r>
+              <w:rPr>
+                <w:color w:val="000000"/>
+              </w:rPr>
+              <w:t>.</w:t>
+            </w:r>
+          </w:p>
+        </w:tc>
+        <w:tc>
+          <w:tcPr>
+            <w:tcW w:w="1325" w:type="dxa"/>
+          </w:tcPr>
+          <w:p>
+            <w:r>
+              <w:t>26-06-2026</w:t>
+            </w:r>
+          </w:p>
+        </w:tc>
+      </w:tr>
+      <w:tr>
+        <w:tc>
+          <w:tcPr>
+            <w:tcW w:w="1829" w:type="dxa"/>
+          </w:tcPr>
+          <w:p>
+            <w:pPr>
+              <w:rPr>
+                <w:b/>
+                <w:bCs/>
+              </w:rPr>
+            </w:pPr>
+          </w:p>
+        </w:tc>
+        <w:tc>
+          <w:tcPr>
+            <w:tcW w:w="2578" w:type="dxa"/>
+          </w:tcPr>
+          <w:p>
+            <w:r>
+              <w:t>Er is aandacht voor theatrale of visuele impact.</w:t>
+            </w:r>
+          </w:p>
+        </w:tc>
+        <w:tc>
+          <w:tcPr>
+            <w:tcW w:w="778" w:type="dxa"/>
+          </w:tcPr>
+          <w:p>
+            <w:pPr>
+              <w:jc w:val="center"/>
+              <w:rPr>
+                <w:rFonts w:ascii="Segoe UI Symbol" w:hAnsi="Segoe UI Symbol" w:cs="Segoe UI Symbol"/>
+                <w:b/>
+                <w:bCs/>
+                <w:color w:val="000000"/>
+                <w:sz w:val="27"/>
+                <w:szCs w:val="27"/>
+              </w:rPr>
+            </w:pPr>
+            <w:r>
+              <w:rPr>
+                <w:rFonts w:ascii="Segoe UI Symbol" w:hAnsi="Segoe UI Symbol" w:cs="Segoe UI Symbol"/>
+                <w:b/>
+                <w:bCs/>
+                <w:color w:val="000000"/>
+                <w:sz w:val="27"/>
+                <w:szCs w:val="27"/>
+              </w:rPr>
+              <w:t>✓</w:t>
+            </w:r>
+          </w:p>
+        </w:tc>
+        <w:tc>
+          <w:tcPr>
+            <w:tcW w:w="2837" w:type="dxa"/>
+          </w:tcPr>
+          <w:p>
+            <w:pPr>
+              <w:rPr>
+                <w:color w:val="000000"/>
+              </w:rPr>
+            </w:pPr>
+            <w:r>
+              <w:rPr>
+                <w:color w:val="000000"/>
+              </w:rPr>
+              <w:t>Zelfde thema is doorgevoerd in de slides.</w:t>
+            </w:r>
+          </w:p>
+        </w:tc>
+        <w:tc>
+          <w:tcPr>
+            <w:tcW w:w="1325" w:type="dxa"/>
+          </w:tcPr>
+          <w:p>
+            <w:r>
+              <w:t>26-06-2026</w:t>
+            </w:r>
+          </w:p>
+        </w:tc>
+      </w:tr>
+      <w:tr>
+        <w:tc>
+          <w:tcPr>
+            <w:tcW w:w="1829" w:type="dxa"/>
+          </w:tcPr>
+          <w:p>
+            <w:pPr>
+              <w:rPr>
+                <w:b/>
+                <w:bCs/>
+              </w:rPr>
+            </w:pPr>
+            <w:r>
+              <w:rPr>
+                <w:b/>
+                <w:bCs/>
+              </w:rPr>
+              <w:t>Reflectie &amp; onderbouwing</w:t>
+            </w:r>
+          </w:p>
+        </w:tc>
+        <w:tc>
+          <w:tcPr>
+            <w:tcW w:w="2578" w:type="dxa"/>
+          </w:tcPr>
+          <w:p>
+            <w:r>
+              <w:t>Keuzes zijn inhoudelijk onderbouwd (visueel én functioneel).</w:t>
+            </w:r>
+          </w:p>
+        </w:tc>
+        <w:tc>
+          <w:tcPr>
+            <w:tcW w:w="778" w:type="dxa"/>
+          </w:tcPr>
+          <w:p>
+            <w:pPr>
+              <w:jc w:val="center"/>
+              <w:rPr>
+                <w:rFonts w:ascii="Segoe UI Symbol" w:hAnsi="Segoe UI Symbol" w:cs="Segoe UI Symbol"/>
+                <w:b/>
+                <w:bCs/>
+                <w:color w:val="000000"/>
+                <w:sz w:val="27"/>
+                <w:szCs w:val="27"/>
+              </w:rPr>
+            </w:pPr>
+            <w:r>
+              <w:rPr>
+                <w:rFonts w:ascii="Segoe UI Symbol" w:hAnsi="Segoe UI Symbol" w:cs="Segoe UI Symbol"/>
+                <w:b/>
+                <w:bCs/>
+                <w:color w:val="000000"/>
+                <w:sz w:val="27"/>
+                <w:szCs w:val="27"/>
+              </w:rPr>
+              <w:t>✓</w:t>
+            </w:r>
+          </w:p>
+        </w:tc>
+        <w:tc>
+          <w:tcPr>
+            <w:tcW w:w="2837" w:type="dxa"/>
+          </w:tcPr>
+          <w:p>
+            <w:pPr>
+              <w:rPr>
+                <w:color w:val="000000"/>
+              </w:rPr>
+            </w:pPr>
+            <w:r>
+              <w:rPr>
+                <w:color w:val="000000"/>
+              </w:rPr>
+              <w:t>Feedback is onderbouwd wat wel en wat niet gebruikt wordt.</w:t>
+            </w:r>
+          </w:p>
+        </w:tc>
+        <w:tc>
+          <w:tcPr>
+            <w:tcW w:w="1325" w:type="dxa"/>
+          </w:tcPr>
+          <w:p>
+            <w:r>
+              <w:t>26-06-2026</w:t>
+            </w:r>
+          </w:p>
+        </w:tc>
+      </w:tr>
+      <w:tr>
+        <w:tc>
+          <w:tcPr>
+            <w:tcW w:w="1829" w:type="dxa"/>
+          </w:tcPr>
+          <w:p>
+            <w:pPr>
+              <w:rPr>
+                <w:b/>
+                <w:bCs/>
+              </w:rPr>
+            </w:pPr>
+          </w:p>
+        </w:tc>
+        <w:tc>
+          <w:tcPr>
+            <w:tcW w:w="2578" w:type="dxa"/>
+          </w:tcPr>
+          <w:p>
+            <w:r>
+              <w:t>De student reflecteert op het proces, feedback en leerpunten.</w:t>
+            </w:r>
+          </w:p>
+        </w:tc>
+        <w:tc>
+          <w:tcPr>
+            <w:tcW w:w="778" w:type="dxa"/>
+          </w:tcPr>
+          <w:p>
+            <w:pPr>
+              <w:jc w:val="center"/>
+              <w:rPr>
+                <w:rFonts w:ascii="Segoe UI Symbol" w:hAnsi="Segoe UI Symbol" w:cs="Segoe UI Symbol"/>
+                <w:b/>
+                <w:bCs/>
+                <w:color w:val="000000"/>
+                <w:sz w:val="27"/>
+                <w:szCs w:val="27"/>
+              </w:rPr>
+            </w:pPr>
+            <w:r>
+              <w:rPr>
+                <w:rFonts w:ascii="Segoe UI Symbol" w:hAnsi="Segoe UI Symbol" w:cs="Segoe UI Symbol"/>
+                <w:b/>
+                <w:bCs/>
+                <w:color w:val="000000"/>
+                <w:sz w:val="27"/>
+                <w:szCs w:val="27"/>
+              </w:rPr>
+              <w:t>✓</w:t>
+            </w:r>
+          </w:p>
+        </w:tc>
+        <w:tc>
+          <w:tcPr>
+            <w:tcW w:w="2837" w:type="dxa"/>
+          </w:tcPr>
+          <w:p>
+            <w:pPr>
+              <w:rPr>
+                <w:color w:val="000000"/>
+              </w:rPr>
+            </w:pPr>
+          </w:p>
+        </w:tc>
+        <w:tc>
+          <w:tcPr>
+            <w:tcW w:w="1325" w:type="dxa"/>
+          </w:tcPr>
+          <w:p>
+            <w:r>
+              <w:t>26-06-2026</w:t>
+            </w:r>
+          </w:p>
+        </w:tc>
+      </w:tr>
+      <w:tr>
+        <w:tc>
+          <w:tcPr>
+            <w:tcW w:w="1829" w:type="dxa"/>
+          </w:tcPr>
+          <w:p>
+            <w:pPr>
+              <w:rPr>
+                <w:b/>
+                <w:bCs/>
+              </w:rPr>
+            </w:pPr>
+          </w:p>
+        </w:tc>
+        <w:tc>
+          <w:tcPr>
+            <w:tcW w:w="2578" w:type="dxa"/>
+          </w:tcPr>
+          <w:p>
+            <w:r>
+              <w:t>Verwerkte feedback is aantoonbaar zichtbaar in het eindproduct.</w:t>
+            </w:r>
+          </w:p>
+        </w:tc>
+        <w:tc>
+          <w:tcPr>
+            <w:tcW w:w="778" w:type="dxa"/>
+          </w:tcPr>
+          <w:p>
+            <w:pPr>
+              <w:jc w:val="center"/>
+              <w:rPr>
+                <w:rFonts w:ascii="Segoe UI Symbol" w:hAnsi="Segoe UI Symbol" w:cs="Segoe UI Symbol"/>
+                <w:b/>
+                <w:bCs/>
+                <w:color w:val="000000"/>
+                <w:sz w:val="27"/>
+                <w:szCs w:val="27"/>
+              </w:rPr>
+            </w:pPr>
+            <w:r>
+              <w:rPr>
+                <w:rFonts w:ascii="Segoe UI Symbol" w:hAnsi="Segoe UI Symbol" w:cs="Segoe UI Symbol"/>
+                <w:b/>
+                <w:bCs/>
+                <w:color w:val="000000"/>
+                <w:sz w:val="27"/>
+                <w:szCs w:val="27"/>
+              </w:rPr>
+              <w:t>✓</w:t>
+            </w:r>
+          </w:p>
+        </w:tc>
+        <w:tc>
+          <w:tcPr>
+            <w:tcW w:w="2837" w:type="dxa"/>
+          </w:tcPr>
+          <w:p>
+            <w:pPr>
+              <w:rPr>
+                <w:color w:val="000000"/>
+              </w:rPr>
+            </w:pPr>
+            <w:r>
+              <w:rPr>
+                <w:color w:val="000000"/>
+              </w:rPr>
+              <w:t>Onderdelen zijn verwerkt in prototype</w:t>
+            </w:r>
+            <w:r>
+              <w:rPr>
+                <w:color w:val="000000"/>
+              </w:rPr>
+              <w:t>.</w:t>
+            </w:r>
+          </w:p>
+        </w:tc>
+        <w:tc>
+          <w:tcPr>
+            <w:tcW w:w="1325" w:type="dxa"/>
+          </w:tcPr>
+          <w:p>
+            <w:r>
+              <w:t>26-06-2026</w:t>
+            </w:r>
+          </w:p>
         </w:tc>
       </w:tr>
     </w:tbl>
@@ -25334,6 +25752,7 @@
   <w:style w:type="character" w:default="1" w:styleId="DefaultParagraphFont">
     <w:name w:val="Default Paragraph Font"/>
     <w:uiPriority w:val="1"/>
+    <w:semiHidden/>
     <w:unhideWhenUsed/>
   </w:style>
   <w:style w:type="table" w:default="1" w:styleId="TableNormal">
@@ -26821,107 +27240,15 @@
 </file>
 
 <file path=customXml/item1.xml><?xml version="1.0" encoding="utf-8"?>
-<b:Sources xmlns:b="http://schemas.openxmlformats.org/officeDocument/2006/bibliography" xmlns="http://schemas.openxmlformats.org/officeDocument/2006/bibliography" SelectedStyle="/APASixthEditionOfficeOnline.xsl" StyleName="APA" Version="6">
-  <b:Source>
-    <b:Tag>Vin22</b:Tag>
-    <b:SourceType>InternetSite</b:SourceType>
-    <b:Guid>{6A3D39E5-5DE6-4FEF-8131-B7E781F4CFEE}</b:Guid>
-    <b:Author>
-      <b:Author>
-        <b:NameList>
-          <b:Person>
-            <b:Last>Brakel</b:Last>
-            <b:First>Vincent</b:First>
-            <b:Middle>van</b:Middle>
-          </b:Person>
-        </b:NameList>
-      </b:Author>
-    </b:Author>
-    <b:Title>Hoe test je gratis WCAG-succescriterium 1.4.12?</b:Title>
-    <b:InternetSiteTitle>Digitaal Toegankelijk</b:InternetSiteTitle>
-    <b:Year>2022</b:Year>
-    <b:Month>maart</b:Month>
-    <b:Day>21</b:Day>
-    <b:URL>https://digitaaltoegankelijk.nl/nieuws/wcag-1-4-12-testen/</b:URL>
-    <b:RefOrder>1</b:RefOrder>
-  </b:Source>
-  <b:Source>
-    <b:Tag>Wha26</b:Tag>
-    <b:SourceType>InternetSite</b:SourceType>
-    <b:Guid>{9B1631CC-A784-458A-A68A-B1F7B14BC4A2}</b:Guid>
-    <b:Author>
-      <b:Author>
-        <b:Corporate>Whatspot</b:Corporate>
-      </b:Author>
-    </b:Author>
-    <b:InternetSiteTitle>Whatspot</b:InternetSiteTitle>
-    <b:URL>https://www.whatspot.app/?gad_campaignid=21107995564</b:URL>
-    <b:Title>Booking system for every modern workspace</b:Title>
-    <b:RefOrder>2</b:RefOrder>
-  </b:Source>
-  <b:Source>
-    <b:Tag>Ske</b:Tag>
-    <b:SourceType>InternetSite</b:SourceType>
-    <b:Guid>{E5700D73-39EC-4CF0-B46B-F422C8F48A52}</b:Guid>
-    <b:Title>Simplify Space Management</b:Title>
-    <b:Author>
-      <b:Author>
-        <b:Corporate>Skedda</b:Corporate>
-      </b:Author>
-    </b:Author>
-    <b:InternetSiteTitle>Skedda</b:InternetSiteTitle>
-    <b:URL>https://www.skedda.com/</b:URL>
-    <b:RefOrder>3</b:RefOrder>
-  </b:Source>
-  <b:Source>
-    <b:Tag>W3C25</b:Tag>
-    <b:SourceType>InternetSite</b:SourceType>
-    <b:Guid>{D9556422-1A31-43E4-B0F5-A3BD064DB4E2}</b:Guid>
-    <b:Author>
-      <b:Author>
-        <b:Corporate>W3C</b:Corporate>
-      </b:Author>
-    </b:Author>
-    <b:Title>Web Content Accessibility Guidelines (WCAG) 2.1</b:Title>
-    <b:InternetSiteTitle>W3</b:InternetSiteTitle>
-    <b:Year>2025</b:Year>
-    <b:Month>may</b:Month>
-    <b:Day>6</b:Day>
-    <b:URL>https://www.w3.org/TR/WCAG21/#perceivable</b:URL>
-    <b:RefOrder>4</b:RefOrder>
-  </b:Source>
-  <b:Source>
-    <b:Tag>Fle26</b:Tag>
-    <b:SourceType>InternetSite</b:SourceType>
-    <b:Guid>{A6406C46-5DA0-4DE2-B84E-FA54308F972C}</b:Guid>
-    <b:Author>
-      <b:Author>
-        <b:NameList>
-          <b:Person>
-            <b:Last>Flexwhere</b:Last>
-          </b:Person>
-        </b:NameList>
-      </b:Author>
-    </b:Author>
-    <b:Title>Kies je abonnement | Groei eenvoudig mee</b:Title>
-    <b:Year>2026</b:Year>
-    <b:LCID>nl-NL</b:LCID>
-    <b:InternetSiteTitle>Flexwhere</b:InternetSiteTitle>
-    <b:Month>02</b:Month>
-    <b:Day>15</b:Day>
-    <b:URL>https://flexwhere.nl/prijzen</b:URL>
-    <b:RefOrder>5</b:RefOrder>
-  </b:Source>
-</b:Sources>
+<?mso-contentType ?>
+<FormTemplates xmlns="http://schemas.microsoft.com/sharepoint/v3/contenttype/forms">
+  <Display>DocumentLibraryForm</Display>
+  <Edit>DocumentLibraryForm</Edit>
+  <New>DocumentLibraryForm</New>
+</FormTemplates>
 </file>
 
 <file path=customXml/item2.xml><?xml version="1.0" encoding="utf-8"?>
-<p:properties xmlns:p="http://schemas.microsoft.com/office/2006/metadata/properties" xmlns:xsi="http://www.w3.org/2001/XMLSchema-instance" xmlns:pc="http://schemas.microsoft.com/office/infopath/2007/PartnerControls">
-  <documentManagement/>
-</p:properties>
-</file>
-
-<file path=customXml/item3.xml><?xml version="1.0" encoding="utf-8"?>
 <ct:contentTypeSchema xmlns:ct="http://schemas.microsoft.com/office/2006/metadata/contentType" xmlns:ma="http://schemas.microsoft.com/office/2006/metadata/properties/metaAttributes" ct:_="" ma:_="" ma:contentTypeName="Document" ma:contentTypeID="0x010100D0BB77D65DB97745B835076E0EF123F1" ma:contentTypeVersion="3" ma:contentTypeDescription="Een nieuw document maken." ma:contentTypeScope="" ma:versionID="f5e20feff643aae03d305ed3501b9de7">
   <xsd:schema xmlns:xsd="http://www.w3.org/2001/XMLSchema" xmlns:xs="http://www.w3.org/2001/XMLSchema" xmlns:p="http://schemas.microsoft.com/office/2006/metadata/properties" xmlns:ns2="9c4fc8d7-28d9-45de-9015-6a9b5ed128f7" targetNamespace="http://schemas.microsoft.com/office/2006/metadata/properties" ma:root="true" ma:fieldsID="e4c8b2eb8dfeb271dd91865265868f5e" ns2:_="">
     <xsd:import namespace="9c4fc8d7-28d9-45de-9015-6a9b5ed128f7"/>
@@ -27059,33 +27386,116 @@
 </ct:contentTypeSchema>
 </file>
 
+<file path=customXml/item3.xml><?xml version="1.0" encoding="utf-8"?>
+<p:properties xmlns:p="http://schemas.microsoft.com/office/2006/metadata/properties" xmlns:xsi="http://www.w3.org/2001/XMLSchema-instance" xmlns:pc="http://schemas.microsoft.com/office/infopath/2007/PartnerControls">
+  <documentManagement/>
+</p:properties>
+</file>
+
 <file path=customXml/item4.xml><?xml version="1.0" encoding="utf-8"?>
-<?mso-contentType ?>
-<FormTemplates xmlns="http://schemas.microsoft.com/sharepoint/v3/contenttype/forms">
-  <Display>DocumentLibraryForm</Display>
-  <Edit>DocumentLibraryForm</Edit>
-  <New>DocumentLibraryForm</New>
-</FormTemplates>
+<b:Sources xmlns:b="http://schemas.openxmlformats.org/officeDocument/2006/bibliography" xmlns="http://schemas.openxmlformats.org/officeDocument/2006/bibliography" SelectedStyle="/APASixthEditionOfficeOnline.xsl" StyleName="APA" Version="6">
+  <b:Source>
+    <b:Tag>Vin22</b:Tag>
+    <b:SourceType>InternetSite</b:SourceType>
+    <b:Guid>{6A3D39E5-5DE6-4FEF-8131-B7E781F4CFEE}</b:Guid>
+    <b:Author>
+      <b:Author>
+        <b:NameList>
+          <b:Person>
+            <b:Last>Brakel</b:Last>
+            <b:First>Vincent</b:First>
+            <b:Middle>van</b:Middle>
+          </b:Person>
+        </b:NameList>
+      </b:Author>
+    </b:Author>
+    <b:Title>Hoe test je gratis WCAG-succescriterium 1.4.12?</b:Title>
+    <b:InternetSiteTitle>Digitaal Toegankelijk</b:InternetSiteTitle>
+    <b:Year>2022</b:Year>
+    <b:Month>maart</b:Month>
+    <b:Day>21</b:Day>
+    <b:URL>https://digitaaltoegankelijk.nl/nieuws/wcag-1-4-12-testen/</b:URL>
+    <b:RefOrder>1</b:RefOrder>
+  </b:Source>
+  <b:Source>
+    <b:Tag>Wha26</b:Tag>
+    <b:SourceType>InternetSite</b:SourceType>
+    <b:Guid>{9B1631CC-A784-458A-A68A-B1F7B14BC4A2}</b:Guid>
+    <b:Author>
+      <b:Author>
+        <b:Corporate>Whatspot</b:Corporate>
+      </b:Author>
+    </b:Author>
+    <b:InternetSiteTitle>Whatspot</b:InternetSiteTitle>
+    <b:URL>https://www.whatspot.app/?gad_campaignid=21107995564</b:URL>
+    <b:Title>Booking system for every modern workspace</b:Title>
+    <b:RefOrder>2</b:RefOrder>
+  </b:Source>
+  <b:Source>
+    <b:Tag>Ske</b:Tag>
+    <b:SourceType>InternetSite</b:SourceType>
+    <b:Guid>{E5700D73-39EC-4CF0-B46B-F422C8F48A52}</b:Guid>
+    <b:Title>Simplify Space Management</b:Title>
+    <b:Author>
+      <b:Author>
+        <b:Corporate>Skedda</b:Corporate>
+      </b:Author>
+    </b:Author>
+    <b:InternetSiteTitle>Skedda</b:InternetSiteTitle>
+    <b:URL>https://www.skedda.com/</b:URL>
+    <b:RefOrder>3</b:RefOrder>
+  </b:Source>
+  <b:Source>
+    <b:Tag>W3C25</b:Tag>
+    <b:SourceType>InternetSite</b:SourceType>
+    <b:Guid>{D9556422-1A31-43E4-B0F5-A3BD064DB4E2}</b:Guid>
+    <b:Author>
+      <b:Author>
+        <b:Corporate>W3C</b:Corporate>
+      </b:Author>
+    </b:Author>
+    <b:Title>Web Content Accessibility Guidelines (WCAG) 2.1</b:Title>
+    <b:InternetSiteTitle>W3</b:InternetSiteTitle>
+    <b:Year>2025</b:Year>
+    <b:Month>may</b:Month>
+    <b:Day>6</b:Day>
+    <b:URL>https://www.w3.org/TR/WCAG21/#perceivable</b:URL>
+    <b:RefOrder>4</b:RefOrder>
+  </b:Source>
+  <b:Source>
+    <b:Tag>Fle26</b:Tag>
+    <b:SourceType>InternetSite</b:SourceType>
+    <b:Guid>{A6406C46-5DA0-4DE2-B84E-FA54308F972C}</b:Guid>
+    <b:Author>
+      <b:Author>
+        <b:NameList>
+          <b:Person>
+            <b:Last>Flexwhere</b:Last>
+          </b:Person>
+        </b:NameList>
+      </b:Author>
+    </b:Author>
+    <b:Title>Kies je abonnement | Groei eenvoudig mee</b:Title>
+    <b:Year>2026</b:Year>
+    <b:LCID>nl-NL</b:LCID>
+    <b:InternetSiteTitle>Flexwhere</b:InternetSiteTitle>
+    <b:Month>02</b:Month>
+    <b:Day>15</b:Day>
+    <b:URL>https://flexwhere.nl/prijzen</b:URL>
+    <b:RefOrder>5</b:RefOrder>
+  </b:Source>
+</b:Sources>
 </file>
 
 <file path=customXml/itemProps1.xml><?xml version="1.0" encoding="utf-8"?>
-<ds:datastoreItem xmlns:ds="http://schemas.openxmlformats.org/officeDocument/2006/customXml" ds:itemID="{8C6B7691-150B-3140-AF98-66DE9E0B84E1}">
+<ds:datastoreItem xmlns:ds="http://schemas.openxmlformats.org/officeDocument/2006/customXml" ds:itemID="{82D9BFC6-F333-43E5-9205-C8904E48ED3D}">
   <ds:schemaRefs>
-    <ds:schemaRef ds:uri="http://schemas.openxmlformats.org/officeDocument/2006/bibliography"/>
+    <ds:schemaRef ds:uri="http://schemas.microsoft.com/sharepoint/v3/contenttype/forms"/>
   </ds:schemaRefs>
 </ds:datastoreItem>
 </file>
 
 <file path=customXml/itemProps2.xml><?xml version="1.0" encoding="utf-8"?>
-<ds:datastoreItem xmlns:ds="http://schemas.openxmlformats.org/officeDocument/2006/customXml" ds:itemID="{F6733805-3435-4F94-A33F-6225E5CBCD31}">
-  <ds:schemaRefs>
-    <ds:schemaRef ds:uri="http://schemas.microsoft.com/office/2006/metadata/properties"/>
-    <ds:schemaRef ds:uri="http://schemas.microsoft.com/office/infopath/2007/PartnerControls"/>
-  </ds:schemaRefs>
-</ds:datastoreItem>
-</file>
-
-<file path=customXml/itemProps3.xml><?xml version="1.0" encoding="utf-8"?>
 <ds:datastoreItem xmlns:ds="http://schemas.openxmlformats.org/officeDocument/2006/customXml" ds:itemID="{BCB0D87B-C877-4F66-B5F5-352EF415DDF1}">
   <ds:schemaRefs>
     <ds:schemaRef ds:uri="http://schemas.microsoft.com/office/2006/metadata/contentType"/>
@@ -27103,10 +27513,19 @@
 </ds:datastoreItem>
 </file>
 
+<file path=customXml/itemProps3.xml><?xml version="1.0" encoding="utf-8"?>
+<ds:datastoreItem xmlns:ds="http://schemas.openxmlformats.org/officeDocument/2006/customXml" ds:itemID="{F6733805-3435-4F94-A33F-6225E5CBCD31}">
+  <ds:schemaRefs>
+    <ds:schemaRef ds:uri="http://schemas.microsoft.com/office/2006/metadata/properties"/>
+    <ds:schemaRef ds:uri="http://schemas.microsoft.com/office/infopath/2007/PartnerControls"/>
+  </ds:schemaRefs>
+</ds:datastoreItem>
+</file>
+
 <file path=customXml/itemProps4.xml><?xml version="1.0" encoding="utf-8"?>
-<ds:datastoreItem xmlns:ds="http://schemas.openxmlformats.org/officeDocument/2006/customXml" ds:itemID="{82D9BFC6-F333-43E5-9205-C8904E48ED3D}">
+<ds:datastoreItem xmlns:ds="http://schemas.openxmlformats.org/officeDocument/2006/customXml" ds:itemID="{8C6B7691-150B-3140-AF98-66DE9E0B84E1}">
   <ds:schemaRefs>
-    <ds:schemaRef ds:uri="http://schemas.microsoft.com/sharepoint/v3/contenttype/forms"/>
+    <ds:schemaRef ds:uri="http://schemas.openxmlformats.org/officeDocument/2006/bibliography"/>
   </ds:schemaRefs>
 </ds:datastoreItem>
 </file>

</xml_diff>

<commit_message>
Unity aanpassingen + checklist Nick toegevoegd
</commit_message>
<xml_diff>
--- a/Documentatie/Disney Dimensions.docx
+++ b/Documentatie/Disney Dimensions.docx
@@ -4616,31 +4616,18 @@
           <w:lang w:val="en-US"/>
         </w:rPr>
       </w:pPr>
-      <w:bookmarkStart w:id="13" w:name="_Toc228741984"/>
+      <w:bookmarkStart w:id="13" w:name="_Toc230858660"/>
       <w:r>
         <w:t xml:space="preserve">Figuur </w:t>
       </w:r>
-      <w:r>
-        <w:fldChar w:fldCharType="begin"/>
-      </w:r>
-      <w:r>
-        <w:instrText xml:space="preserve"> SEQ Figuur \* ARABIC </w:instrText>
-      </w:r>
-      <w:r>
-        <w:fldChar w:fldCharType="separate"/>
-      </w:r>
-      <w:r>
-        <w:rPr>
-          <w:noProof/>
-        </w:rPr>
-        <w:t>1</w:t>
-      </w:r>
-      <w:r>
-        <w:rPr>
-          <w:noProof/>
-        </w:rPr>
-        <w:fldChar w:fldCharType="end"/>
-      </w:r>
+      <w:fldSimple w:instr=" SEQ Figuur \* ARABIC ">
+        <w:r>
+          <w:rPr>
+            <w:noProof/>
+          </w:rPr>
+          <w:t>1</w:t>
+        </w:r>
+      </w:fldSimple>
       <w:r>
         <w:t>: Moodboard</w:t>
       </w:r>
@@ -5292,31 +5279,18 @@
       <w:pPr>
         <w:pStyle w:val="Caption"/>
       </w:pPr>
-      <w:bookmarkStart w:id="19" w:name="_Toc228741985"/>
+      <w:bookmarkStart w:id="19" w:name="_Toc230858661"/>
       <w:r>
         <w:t xml:space="preserve">Figuur </w:t>
       </w:r>
-      <w:r>
-        <w:fldChar w:fldCharType="begin"/>
-      </w:r>
-      <w:r>
-        <w:instrText xml:space="preserve"> SEQ Figuur \* ARABIC </w:instrText>
-      </w:r>
-      <w:r>
-        <w:fldChar w:fldCharType="separate"/>
-      </w:r>
-      <w:r>
-        <w:rPr>
-          <w:noProof/>
-        </w:rPr>
-        <w:t>2</w:t>
-      </w:r>
-      <w:r>
-        <w:rPr>
-          <w:noProof/>
-        </w:rPr>
-        <w:fldChar w:fldCharType="end"/>
-      </w:r>
+      <w:fldSimple w:instr=" SEQ Figuur \* ARABIC ">
+        <w:r>
+          <w:rPr>
+            <w:noProof/>
+          </w:rPr>
+          <w:t>2</w:t>
+        </w:r>
+      </w:fldSimple>
       <w:r>
         <w:t>: Persona Rick</w:t>
       </w:r>
@@ -5761,31 +5735,18 @@
       <w:pPr>
         <w:pStyle w:val="Caption"/>
       </w:pPr>
-      <w:bookmarkStart w:id="23" w:name="_Toc228741986"/>
+      <w:bookmarkStart w:id="23" w:name="_Toc230858662"/>
       <w:r>
         <w:t xml:space="preserve">Figuur </w:t>
       </w:r>
-      <w:r>
-        <w:fldChar w:fldCharType="begin"/>
-      </w:r>
-      <w:r>
-        <w:instrText xml:space="preserve"> SEQ Figuur \* ARABIC </w:instrText>
-      </w:r>
-      <w:r>
-        <w:fldChar w:fldCharType="separate"/>
-      </w:r>
-      <w:r>
-        <w:rPr>
-          <w:noProof/>
-        </w:rPr>
-        <w:t>3</w:t>
-      </w:r>
-      <w:r>
-        <w:rPr>
-          <w:noProof/>
-        </w:rPr>
-        <w:fldChar w:fldCharType="end"/>
-      </w:r>
+      <w:fldSimple w:instr=" SEQ Figuur \* ARABIC ">
+        <w:r>
+          <w:rPr>
+            <w:noProof/>
+          </w:rPr>
+          <w:t>3</w:t>
+        </w:r>
+      </w:fldSimple>
       <w:r>
         <w:t>: User flow</w:t>
       </w:r>
@@ -8257,7 +8218,7 @@
           <w:noProof/>
         </w:rPr>
         <w:drawing>
-          <wp:inline distT="0" distB="0" distL="0" distR="0" wp14:anchorId="49A6505F" wp14:editId="7B4E0F44">
+          <wp:inline distT="0" distB="0" distL="0" distR="0" wp14:anchorId="49A6505F" wp14:editId="23F3496B">
             <wp:extent cx="5731510" cy="4079240"/>
             <wp:effectExtent l="0" t="0" r="0" b="0"/>
             <wp:docPr id="69312833" name="Picture 2"/>
@@ -8303,31 +8264,18 @@
       <w:pPr>
         <w:pStyle w:val="Caption"/>
       </w:pPr>
-      <w:bookmarkStart w:id="30" w:name="_Toc228741987"/>
+      <w:bookmarkStart w:id="30" w:name="_Toc230858663"/>
       <w:r>
         <w:t xml:space="preserve">Figuur </w:t>
       </w:r>
-      <w:r>
-        <w:fldChar w:fldCharType="begin"/>
-      </w:r>
-      <w:r>
-        <w:instrText xml:space="preserve"> SEQ Figuur \* ARABIC </w:instrText>
-      </w:r>
-      <w:r>
-        <w:fldChar w:fldCharType="separate"/>
-      </w:r>
-      <w:r>
-        <w:rPr>
-          <w:noProof/>
-        </w:rPr>
-        <w:t>4</w:t>
-      </w:r>
-      <w:r>
-        <w:rPr>
-          <w:noProof/>
-        </w:rPr>
-        <w:fldChar w:fldCharType="end"/>
-      </w:r>
+      <w:fldSimple w:instr=" SEQ Figuur \* ARABIC ">
+        <w:r>
+          <w:rPr>
+            <w:noProof/>
+          </w:rPr>
+          <w:t>4</w:t>
+        </w:r>
+      </w:fldSimple>
       <w:r>
         <w:t xml:space="preserve">: Low </w:t>
       </w:r>
@@ -8423,31 +8371,18 @@
       <w:pPr>
         <w:pStyle w:val="Caption"/>
       </w:pPr>
-      <w:bookmarkStart w:id="32" w:name="_Toc228741988"/>
+      <w:bookmarkStart w:id="32" w:name="_Toc230858664"/>
       <w:r>
         <w:t xml:space="preserve">Figuur </w:t>
       </w:r>
-      <w:r>
-        <w:fldChar w:fldCharType="begin"/>
-      </w:r>
-      <w:r>
-        <w:instrText xml:space="preserve"> SEQ Figuur \* ARABIC </w:instrText>
-      </w:r>
-      <w:r>
-        <w:fldChar w:fldCharType="separate"/>
-      </w:r>
-      <w:r>
-        <w:rPr>
-          <w:noProof/>
-        </w:rPr>
-        <w:t>5</w:t>
-      </w:r>
-      <w:r>
-        <w:rPr>
-          <w:noProof/>
-        </w:rPr>
-        <w:fldChar w:fldCharType="end"/>
-      </w:r>
+      <w:fldSimple w:instr=" SEQ Figuur \* ARABIC ">
+        <w:r>
+          <w:rPr>
+            <w:noProof/>
+          </w:rPr>
+          <w:t>5</w:t>
+        </w:r>
+      </w:fldSimple>
       <w:r>
         <w:t xml:space="preserve">: High </w:t>
       </w:r>
@@ -12575,58 +12510,7 @@
                 <w:szCs w:val="27"/>
               </w:rPr>
             </w:pPr>
-          </w:p>
-        </w:tc>
-        <w:tc>
-          <w:tcPr>
-            <w:tcW w:w="2837" w:type="dxa"/>
-          </w:tcPr>
-          <w:p>
-            <w:pPr>
-              <w:rPr>
-                <w:color w:val="000000"/>
-              </w:rPr>
-            </w:pPr>
-          </w:p>
-        </w:tc>
-        <w:tc>
-          <w:tcPr>
-            <w:tcW w:w="1321" w:type="dxa"/>
-          </w:tcPr>
-          <w:p/>
-        </w:tc>
-      </w:tr>
-      <w:tr>
-        <w:tc>
-          <w:tcPr>
-            <w:tcW w:w="1823" w:type="dxa"/>
-          </w:tcPr>
-          <w:p>
-            <w:pPr>
-              <w:rPr>
-                <w:b/>
-                <w:bCs/>
-              </w:rPr>
-            </w:pPr>
-          </w:p>
-        </w:tc>
-        <w:tc>
-          <w:tcPr>
-            <w:tcW w:w="2579" w:type="dxa"/>
-          </w:tcPr>
-          <w:p>
-            <w:r>
-              <w:t>De pagina’s zijn responsief (werken op desktop en mobiel).</w:t>
-            </w:r>
-          </w:p>
-        </w:tc>
-        <w:tc>
-          <w:tcPr>
-            <w:tcW w:w="783" w:type="dxa"/>
-          </w:tcPr>
-          <w:p>
-            <w:pPr>
-              <w:jc w:val="center"/>
+            <w:r>
               <w:rPr>
                 <w:rFonts w:ascii="Segoe UI Symbol" w:hAnsi="Segoe UI Symbol" w:cs="Segoe UI Symbol"/>
                 <w:b/>
@@ -12635,7 +12519,8 @@
                 <w:sz w:val="27"/>
                 <w:szCs w:val="27"/>
               </w:rPr>
-            </w:pPr>
+              <w:t>✓</w:t>
+            </w:r>
           </w:p>
         </w:tc>
         <w:tc>
@@ -12654,7 +12539,11 @@
           <w:tcPr>
             <w:tcW w:w="1321" w:type="dxa"/>
           </w:tcPr>
-          <w:p/>
+          <w:p>
+            <w:r>
+              <w:t>28-05-2026</w:t>
+            </w:r>
+          </w:p>
         </w:tc>
       </w:tr>
       <w:tr>
@@ -12677,7 +12566,7 @@
           </w:tcPr>
           <w:p>
             <w:r>
-              <w:t>Interacties of animaties zijn technisch correct geïmplementeerd.</w:t>
+              <w:t>De pagina’s zijn responsief (werken op desktop en mobiel).</w:t>
             </w:r>
           </w:p>
         </w:tc>
@@ -12697,65 +12586,7 @@
                 <w:szCs w:val="27"/>
               </w:rPr>
             </w:pPr>
-          </w:p>
-        </w:tc>
-        <w:tc>
-          <w:tcPr>
-            <w:tcW w:w="2837" w:type="dxa"/>
-          </w:tcPr>
-          <w:p>
-            <w:pPr>
-              <w:rPr>
-                <w:color w:val="000000"/>
-              </w:rPr>
-            </w:pPr>
-          </w:p>
-        </w:tc>
-        <w:tc>
-          <w:tcPr>
-            <w:tcW w:w="1321" w:type="dxa"/>
-          </w:tcPr>
-          <w:p/>
-        </w:tc>
-      </w:tr>
-      <w:tr>
-        <w:tc>
-          <w:tcPr>
-            <w:tcW w:w="1823" w:type="dxa"/>
-          </w:tcPr>
-          <w:p>
-            <w:pPr>
-              <w:rPr>
-                <w:b/>
-                <w:bCs/>
-              </w:rPr>
-            </w:pPr>
-            <w:r>
-              <w:rPr>
-                <w:b/>
-                <w:bCs/>
-              </w:rPr>
-              <w:t>Innovatie &amp; AR-component</w:t>
-            </w:r>
-          </w:p>
-        </w:tc>
-        <w:tc>
-          <w:tcPr>
-            <w:tcW w:w="2579" w:type="dxa"/>
-          </w:tcPr>
-          <w:p>
-            <w:r>
-              <w:t>Er is minimaal één innovatief element aanwezig (AR of alternatief).</w:t>
-            </w:r>
-          </w:p>
-        </w:tc>
-        <w:tc>
-          <w:tcPr>
-            <w:tcW w:w="783" w:type="dxa"/>
-          </w:tcPr>
-          <w:p>
-            <w:pPr>
-              <w:jc w:val="center"/>
+            <w:r>
               <w:rPr>
                 <w:rFonts w:ascii="Segoe UI Symbol" w:hAnsi="Segoe UI Symbol" w:cs="Segoe UI Symbol"/>
                 <w:b/>
@@ -12764,7 +12595,8 @@
                 <w:sz w:val="27"/>
                 <w:szCs w:val="27"/>
               </w:rPr>
-            </w:pPr>
+              <w:t>✓</w:t>
+            </w:r>
           </w:p>
         </w:tc>
         <w:tc>
@@ -12777,13 +12609,28 @@
                 <w:color w:val="000000"/>
               </w:rPr>
             </w:pPr>
+            <w:r>
+              <w:t xml:space="preserve">Werkt op zowel mobiel als desktop, </w:t>
+            </w:r>
+            <w:proofErr w:type="spellStart"/>
+            <w:r>
+              <w:t>layout</w:t>
+            </w:r>
+            <w:proofErr w:type="spellEnd"/>
+            <w:r>
+              <w:t xml:space="preserve"> blijft wel mobiel, ook op desktop.</w:t>
+            </w:r>
           </w:p>
         </w:tc>
         <w:tc>
           <w:tcPr>
             <w:tcW w:w="1321" w:type="dxa"/>
           </w:tcPr>
-          <w:p/>
+          <w:p>
+            <w:r>
+              <w:t>28-05-2026</w:t>
+            </w:r>
+          </w:p>
         </w:tc>
       </w:tr>
       <w:tr>
@@ -12806,7 +12653,7 @@
           </w:tcPr>
           <w:p>
             <w:r>
-              <w:t>De AR-ervaring versterkt de gebruikersbeleving.</w:t>
+              <w:t>Interacties of animaties zijn technisch correct geïmplementeerd.</w:t>
             </w:r>
           </w:p>
         </w:tc>
@@ -12826,65 +12673,7 @@
                 <w:szCs w:val="27"/>
               </w:rPr>
             </w:pPr>
-          </w:p>
-        </w:tc>
-        <w:tc>
-          <w:tcPr>
-            <w:tcW w:w="2837" w:type="dxa"/>
-          </w:tcPr>
-          <w:p>
-            <w:pPr>
-              <w:rPr>
-                <w:color w:val="000000"/>
-              </w:rPr>
-            </w:pPr>
-          </w:p>
-        </w:tc>
-        <w:tc>
-          <w:tcPr>
-            <w:tcW w:w="1321" w:type="dxa"/>
-          </w:tcPr>
-          <w:p/>
-        </w:tc>
-      </w:tr>
-      <w:tr>
-        <w:tc>
-          <w:tcPr>
-            <w:tcW w:w="1823" w:type="dxa"/>
-          </w:tcPr>
-          <w:p>
-            <w:pPr>
-              <w:rPr>
-                <w:b/>
-                <w:bCs/>
-              </w:rPr>
-            </w:pPr>
-            <w:r>
-              <w:rPr>
-                <w:b/>
-                <w:bCs/>
-              </w:rPr>
-              <w:t>Presentatievorm</w:t>
-            </w:r>
-          </w:p>
-        </w:tc>
-        <w:tc>
-          <w:tcPr>
-            <w:tcW w:w="2579" w:type="dxa"/>
-          </w:tcPr>
-          <w:p>
-            <w:r>
-              <w:t>De presentatie is creatief en sluit aan bij het gekozen concept.</w:t>
-            </w:r>
-          </w:p>
-        </w:tc>
-        <w:tc>
-          <w:tcPr>
-            <w:tcW w:w="783" w:type="dxa"/>
-          </w:tcPr>
-          <w:p>
-            <w:pPr>
-              <w:jc w:val="center"/>
+            <w:r>
               <w:rPr>
                 <w:rFonts w:ascii="Segoe UI Symbol" w:hAnsi="Segoe UI Symbol" w:cs="Segoe UI Symbol"/>
                 <w:b/>
@@ -12893,7 +12682,8 @@
                 <w:sz w:val="27"/>
                 <w:szCs w:val="27"/>
               </w:rPr>
-            </w:pPr>
+              <w:t>✓</w:t>
+            </w:r>
           </w:p>
         </w:tc>
         <w:tc>
@@ -12906,13 +12696,29 @@
                 <w:color w:val="000000"/>
               </w:rPr>
             </w:pPr>
+            <w:r>
+              <w:rPr>
+                <w:color w:val="000000"/>
+              </w:rPr>
+              <w:t>Leuke micro-interacties</w:t>
+            </w:r>
+            <w:r>
+              <w:rPr>
+                <w:color w:val="000000"/>
+              </w:rPr>
+              <w:t>.</w:t>
+            </w:r>
           </w:p>
         </w:tc>
         <w:tc>
           <w:tcPr>
             <w:tcW w:w="1321" w:type="dxa"/>
           </w:tcPr>
-          <w:p/>
+          <w:p>
+            <w:r>
+              <w:t>28-05-2026</w:t>
+            </w:r>
+          </w:p>
         </w:tc>
       </w:tr>
       <w:tr>
@@ -12927,6 +12733,13 @@
                 <w:bCs/>
               </w:rPr>
             </w:pPr>
+            <w:r>
+              <w:rPr>
+                <w:b/>
+                <w:bCs/>
+              </w:rPr>
+              <w:t>Innovatie &amp; AR-component</w:t>
+            </w:r>
           </w:p>
         </w:tc>
         <w:tc>
@@ -12935,15 +12748,7 @@
           </w:tcPr>
           <w:p>
             <w:r>
-              <w:t xml:space="preserve">De vorm (video, </w:t>
-            </w:r>
-            <w:proofErr w:type="spellStart"/>
-            <w:r>
-              <w:t>walkthrough</w:t>
-            </w:r>
-            <w:proofErr w:type="spellEnd"/>
-            <w:r>
-              <w:t>, pitch) versterkt het verhaal.</w:t>
+              <w:t>Er is minimaal één innovatief element aanwezig (AR of alternatief).</w:t>
             </w:r>
           </w:p>
         </w:tc>
@@ -12963,58 +12768,7 @@
                 <w:szCs w:val="27"/>
               </w:rPr>
             </w:pPr>
-          </w:p>
-        </w:tc>
-        <w:tc>
-          <w:tcPr>
-            <w:tcW w:w="2837" w:type="dxa"/>
-          </w:tcPr>
-          <w:p>
-            <w:pPr>
-              <w:rPr>
-                <w:color w:val="000000"/>
-              </w:rPr>
-            </w:pPr>
-          </w:p>
-        </w:tc>
-        <w:tc>
-          <w:tcPr>
-            <w:tcW w:w="1321" w:type="dxa"/>
-          </w:tcPr>
-          <w:p/>
-        </w:tc>
-      </w:tr>
-      <w:tr>
-        <w:tc>
-          <w:tcPr>
-            <w:tcW w:w="1823" w:type="dxa"/>
-          </w:tcPr>
-          <w:p>
-            <w:pPr>
-              <w:rPr>
-                <w:b/>
-                <w:bCs/>
-              </w:rPr>
-            </w:pPr>
-          </w:p>
-        </w:tc>
-        <w:tc>
-          <w:tcPr>
-            <w:tcW w:w="2579" w:type="dxa"/>
-          </w:tcPr>
-          <w:p>
-            <w:r>
-              <w:t>Er is aandacht voor theatrale of visuele impact.</w:t>
-            </w:r>
-          </w:p>
-        </w:tc>
-        <w:tc>
-          <w:tcPr>
-            <w:tcW w:w="783" w:type="dxa"/>
-          </w:tcPr>
-          <w:p>
-            <w:pPr>
-              <w:jc w:val="center"/>
+            <w:r>
               <w:rPr>
                 <w:rFonts w:ascii="Segoe UI Symbol" w:hAnsi="Segoe UI Symbol" w:cs="Segoe UI Symbol"/>
                 <w:b/>
@@ -13023,7 +12777,8 @@
                 <w:sz w:val="27"/>
                 <w:szCs w:val="27"/>
               </w:rPr>
-            </w:pPr>
+              <w:t>✓</w:t>
+            </w:r>
           </w:p>
         </w:tc>
         <w:tc>
@@ -13036,13 +12791,29 @@
                 <w:color w:val="000000"/>
               </w:rPr>
             </w:pPr>
+            <w:r>
+              <w:rPr>
+                <w:color w:val="000000"/>
+              </w:rPr>
+              <w:t>Leuk uitgewerkt concept, het klikken om de outfit te veranderen werkt ook leuk</w:t>
+            </w:r>
+            <w:r>
+              <w:rPr>
+                <w:color w:val="000000"/>
+              </w:rPr>
+              <w:t>.</w:t>
+            </w:r>
           </w:p>
         </w:tc>
         <w:tc>
           <w:tcPr>
             <w:tcW w:w="1321" w:type="dxa"/>
           </w:tcPr>
-          <w:p/>
+          <w:p>
+            <w:r>
+              <w:t>28-05-2026</w:t>
+            </w:r>
+          </w:p>
         </w:tc>
       </w:tr>
       <w:tr>
@@ -13057,13 +12828,6 @@
                 <w:bCs/>
               </w:rPr>
             </w:pPr>
-            <w:r>
-              <w:rPr>
-                <w:b/>
-                <w:bCs/>
-              </w:rPr>
-              <w:t>Reflectie &amp; onderbouwing</w:t>
-            </w:r>
           </w:p>
         </w:tc>
         <w:tc>
@@ -13072,7 +12836,7 @@
           </w:tcPr>
           <w:p>
             <w:r>
-              <w:t>Keuzes zijn inhoudelijk onderbouwd (visueel én functioneel).</w:t>
+              <w:t>De AR-ervaring versterkt de gebruikersbeleving.</w:t>
             </w:r>
           </w:p>
         </w:tc>
@@ -13092,51 +12856,7 @@
                 <w:szCs w:val="27"/>
               </w:rPr>
             </w:pPr>
-          </w:p>
-        </w:tc>
-        <w:tc>
-          <w:tcPr>
-            <w:tcW w:w="2837" w:type="dxa"/>
-          </w:tcPr>
-          <w:p>
-            <w:pPr>
-              <w:rPr>
-                <w:color w:val="000000"/>
-              </w:rPr>
-            </w:pPr>
-          </w:p>
-        </w:tc>
-        <w:tc>
-          <w:tcPr>
-            <w:tcW w:w="1321" w:type="dxa"/>
-          </w:tcPr>
-          <w:p/>
-        </w:tc>
-      </w:tr>
-      <w:tr>
-        <w:tc>
-          <w:tcPr>
-            <w:tcW w:w="1823" w:type="dxa"/>
-          </w:tcPr>
-          <w:p/>
-        </w:tc>
-        <w:tc>
-          <w:tcPr>
-            <w:tcW w:w="2579" w:type="dxa"/>
-          </w:tcPr>
-          <w:p>
-            <w:r>
-              <w:t>De student reflecteert op het proces, feedback en leerpunten.</w:t>
-            </w:r>
-          </w:p>
-        </w:tc>
-        <w:tc>
-          <w:tcPr>
-            <w:tcW w:w="783" w:type="dxa"/>
-          </w:tcPr>
-          <w:p>
-            <w:pPr>
-              <w:jc w:val="center"/>
+            <w:r>
               <w:rPr>
                 <w:rFonts w:ascii="Segoe UI Symbol" w:hAnsi="Segoe UI Symbol" w:cs="Segoe UI Symbol"/>
                 <w:b/>
@@ -13145,7 +12865,8 @@
                 <w:sz w:val="27"/>
                 <w:szCs w:val="27"/>
               </w:rPr>
-            </w:pPr>
+              <w:t>✓</w:t>
+            </w:r>
           </w:p>
         </w:tc>
         <w:tc>
@@ -13164,7 +12885,11 @@
           <w:tcPr>
             <w:tcW w:w="1321" w:type="dxa"/>
           </w:tcPr>
-          <w:p/>
+          <w:p>
+            <w:r>
+              <w:t>28-05-2026</w:t>
+            </w:r>
+          </w:p>
         </w:tc>
       </w:tr>
       <w:tr>
@@ -13172,7 +12897,21 @@
           <w:tcPr>
             <w:tcW w:w="1823" w:type="dxa"/>
           </w:tcPr>
-          <w:p/>
+          <w:p>
+            <w:pPr>
+              <w:rPr>
+                <w:b/>
+                <w:bCs/>
+              </w:rPr>
+            </w:pPr>
+            <w:r>
+              <w:rPr>
+                <w:b/>
+                <w:bCs/>
+              </w:rPr>
+              <w:t>Presentatievorm</w:t>
+            </w:r>
+          </w:p>
         </w:tc>
         <w:tc>
           <w:tcPr>
@@ -13180,7 +12919,7 @@
           </w:tcPr>
           <w:p>
             <w:r>
-              <w:t>Verwerkte feedback is aantoonbaar zichtbaar in het eindproduct.</w:t>
+              <w:t>De presentatie is creatief en sluit aan bij het gekozen concept.</w:t>
             </w:r>
           </w:p>
         </w:tc>
@@ -13200,6 +12939,17 @@
                 <w:szCs w:val="27"/>
               </w:rPr>
             </w:pPr>
+            <w:r>
+              <w:rPr>
+                <w:rFonts w:ascii="Segoe UI Symbol" w:hAnsi="Segoe UI Symbol" w:cs="Segoe UI Symbol"/>
+                <w:b/>
+                <w:bCs/>
+                <w:color w:val="000000"/>
+                <w:sz w:val="27"/>
+                <w:szCs w:val="27"/>
+              </w:rPr>
+              <w:t>✓</w:t>
+            </w:r>
           </w:p>
         </w:tc>
         <w:tc>
@@ -13212,13 +12962,427 @@
                 <w:color w:val="000000"/>
               </w:rPr>
             </w:pPr>
+            <w:r>
+              <w:rPr>
+                <w:color w:val="000000"/>
+              </w:rPr>
+              <w:t>Presentatie sluit goed aan bij de stijl van de app</w:t>
+            </w:r>
+            <w:r>
+              <w:rPr>
+                <w:color w:val="000000"/>
+              </w:rPr>
+              <w:t>.</w:t>
+            </w:r>
           </w:p>
         </w:tc>
         <w:tc>
           <w:tcPr>
             <w:tcW w:w="1321" w:type="dxa"/>
           </w:tcPr>
+          <w:p>
+            <w:r>
+              <w:t>28-05-2026</w:t>
+            </w:r>
+          </w:p>
+        </w:tc>
+      </w:tr>
+      <w:tr>
+        <w:tc>
+          <w:tcPr>
+            <w:tcW w:w="1823" w:type="dxa"/>
+          </w:tcPr>
+          <w:p>
+            <w:pPr>
+              <w:rPr>
+                <w:b/>
+                <w:bCs/>
+              </w:rPr>
+            </w:pPr>
+          </w:p>
+        </w:tc>
+        <w:tc>
+          <w:tcPr>
+            <w:tcW w:w="2579" w:type="dxa"/>
+          </w:tcPr>
+          <w:p>
+            <w:r>
+              <w:t xml:space="preserve">De vorm (video, </w:t>
+            </w:r>
+            <w:proofErr w:type="spellStart"/>
+            <w:r>
+              <w:t>walkthrough</w:t>
+            </w:r>
+            <w:proofErr w:type="spellEnd"/>
+            <w:r>
+              <w:t>, pitch) versterkt het verhaal.</w:t>
+            </w:r>
+          </w:p>
+        </w:tc>
+        <w:tc>
+          <w:tcPr>
+            <w:tcW w:w="783" w:type="dxa"/>
+          </w:tcPr>
+          <w:p>
+            <w:pPr>
+              <w:jc w:val="center"/>
+              <w:rPr>
+                <w:rFonts w:ascii="Segoe UI Symbol" w:hAnsi="Segoe UI Symbol" w:cs="Segoe UI Symbol"/>
+                <w:b/>
+                <w:bCs/>
+                <w:color w:val="000000"/>
+                <w:sz w:val="27"/>
+                <w:szCs w:val="27"/>
+              </w:rPr>
+            </w:pPr>
+            <w:r>
+              <w:rPr>
+                <w:rFonts w:ascii="Segoe UI Symbol" w:hAnsi="Segoe UI Symbol" w:cs="Segoe UI Symbol"/>
+                <w:b/>
+                <w:bCs/>
+                <w:color w:val="000000"/>
+                <w:sz w:val="27"/>
+                <w:szCs w:val="27"/>
+              </w:rPr>
+              <w:t>✓</w:t>
+            </w:r>
+          </w:p>
+        </w:tc>
+        <w:tc>
+          <w:tcPr>
+            <w:tcW w:w="2837" w:type="dxa"/>
+          </w:tcPr>
+          <w:p>
+            <w:pPr>
+              <w:rPr>
+                <w:color w:val="000000"/>
+              </w:rPr>
+            </w:pPr>
+            <w:r>
+              <w:rPr>
+                <w:color w:val="000000"/>
+              </w:rPr>
+              <w:t>De live demo/ervaar het zelf is een leuke toevoeging</w:t>
+            </w:r>
+            <w:r>
+              <w:rPr>
+                <w:color w:val="000000"/>
+              </w:rPr>
+              <w:t>.</w:t>
+            </w:r>
+          </w:p>
+        </w:tc>
+        <w:tc>
+          <w:tcPr>
+            <w:tcW w:w="1321" w:type="dxa"/>
+          </w:tcPr>
+          <w:p>
+            <w:r>
+              <w:t>28-05-2026</w:t>
+            </w:r>
+          </w:p>
+        </w:tc>
+      </w:tr>
+      <w:tr>
+        <w:tc>
+          <w:tcPr>
+            <w:tcW w:w="1823" w:type="dxa"/>
+          </w:tcPr>
+          <w:p>
+            <w:pPr>
+              <w:rPr>
+                <w:b/>
+                <w:bCs/>
+              </w:rPr>
+            </w:pPr>
+          </w:p>
+        </w:tc>
+        <w:tc>
+          <w:tcPr>
+            <w:tcW w:w="2579" w:type="dxa"/>
+          </w:tcPr>
+          <w:p>
+            <w:r>
+              <w:t>Er is aandacht voor theatrale of visuele impact.</w:t>
+            </w:r>
+          </w:p>
+        </w:tc>
+        <w:tc>
+          <w:tcPr>
+            <w:tcW w:w="783" w:type="dxa"/>
+          </w:tcPr>
+          <w:p>
+            <w:pPr>
+              <w:jc w:val="center"/>
+              <w:rPr>
+                <w:rFonts w:ascii="Segoe UI Symbol" w:hAnsi="Segoe UI Symbol" w:cs="Segoe UI Symbol"/>
+                <w:b/>
+                <w:bCs/>
+                <w:color w:val="000000"/>
+                <w:sz w:val="27"/>
+                <w:szCs w:val="27"/>
+              </w:rPr>
+            </w:pPr>
+            <w:r>
+              <w:rPr>
+                <w:rFonts w:ascii="Segoe UI Symbol" w:hAnsi="Segoe UI Symbol" w:cs="Segoe UI Symbol"/>
+                <w:b/>
+                <w:bCs/>
+                <w:color w:val="000000"/>
+                <w:sz w:val="27"/>
+                <w:szCs w:val="27"/>
+              </w:rPr>
+              <w:t>✓</w:t>
+            </w:r>
+          </w:p>
+        </w:tc>
+        <w:tc>
+          <w:tcPr>
+            <w:tcW w:w="2837" w:type="dxa"/>
+          </w:tcPr>
+          <w:p>
+            <w:pPr>
+              <w:rPr>
+                <w:color w:val="000000"/>
+              </w:rPr>
+            </w:pPr>
+          </w:p>
+        </w:tc>
+        <w:tc>
+          <w:tcPr>
+            <w:tcW w:w="1321" w:type="dxa"/>
+          </w:tcPr>
+          <w:p>
+            <w:r>
+              <w:t>28-05-2026</w:t>
+            </w:r>
+          </w:p>
+        </w:tc>
+      </w:tr>
+      <w:tr>
+        <w:tc>
+          <w:tcPr>
+            <w:tcW w:w="1823" w:type="dxa"/>
+          </w:tcPr>
+          <w:p>
+            <w:pPr>
+              <w:rPr>
+                <w:b/>
+                <w:bCs/>
+              </w:rPr>
+            </w:pPr>
+            <w:r>
+              <w:rPr>
+                <w:b/>
+                <w:bCs/>
+              </w:rPr>
+              <w:t>Reflectie &amp; onderbouwing</w:t>
+            </w:r>
+          </w:p>
+        </w:tc>
+        <w:tc>
+          <w:tcPr>
+            <w:tcW w:w="2579" w:type="dxa"/>
+          </w:tcPr>
+          <w:p>
+            <w:r>
+              <w:t>Keuzes zijn inhoudelijk onderbouwd (visueel én functioneel).</w:t>
+            </w:r>
+          </w:p>
+        </w:tc>
+        <w:tc>
+          <w:tcPr>
+            <w:tcW w:w="783" w:type="dxa"/>
+          </w:tcPr>
+          <w:p>
+            <w:pPr>
+              <w:jc w:val="center"/>
+              <w:rPr>
+                <w:rFonts w:ascii="Segoe UI Symbol" w:hAnsi="Segoe UI Symbol" w:cs="Segoe UI Symbol"/>
+                <w:b/>
+                <w:bCs/>
+                <w:color w:val="000000"/>
+                <w:sz w:val="27"/>
+                <w:szCs w:val="27"/>
+              </w:rPr>
+            </w:pPr>
+            <w:r>
+              <w:rPr>
+                <w:rFonts w:ascii="Segoe UI Symbol" w:hAnsi="Segoe UI Symbol" w:cs="Segoe UI Symbol"/>
+                <w:b/>
+                <w:bCs/>
+                <w:color w:val="000000"/>
+                <w:sz w:val="27"/>
+                <w:szCs w:val="27"/>
+              </w:rPr>
+              <w:t>✓</w:t>
+            </w:r>
+          </w:p>
+        </w:tc>
+        <w:tc>
+          <w:tcPr>
+            <w:tcW w:w="2837" w:type="dxa"/>
+          </w:tcPr>
+          <w:p>
+            <w:pPr>
+              <w:rPr>
+                <w:color w:val="000000"/>
+              </w:rPr>
+            </w:pPr>
+          </w:p>
+        </w:tc>
+        <w:tc>
+          <w:tcPr>
+            <w:tcW w:w="1321" w:type="dxa"/>
+          </w:tcPr>
+          <w:p>
+            <w:r>
+              <w:t>28-05-2026</w:t>
+            </w:r>
+          </w:p>
+        </w:tc>
+      </w:tr>
+      <w:tr>
+        <w:tc>
+          <w:tcPr>
+            <w:tcW w:w="1823" w:type="dxa"/>
+          </w:tcPr>
           <w:p/>
+        </w:tc>
+        <w:tc>
+          <w:tcPr>
+            <w:tcW w:w="2579" w:type="dxa"/>
+          </w:tcPr>
+          <w:p>
+            <w:r>
+              <w:t>De student reflecteert op het proces, feedback en leerpunten.</w:t>
+            </w:r>
+          </w:p>
+        </w:tc>
+        <w:tc>
+          <w:tcPr>
+            <w:tcW w:w="783" w:type="dxa"/>
+          </w:tcPr>
+          <w:p>
+            <w:pPr>
+              <w:jc w:val="center"/>
+              <w:rPr>
+                <w:rFonts w:ascii="Segoe UI Symbol" w:hAnsi="Segoe UI Symbol" w:cs="Segoe UI Symbol"/>
+                <w:b/>
+                <w:bCs/>
+                <w:color w:val="000000"/>
+                <w:sz w:val="27"/>
+                <w:szCs w:val="27"/>
+              </w:rPr>
+            </w:pPr>
+            <w:r>
+              <w:rPr>
+                <w:rFonts w:ascii="Segoe UI Symbol" w:hAnsi="Segoe UI Symbol" w:cs="Segoe UI Symbol"/>
+                <w:b/>
+                <w:bCs/>
+                <w:color w:val="000000"/>
+                <w:sz w:val="27"/>
+                <w:szCs w:val="27"/>
+              </w:rPr>
+              <w:t>✓</w:t>
+            </w:r>
+          </w:p>
+        </w:tc>
+        <w:tc>
+          <w:tcPr>
+            <w:tcW w:w="2837" w:type="dxa"/>
+          </w:tcPr>
+          <w:p>
+            <w:pPr>
+              <w:rPr>
+                <w:color w:val="000000"/>
+              </w:rPr>
+            </w:pPr>
+          </w:p>
+        </w:tc>
+        <w:tc>
+          <w:tcPr>
+            <w:tcW w:w="1321" w:type="dxa"/>
+          </w:tcPr>
+          <w:p>
+            <w:r>
+              <w:t>28-05-2026</w:t>
+            </w:r>
+          </w:p>
+        </w:tc>
+      </w:tr>
+      <w:tr>
+        <w:tc>
+          <w:tcPr>
+            <w:tcW w:w="1823" w:type="dxa"/>
+          </w:tcPr>
+          <w:p/>
+        </w:tc>
+        <w:tc>
+          <w:tcPr>
+            <w:tcW w:w="2579" w:type="dxa"/>
+          </w:tcPr>
+          <w:p>
+            <w:r>
+              <w:t>Verwerkte feedback is aantoonbaar zichtbaar in het eindproduct.</w:t>
+            </w:r>
+          </w:p>
+        </w:tc>
+        <w:tc>
+          <w:tcPr>
+            <w:tcW w:w="783" w:type="dxa"/>
+          </w:tcPr>
+          <w:p>
+            <w:pPr>
+              <w:jc w:val="center"/>
+              <w:rPr>
+                <w:rFonts w:ascii="Segoe UI Symbol" w:hAnsi="Segoe UI Symbol" w:cs="Segoe UI Symbol"/>
+                <w:b/>
+                <w:bCs/>
+                <w:color w:val="000000"/>
+                <w:sz w:val="27"/>
+                <w:szCs w:val="27"/>
+              </w:rPr>
+            </w:pPr>
+            <w:r>
+              <w:rPr>
+                <w:rFonts w:ascii="Segoe UI Symbol" w:hAnsi="Segoe UI Symbol" w:cs="Segoe UI Symbol"/>
+                <w:b/>
+                <w:bCs/>
+                <w:color w:val="000000"/>
+                <w:sz w:val="27"/>
+                <w:szCs w:val="27"/>
+              </w:rPr>
+              <w:t>✓</w:t>
+            </w:r>
+          </w:p>
+        </w:tc>
+        <w:tc>
+          <w:tcPr>
+            <w:tcW w:w="2837" w:type="dxa"/>
+          </w:tcPr>
+          <w:p>
+            <w:pPr>
+              <w:rPr>
+                <w:color w:val="000000"/>
+              </w:rPr>
+            </w:pPr>
+          </w:p>
+        </w:tc>
+        <w:tc>
+          <w:tcPr>
+            <w:tcW w:w="1321" w:type="dxa"/>
+          </w:tcPr>
+          <w:p>
+            <w:r>
+              <w:t>28-05-2026</w:t>
+            </w:r>
+          </w:p>
+          <w:p>
+            <w:pPr>
+              <w:jc w:val="center"/>
+            </w:pPr>
+          </w:p>
         </w:tc>
       </w:tr>
     </w:tbl>
@@ -14489,10 +14653,7 @@
               </w:rPr>
             </w:pPr>
             <w:r>
-              <w:t>Leuke trailer knop</w:t>
-            </w:r>
-            <w:r>
-              <w:t>.</w:t>
+              <w:t>Leuke trailer knop.</w:t>
             </w:r>
           </w:p>
         </w:tc>
@@ -14567,10 +14728,7 @@
               </w:rPr>
             </w:pPr>
             <w:r>
-              <w:t>App schaalt niet op desktop</w:t>
-            </w:r>
-            <w:r>
-              <w:t>.</w:t>
+              <w:t>App schaalt niet op desktop.</w:t>
             </w:r>
           </w:p>
         </w:tc>
@@ -14645,10 +14803,7 @@
               </w:rPr>
             </w:pPr>
             <w:r>
-              <w:t>Leuke interacties</w:t>
-            </w:r>
-            <w:r>
-              <w:t>.</w:t>
+              <w:t>Leuke interacties.</w:t>
             </w:r>
           </w:p>
         </w:tc>
@@ -14961,10 +15116,7 @@
               </w:rPr>
             </w:pPr>
             <w:r>
-              <w:t>Voeg nog wat technieken toe</w:t>
-            </w:r>
-            <w:r>
-              <w:t>.</w:t>
+              <w:t>Voeg nog wat technieken toe.</w:t>
             </w:r>
           </w:p>
         </w:tc>
@@ -15039,10 +15191,7 @@
               </w:rPr>
             </w:pPr>
             <w:r>
-              <w:t>PowerPoint in Disney-stijl</w:t>
-            </w:r>
-            <w:r>
-              <w:t>.</w:t>
+              <w:t>PowerPoint in Disney-stijl.</w:t>
             </w:r>
           </w:p>
         </w:tc>
@@ -16428,13 +16577,7 @@
               <w:rPr>
                 <w:color w:val="000000"/>
               </w:rPr>
-              <w:t>Werkende flow met meerdere pagina’s en duidelijke navigatie</w:t>
-            </w:r>
-            <w:r>
-              <w:rPr>
-                <w:color w:val="000000"/>
-              </w:rPr>
-              <w:t>.</w:t>
+              <w:t>Werkende flow met meerdere pagina’s en duidelijke navigatie.</w:t>
             </w:r>
           </w:p>
         </w:tc>
@@ -16521,43 +16664,7 @@
               <w:rPr>
                 <w:color w:val="000000"/>
               </w:rPr>
-              <w:t>Pagina</w:t>
-            </w:r>
-            <w:r>
-              <w:rPr>
-                <w:color w:val="000000"/>
-              </w:rPr>
-              <w:t>’</w:t>
-            </w:r>
-            <w:r>
-              <w:rPr>
-                <w:color w:val="000000"/>
-              </w:rPr>
-              <w:t xml:space="preserve">s </w:t>
-            </w:r>
-            <w:r>
-              <w:rPr>
-                <w:color w:val="000000"/>
-              </w:rPr>
-              <w:t xml:space="preserve">werken op desktop en mobiel, maar </w:t>
-            </w:r>
-            <w:r>
-              <w:rPr>
-                <w:color w:val="000000"/>
-              </w:rPr>
-              <w:t xml:space="preserve">houden </w:t>
-            </w:r>
-            <w:r>
-              <w:rPr>
-                <w:color w:val="000000"/>
-              </w:rPr>
-              <w:t xml:space="preserve">qua ontwerp </w:t>
-            </w:r>
-            <w:r>
-              <w:rPr>
-                <w:color w:val="000000"/>
-              </w:rPr>
-              <w:t>alleen mobiel aan.</w:t>
+              <w:t>Pagina’s werken op desktop en mobiel, maar houden qua ontwerp alleen mobiel aan.</w:t>
             </w:r>
           </w:p>
         </w:tc>
@@ -16901,13 +17008,7 @@
               <w:rPr>
                 <w:color w:val="000000"/>
               </w:rPr>
-              <w:t>Zelfde thema is doorgevoerd in de slides</w:t>
-            </w:r>
-            <w:r>
-              <w:rPr>
-                <w:color w:val="000000"/>
-              </w:rPr>
-              <w:t>.</w:t>
+              <w:t>Zelfde thema is doorgevoerd in de slides.</w:t>
             </w:r>
           </w:p>
         </w:tc>
@@ -16997,13 +17098,7 @@
               <w:rPr>
                 <w:color w:val="000000"/>
               </w:rPr>
-              <w:t>Er is een live demo aanwezig</w:t>
-            </w:r>
-            <w:r>
-              <w:rPr>
-                <w:color w:val="000000"/>
-              </w:rPr>
-              <w:t>.</w:t>
+              <w:t>Er is een live demo aanwezig.</w:t>
             </w:r>
           </w:p>
         </w:tc>
@@ -17332,13 +17427,7 @@
               <w:rPr>
                 <w:color w:val="000000"/>
               </w:rPr>
-              <w:t>Onderdelen zijn verwerkt in prototype</w:t>
-            </w:r>
-            <w:r>
-              <w:rPr>
-                <w:color w:val="000000"/>
-              </w:rPr>
-              <w:t>.</w:t>
+              <w:t>Onderdelen zijn verwerkt in prototype.</w:t>
             </w:r>
           </w:p>
         </w:tc>
@@ -17792,7 +17881,7 @@
       <w:r>
         <w:fldChar w:fldCharType="separate"/>
       </w:r>
-      <w:hyperlink w:anchor="_Toc228741984" w:history="1">
+      <w:hyperlink w:anchor="_Toc230858660" w:history="1">
         <w:r>
           <w:rPr>
             <w:rStyle w:val="Hyperlink"/>
@@ -17819,7 +17908,7 @@
             <w:noProof/>
             <w:webHidden/>
           </w:rPr>
-          <w:instrText xml:space="preserve"> PAGEREF _Toc228741984 \h </w:instrText>
+          <w:instrText xml:space="preserve"> PAGEREF _Toc230858660 \h </w:instrText>
         </w:r>
         <w:r>
           <w:rPr>
@@ -17864,7 +17953,7 @@
           <w14:ligatures w14:val="standardContextual"/>
         </w:rPr>
       </w:pPr>
-      <w:hyperlink w:anchor="_Toc228741985" w:history="1">
+      <w:hyperlink w:anchor="_Toc230858661" w:history="1">
         <w:r>
           <w:rPr>
             <w:rStyle w:val="Hyperlink"/>
@@ -17891,7 +17980,7 @@
             <w:noProof/>
             <w:webHidden/>
           </w:rPr>
-          <w:instrText xml:space="preserve"> PAGEREF _Toc228741985 \h </w:instrText>
+          <w:instrText xml:space="preserve"> PAGEREF _Toc230858661 \h </w:instrText>
         </w:r>
         <w:r>
           <w:rPr>
@@ -17936,7 +18025,7 @@
           <w14:ligatures w14:val="standardContextual"/>
         </w:rPr>
       </w:pPr>
-      <w:hyperlink w:anchor="_Toc228741986" w:history="1">
+      <w:hyperlink w:anchor="_Toc230858662" w:history="1">
         <w:r>
           <w:rPr>
             <w:rStyle w:val="Hyperlink"/>
@@ -17963,7 +18052,7 @@
             <w:noProof/>
             <w:webHidden/>
           </w:rPr>
-          <w:instrText xml:space="preserve"> PAGEREF _Toc228741986 \h </w:instrText>
+          <w:instrText xml:space="preserve"> PAGEREF _Toc230858662 \h </w:instrText>
         </w:r>
         <w:r>
           <w:rPr>
@@ -18008,7 +18097,7 @@
           <w14:ligatures w14:val="standardContextual"/>
         </w:rPr>
       </w:pPr>
-      <w:hyperlink w:anchor="_Toc228741987" w:history="1">
+      <w:hyperlink w:anchor="_Toc230858663" w:history="1">
         <w:r>
           <w:rPr>
             <w:rStyle w:val="Hyperlink"/>
@@ -18035,7 +18124,7 @@
             <w:noProof/>
             <w:webHidden/>
           </w:rPr>
-          <w:instrText xml:space="preserve"> PAGEREF _Toc228741987 \h </w:instrText>
+          <w:instrText xml:space="preserve"> PAGEREF _Toc230858663 \h </w:instrText>
         </w:r>
         <w:r>
           <w:rPr>
@@ -18080,7 +18169,7 @@
           <w14:ligatures w14:val="standardContextual"/>
         </w:rPr>
       </w:pPr>
-      <w:hyperlink w:anchor="_Toc228741988" w:history="1">
+      <w:hyperlink w:anchor="_Toc230858664" w:history="1">
         <w:r>
           <w:rPr>
             <w:rStyle w:val="Hyperlink"/>
@@ -18107,7 +18196,7 @@
             <w:noProof/>
             <w:webHidden/>
           </w:rPr>
-          <w:instrText xml:space="preserve"> PAGEREF _Toc228741988 \h </w:instrText>
+          <w:instrText xml:space="preserve"> PAGEREF _Toc230858664 \h </w:instrText>
         </w:r>
         <w:r>
           <w:rPr>
@@ -18200,10 +18289,11 @@
           <w:rPr>
             <w:rStyle w:val="Hyperlink"/>
           </w:rPr>
-          <w:t>https://www.meshy.ai/tags/disney</w:t>
+          <w:t>https://sketchfab.com</w:t>
         </w:r>
       </w:hyperlink>
     </w:p>
+    <w:p/>
     <w:p/>
     <w:sectPr>
       <w:footerReference w:type="even" r:id="rId18"/>
@@ -27240,15 +27330,6 @@
 </file>
 
 <file path=customXml/item1.xml><?xml version="1.0" encoding="utf-8"?>
-<?mso-contentType ?>
-<FormTemplates xmlns="http://schemas.microsoft.com/sharepoint/v3/contenttype/forms">
-  <Display>DocumentLibraryForm</Display>
-  <Edit>DocumentLibraryForm</Edit>
-  <New>DocumentLibraryForm</New>
-</FormTemplates>
-</file>
-
-<file path=customXml/item2.xml><?xml version="1.0" encoding="utf-8"?>
 <ct:contentTypeSchema xmlns:ct="http://schemas.microsoft.com/office/2006/metadata/contentType" xmlns:ma="http://schemas.microsoft.com/office/2006/metadata/properties/metaAttributes" ct:_="" ma:_="" ma:contentTypeName="Document" ma:contentTypeID="0x010100D0BB77D65DB97745B835076E0EF123F1" ma:contentTypeVersion="3" ma:contentTypeDescription="Een nieuw document maken." ma:contentTypeScope="" ma:versionID="f5e20feff643aae03d305ed3501b9de7">
   <xsd:schema xmlns:xsd="http://www.w3.org/2001/XMLSchema" xmlns:xs="http://www.w3.org/2001/XMLSchema" xmlns:p="http://schemas.microsoft.com/office/2006/metadata/properties" xmlns:ns2="9c4fc8d7-28d9-45de-9015-6a9b5ed128f7" targetNamespace="http://schemas.microsoft.com/office/2006/metadata/properties" ma:root="true" ma:fieldsID="e4c8b2eb8dfeb271dd91865265868f5e" ns2:_="">
     <xsd:import namespace="9c4fc8d7-28d9-45de-9015-6a9b5ed128f7"/>
@@ -27386,13 +27467,16 @@
 </ct:contentTypeSchema>
 </file>
 
-<file path=customXml/item3.xml><?xml version="1.0" encoding="utf-8"?>
-<p:properties xmlns:p="http://schemas.microsoft.com/office/2006/metadata/properties" xmlns:xsi="http://www.w3.org/2001/XMLSchema-instance" xmlns:pc="http://schemas.microsoft.com/office/infopath/2007/PartnerControls">
-  <documentManagement/>
-</p:properties>
+<file path=customXml/item2.xml><?xml version="1.0" encoding="utf-8"?>
+<?mso-contentType ?>
+<FormTemplates xmlns="http://schemas.microsoft.com/sharepoint/v3/contenttype/forms">
+  <Display>DocumentLibraryForm</Display>
+  <Edit>DocumentLibraryForm</Edit>
+  <New>DocumentLibraryForm</New>
+</FormTemplates>
 </file>
 
-<file path=customXml/item4.xml><?xml version="1.0" encoding="utf-8"?>
+<file path=customXml/item3.xml><?xml version="1.0" encoding="utf-8"?>
 <b:Sources xmlns:b="http://schemas.openxmlformats.org/officeDocument/2006/bibliography" xmlns="http://schemas.openxmlformats.org/officeDocument/2006/bibliography" SelectedStyle="/APASixthEditionOfficeOnline.xsl" StyleName="APA" Version="6">
   <b:Source>
     <b:Tag>Vin22</b:Tag>
@@ -27487,15 +27571,13 @@
 </b:Sources>
 </file>
 
-<file path=customXml/itemProps1.xml><?xml version="1.0" encoding="utf-8"?>
-<ds:datastoreItem xmlns:ds="http://schemas.openxmlformats.org/officeDocument/2006/customXml" ds:itemID="{82D9BFC6-F333-43E5-9205-C8904E48ED3D}">
-  <ds:schemaRefs>
-    <ds:schemaRef ds:uri="http://schemas.microsoft.com/sharepoint/v3/contenttype/forms"/>
-  </ds:schemaRefs>
-</ds:datastoreItem>
+<file path=customXml/item4.xml><?xml version="1.0" encoding="utf-8"?>
+<p:properties xmlns:p="http://schemas.microsoft.com/office/2006/metadata/properties" xmlns:xsi="http://www.w3.org/2001/XMLSchema-instance" xmlns:pc="http://schemas.microsoft.com/office/infopath/2007/PartnerControls">
+  <documentManagement/>
+</p:properties>
 </file>
 
-<file path=customXml/itemProps2.xml><?xml version="1.0" encoding="utf-8"?>
+<file path=customXml/itemProps1.xml><?xml version="1.0" encoding="utf-8"?>
 <ds:datastoreItem xmlns:ds="http://schemas.openxmlformats.org/officeDocument/2006/customXml" ds:itemID="{BCB0D87B-C877-4F66-B5F5-352EF415DDF1}">
   <ds:schemaRefs>
     <ds:schemaRef ds:uri="http://schemas.microsoft.com/office/2006/metadata/contentType"/>
@@ -27513,19 +27595,27 @@
 </ds:datastoreItem>
 </file>
 
+<file path=customXml/itemProps2.xml><?xml version="1.0" encoding="utf-8"?>
+<ds:datastoreItem xmlns:ds="http://schemas.openxmlformats.org/officeDocument/2006/customXml" ds:itemID="{82D9BFC6-F333-43E5-9205-C8904E48ED3D}">
+  <ds:schemaRefs>
+    <ds:schemaRef ds:uri="http://schemas.microsoft.com/sharepoint/v3/contenttype/forms"/>
+  </ds:schemaRefs>
+</ds:datastoreItem>
+</file>
+
 <file path=customXml/itemProps3.xml><?xml version="1.0" encoding="utf-8"?>
-<ds:datastoreItem xmlns:ds="http://schemas.openxmlformats.org/officeDocument/2006/customXml" ds:itemID="{F6733805-3435-4F94-A33F-6225E5CBCD31}">
+<ds:datastoreItem xmlns:ds="http://schemas.openxmlformats.org/officeDocument/2006/customXml" ds:itemID="{8C6B7691-150B-3140-AF98-66DE9E0B84E1}">
   <ds:schemaRefs>
-    <ds:schemaRef ds:uri="http://schemas.microsoft.com/office/2006/metadata/properties"/>
-    <ds:schemaRef ds:uri="http://schemas.microsoft.com/office/infopath/2007/PartnerControls"/>
+    <ds:schemaRef ds:uri="http://schemas.openxmlformats.org/officeDocument/2006/bibliography"/>
   </ds:schemaRefs>
 </ds:datastoreItem>
 </file>
 
 <file path=customXml/itemProps4.xml><?xml version="1.0" encoding="utf-8"?>
-<ds:datastoreItem xmlns:ds="http://schemas.openxmlformats.org/officeDocument/2006/customXml" ds:itemID="{8C6B7691-150B-3140-AF98-66DE9E0B84E1}">
+<ds:datastoreItem xmlns:ds="http://schemas.openxmlformats.org/officeDocument/2006/customXml" ds:itemID="{F6733805-3435-4F94-A33F-6225E5CBCD31}">
   <ds:schemaRefs>
-    <ds:schemaRef ds:uri="http://schemas.openxmlformats.org/officeDocument/2006/bibliography"/>
+    <ds:schemaRef ds:uri="http://schemas.microsoft.com/office/2006/metadata/properties"/>
+    <ds:schemaRef ds:uri="http://schemas.microsoft.com/office/infopath/2007/PartnerControls"/>
   </ds:schemaRefs>
 </ds:datastoreItem>
 </file>

</xml_diff>

<commit_message>
Peer-checklist bijgewerkt obv desktop aanpassingen
</commit_message>
<xml_diff>
--- a/Documentatie/Disney Dimensions.docx
+++ b/Documentatie/Disney Dimensions.docx
@@ -8218,7 +8218,7 @@
           <w:noProof/>
         </w:rPr>
         <w:drawing>
-          <wp:inline distT="0" distB="0" distL="0" distR="0" wp14:anchorId="49A6505F" wp14:editId="23F3496B">
+          <wp:inline distT="0" distB="0" distL="0" distR="0" wp14:anchorId="49A6505F" wp14:editId="34933D49">
             <wp:extent cx="5731510" cy="4079240"/>
             <wp:effectExtent l="0" t="0" r="0" b="0"/>
             <wp:docPr id="69312833" name="Picture 2"/>
@@ -12610,15 +12610,10 @@
               </w:rPr>
             </w:pPr>
             <w:r>
-              <w:t xml:space="preserve">Werkt op zowel mobiel als desktop, </w:t>
-            </w:r>
-            <w:proofErr w:type="spellStart"/>
-            <w:r>
-              <w:t>layout</w:t>
-            </w:r>
-            <w:proofErr w:type="spellEnd"/>
-            <w:r>
-              <w:t xml:space="preserve"> blijft wel mobiel, ook op desktop.</w:t>
+              <w:t>Werkt op zowel mobiel als desktop</w:t>
+            </w:r>
+            <w:r>
+              <w:t>.</w:t>
             </w:r>
           </w:p>
         </w:tc>
@@ -12700,13 +12695,7 @@
               <w:rPr>
                 <w:color w:val="000000"/>
               </w:rPr>
-              <w:t>Leuke micro-interacties</w:t>
-            </w:r>
-            <w:r>
-              <w:rPr>
-                <w:color w:val="000000"/>
-              </w:rPr>
-              <w:t>.</w:t>
+              <w:t>Leuke micro-interacties.</w:t>
             </w:r>
           </w:p>
         </w:tc>
@@ -12966,13 +12955,7 @@
               <w:rPr>
                 <w:color w:val="000000"/>
               </w:rPr>
-              <w:t>Presentatie sluit goed aan bij de stijl van de app</w:t>
-            </w:r>
-            <w:r>
-              <w:rPr>
-                <w:color w:val="000000"/>
-              </w:rPr>
-              <w:t>.</w:t>
+              <w:t>Presentatie sluit goed aan bij de stijl van de app.</w:t>
             </w:r>
           </w:p>
         </w:tc>
@@ -13062,13 +13045,7 @@
               <w:rPr>
                 <w:color w:val="000000"/>
               </w:rPr>
-              <w:t>De live demo/ervaar het zelf is een leuke toevoeging</w:t>
-            </w:r>
-            <w:r>
-              <w:rPr>
-                <w:color w:val="000000"/>
-              </w:rPr>
-              <w:t>.</w:t>
+              <w:t>De live demo/ervaar het zelf is een leuke toevoeging.</w:t>
             </w:r>
           </w:p>
         </w:tc>
@@ -14727,9 +14704,6 @@
                 <w:color w:val="000000"/>
               </w:rPr>
             </w:pPr>
-            <w:r>
-              <w:t>App schaalt niet op desktop.</w:t>
-            </w:r>
           </w:p>
         </w:tc>
         <w:tc>
@@ -16664,7 +16638,13 @@
               <w:rPr>
                 <w:color w:val="000000"/>
               </w:rPr>
-              <w:t>Pagina’s werken op desktop en mobiel, maar houden qua ontwerp alleen mobiel aan.</w:t>
+              <w:t>Pagina’s werken op desktop en mobiel</w:t>
+            </w:r>
+            <w:r>
+              <w:rPr>
+                <w:color w:val="000000"/>
+              </w:rPr>
+              <w:t>.</w:t>
             </w:r>
           </w:p>
         </w:tc>
@@ -27330,6 +27310,15 @@
 </file>
 
 <file path=customXml/item1.xml><?xml version="1.0" encoding="utf-8"?>
+<?mso-contentType ?>
+<FormTemplates xmlns="http://schemas.microsoft.com/sharepoint/v3/contenttype/forms">
+  <Display>DocumentLibraryForm</Display>
+  <Edit>DocumentLibraryForm</Edit>
+  <New>DocumentLibraryForm</New>
+</FormTemplates>
+</file>
+
+<file path=customXml/item2.xml><?xml version="1.0" encoding="utf-8"?>
 <ct:contentTypeSchema xmlns:ct="http://schemas.microsoft.com/office/2006/metadata/contentType" xmlns:ma="http://schemas.microsoft.com/office/2006/metadata/properties/metaAttributes" ct:_="" ma:_="" ma:contentTypeName="Document" ma:contentTypeID="0x010100D0BB77D65DB97745B835076E0EF123F1" ma:contentTypeVersion="3" ma:contentTypeDescription="Een nieuw document maken." ma:contentTypeScope="" ma:versionID="f5e20feff643aae03d305ed3501b9de7">
   <xsd:schema xmlns:xsd="http://www.w3.org/2001/XMLSchema" xmlns:xs="http://www.w3.org/2001/XMLSchema" xmlns:p="http://schemas.microsoft.com/office/2006/metadata/properties" xmlns:ns2="9c4fc8d7-28d9-45de-9015-6a9b5ed128f7" targetNamespace="http://schemas.microsoft.com/office/2006/metadata/properties" ma:root="true" ma:fieldsID="e4c8b2eb8dfeb271dd91865265868f5e" ns2:_="">
     <xsd:import namespace="9c4fc8d7-28d9-45de-9015-6a9b5ed128f7"/>
@@ -27467,16 +27456,13 @@
 </ct:contentTypeSchema>
 </file>
 
-<file path=customXml/item2.xml><?xml version="1.0" encoding="utf-8"?>
-<?mso-contentType ?>
-<FormTemplates xmlns="http://schemas.microsoft.com/sharepoint/v3/contenttype/forms">
-  <Display>DocumentLibraryForm</Display>
-  <Edit>DocumentLibraryForm</Edit>
-  <New>DocumentLibraryForm</New>
-</FormTemplates>
+<file path=customXml/item3.xml><?xml version="1.0" encoding="utf-8"?>
+<p:properties xmlns:p="http://schemas.microsoft.com/office/2006/metadata/properties" xmlns:xsi="http://www.w3.org/2001/XMLSchema-instance" xmlns:pc="http://schemas.microsoft.com/office/infopath/2007/PartnerControls">
+  <documentManagement/>
+</p:properties>
 </file>
 
-<file path=customXml/item3.xml><?xml version="1.0" encoding="utf-8"?>
+<file path=customXml/item4.xml><?xml version="1.0" encoding="utf-8"?>
 <b:Sources xmlns:b="http://schemas.openxmlformats.org/officeDocument/2006/bibliography" xmlns="http://schemas.openxmlformats.org/officeDocument/2006/bibliography" SelectedStyle="/APASixthEditionOfficeOnline.xsl" StyleName="APA" Version="6">
   <b:Source>
     <b:Tag>Vin22</b:Tag>
@@ -27571,13 +27557,15 @@
 </b:Sources>
 </file>
 
-<file path=customXml/item4.xml><?xml version="1.0" encoding="utf-8"?>
-<p:properties xmlns:p="http://schemas.microsoft.com/office/2006/metadata/properties" xmlns:xsi="http://www.w3.org/2001/XMLSchema-instance" xmlns:pc="http://schemas.microsoft.com/office/infopath/2007/PartnerControls">
-  <documentManagement/>
-</p:properties>
+<file path=customXml/itemProps1.xml><?xml version="1.0" encoding="utf-8"?>
+<ds:datastoreItem xmlns:ds="http://schemas.openxmlformats.org/officeDocument/2006/customXml" ds:itemID="{82D9BFC6-F333-43E5-9205-C8904E48ED3D}">
+  <ds:schemaRefs>
+    <ds:schemaRef ds:uri="http://schemas.microsoft.com/sharepoint/v3/contenttype/forms"/>
+  </ds:schemaRefs>
+</ds:datastoreItem>
 </file>
 
-<file path=customXml/itemProps1.xml><?xml version="1.0" encoding="utf-8"?>
+<file path=customXml/itemProps2.xml><?xml version="1.0" encoding="utf-8"?>
 <ds:datastoreItem xmlns:ds="http://schemas.openxmlformats.org/officeDocument/2006/customXml" ds:itemID="{BCB0D87B-C877-4F66-B5F5-352EF415DDF1}">
   <ds:schemaRefs>
     <ds:schemaRef ds:uri="http://schemas.microsoft.com/office/2006/metadata/contentType"/>
@@ -27595,27 +27583,19 @@
 </ds:datastoreItem>
 </file>
 
-<file path=customXml/itemProps2.xml><?xml version="1.0" encoding="utf-8"?>
-<ds:datastoreItem xmlns:ds="http://schemas.openxmlformats.org/officeDocument/2006/customXml" ds:itemID="{82D9BFC6-F333-43E5-9205-C8904E48ED3D}">
+<file path=customXml/itemProps3.xml><?xml version="1.0" encoding="utf-8"?>
+<ds:datastoreItem xmlns:ds="http://schemas.openxmlformats.org/officeDocument/2006/customXml" ds:itemID="{F6733805-3435-4F94-A33F-6225E5CBCD31}">
   <ds:schemaRefs>
-    <ds:schemaRef ds:uri="http://schemas.microsoft.com/sharepoint/v3/contenttype/forms"/>
-  </ds:schemaRefs>
-</ds:datastoreItem>
-</file>
-
-<file path=customXml/itemProps3.xml><?xml version="1.0" encoding="utf-8"?>
-<ds:datastoreItem xmlns:ds="http://schemas.openxmlformats.org/officeDocument/2006/customXml" ds:itemID="{8C6B7691-150B-3140-AF98-66DE9E0B84E1}">
-  <ds:schemaRefs>
-    <ds:schemaRef ds:uri="http://schemas.openxmlformats.org/officeDocument/2006/bibliography"/>
+    <ds:schemaRef ds:uri="http://schemas.microsoft.com/office/2006/metadata/properties"/>
+    <ds:schemaRef ds:uri="http://schemas.microsoft.com/office/infopath/2007/PartnerControls"/>
   </ds:schemaRefs>
 </ds:datastoreItem>
 </file>
 
 <file path=customXml/itemProps4.xml><?xml version="1.0" encoding="utf-8"?>
-<ds:datastoreItem xmlns:ds="http://schemas.openxmlformats.org/officeDocument/2006/customXml" ds:itemID="{F6733805-3435-4F94-A33F-6225E5CBCD31}">
+<ds:datastoreItem xmlns:ds="http://schemas.openxmlformats.org/officeDocument/2006/customXml" ds:itemID="{8C6B7691-150B-3140-AF98-66DE9E0B84E1}">
   <ds:schemaRefs>
-    <ds:schemaRef ds:uri="http://schemas.microsoft.com/office/2006/metadata/properties"/>
-    <ds:schemaRef ds:uri="http://schemas.microsoft.com/office/infopath/2007/PartnerControls"/>
+    <ds:schemaRef ds:uri="http://schemas.openxmlformats.org/officeDocument/2006/bibliography"/>
   </ds:schemaRefs>
 </ds:datastoreItem>
 </file>

</xml_diff>

<commit_message>
Documentatie puntjes op de i
</commit_message>
<xml_diff>
--- a/Documentatie/Disney Dimensions.docx
+++ b/Documentatie/Disney Dimensions.docx
@@ -171,7 +171,7 @@
           <w:r>
             <w:fldChar w:fldCharType="separate"/>
           </w:r>
-          <w:hyperlink w:anchor="_Toc229219123" w:history="1">
+          <w:hyperlink w:anchor="_Toc231375149" w:history="1">
             <w:r>
               <w:rPr>
                 <w:rStyle w:val="Hyperlink"/>
@@ -198,7 +198,7 @@
                 <w:noProof/>
                 <w:webHidden/>
               </w:rPr>
-              <w:instrText xml:space="preserve"> PAGEREF _Toc229219123 \h </w:instrText>
+              <w:instrText xml:space="preserve"> PAGEREF _Toc231375149 \h </w:instrText>
             </w:r>
             <w:r>
               <w:rPr>
@@ -243,7 +243,7 @@
               <w14:ligatures w14:val="standardContextual"/>
             </w:rPr>
           </w:pPr>
-          <w:hyperlink w:anchor="_Toc229219124" w:history="1">
+          <w:hyperlink w:anchor="_Toc231375150" w:history="1">
             <w:r>
               <w:rPr>
                 <w:rStyle w:val="Hyperlink"/>
@@ -270,7 +270,7 @@
                 <w:noProof/>
                 <w:webHidden/>
               </w:rPr>
-              <w:instrText xml:space="preserve"> PAGEREF _Toc229219124 \h </w:instrText>
+              <w:instrText xml:space="preserve"> PAGEREF _Toc231375150 \h </w:instrText>
             </w:r>
             <w:r>
               <w:rPr>
@@ -315,7 +315,7 @@
               <w14:ligatures w14:val="standardContextual"/>
             </w:rPr>
           </w:pPr>
-          <w:hyperlink w:anchor="_Toc229219125" w:history="1">
+          <w:hyperlink w:anchor="_Toc231375151" w:history="1">
             <w:r>
               <w:rPr>
                 <w:rStyle w:val="Hyperlink"/>
@@ -342,7 +342,7 @@
                 <w:noProof/>
                 <w:webHidden/>
               </w:rPr>
-              <w:instrText xml:space="preserve"> PAGEREF _Toc229219125 \h </w:instrText>
+              <w:instrText xml:space="preserve"> PAGEREF _Toc231375151 \h </w:instrText>
             </w:r>
             <w:r>
               <w:rPr>
@@ -388,7 +388,7 @@
               <w14:ligatures w14:val="standardContextual"/>
             </w:rPr>
           </w:pPr>
-          <w:hyperlink w:anchor="_Toc229219126" w:history="1">
+          <w:hyperlink w:anchor="_Toc231375152" w:history="1">
             <w:r>
               <w:rPr>
                 <w:rStyle w:val="Hyperlink"/>
@@ -432,7 +432,7 @@
                 <w:noProof/>
                 <w:webHidden/>
               </w:rPr>
-              <w:instrText xml:space="preserve"> PAGEREF _Toc229219126 \h </w:instrText>
+              <w:instrText xml:space="preserve"> PAGEREF _Toc231375152 \h </w:instrText>
             </w:r>
             <w:r>
               <w:rPr>
@@ -478,7 +478,7 @@
               <w14:ligatures w14:val="standardContextual"/>
             </w:rPr>
           </w:pPr>
-          <w:hyperlink w:anchor="_Toc229219127" w:history="1">
+          <w:hyperlink w:anchor="_Toc231375153" w:history="1">
             <w:r>
               <w:rPr>
                 <w:rStyle w:val="Hyperlink"/>
@@ -522,7 +522,7 @@
                 <w:noProof/>
                 <w:webHidden/>
               </w:rPr>
-              <w:instrText xml:space="preserve"> PAGEREF _Toc229219127 \h </w:instrText>
+              <w:instrText xml:space="preserve"> PAGEREF _Toc231375153 \h </w:instrText>
             </w:r>
             <w:r>
               <w:rPr>
@@ -568,7 +568,7 @@
               <w14:ligatures w14:val="standardContextual"/>
             </w:rPr>
           </w:pPr>
-          <w:hyperlink w:anchor="_Toc229219128" w:history="1">
+          <w:hyperlink w:anchor="_Toc231375154" w:history="1">
             <w:r>
               <w:rPr>
                 <w:rStyle w:val="Hyperlink"/>
@@ -612,7 +612,7 @@
                 <w:noProof/>
                 <w:webHidden/>
               </w:rPr>
-              <w:instrText xml:space="preserve"> PAGEREF _Toc229219128 \h </w:instrText>
+              <w:instrText xml:space="preserve"> PAGEREF _Toc231375154 \h </w:instrText>
             </w:r>
             <w:r>
               <w:rPr>
@@ -658,7 +658,7 @@
               <w14:ligatures w14:val="standardContextual"/>
             </w:rPr>
           </w:pPr>
-          <w:hyperlink w:anchor="_Toc229219129" w:history="1">
+          <w:hyperlink w:anchor="_Toc231375155" w:history="1">
             <w:r>
               <w:rPr>
                 <w:rStyle w:val="Hyperlink"/>
@@ -702,7 +702,7 @@
                 <w:noProof/>
                 <w:webHidden/>
               </w:rPr>
-              <w:instrText xml:space="preserve"> PAGEREF _Toc229219129 \h </w:instrText>
+              <w:instrText xml:space="preserve"> PAGEREF _Toc231375155 \h </w:instrText>
             </w:r>
             <w:r>
               <w:rPr>
@@ -748,7 +748,7 @@
               <w14:ligatures w14:val="standardContextual"/>
             </w:rPr>
           </w:pPr>
-          <w:hyperlink w:anchor="_Toc229219130" w:history="1">
+          <w:hyperlink w:anchor="_Toc231375156" w:history="1">
             <w:r>
               <w:rPr>
                 <w:rStyle w:val="Hyperlink"/>
@@ -792,7 +792,7 @@
                 <w:noProof/>
                 <w:webHidden/>
               </w:rPr>
-              <w:instrText xml:space="preserve"> PAGEREF _Toc229219130 \h </w:instrText>
+              <w:instrText xml:space="preserve"> PAGEREF _Toc231375156 \h </w:instrText>
             </w:r>
             <w:r>
               <w:rPr>
@@ -838,7 +838,7 @@
               <w14:ligatures w14:val="standardContextual"/>
             </w:rPr>
           </w:pPr>
-          <w:hyperlink w:anchor="_Toc229219131" w:history="1">
+          <w:hyperlink w:anchor="_Toc231375157" w:history="1">
             <w:r>
               <w:rPr>
                 <w:rStyle w:val="Hyperlink"/>
@@ -882,7 +882,7 @@
                 <w:noProof/>
                 <w:webHidden/>
               </w:rPr>
-              <w:instrText xml:space="preserve"> PAGEREF _Toc229219131 \h </w:instrText>
+              <w:instrText xml:space="preserve"> PAGEREF _Toc231375157 \h </w:instrText>
             </w:r>
             <w:r>
               <w:rPr>
@@ -928,7 +928,7 @@
               <w14:ligatures w14:val="standardContextual"/>
             </w:rPr>
           </w:pPr>
-          <w:hyperlink w:anchor="_Toc229219132" w:history="1">
+          <w:hyperlink w:anchor="_Toc231375158" w:history="1">
             <w:r>
               <w:rPr>
                 <w:rStyle w:val="Hyperlink"/>
@@ -972,7 +972,7 @@
                 <w:noProof/>
                 <w:webHidden/>
               </w:rPr>
-              <w:instrText xml:space="preserve"> PAGEREF _Toc229219132 \h </w:instrText>
+              <w:instrText xml:space="preserve"> PAGEREF _Toc231375158 \h </w:instrText>
             </w:r>
             <w:r>
               <w:rPr>
@@ -1018,7 +1018,7 @@
               <w14:ligatures w14:val="standardContextual"/>
             </w:rPr>
           </w:pPr>
-          <w:hyperlink w:anchor="_Toc229219133" w:history="1">
+          <w:hyperlink w:anchor="_Toc231375159" w:history="1">
             <w:r>
               <w:rPr>
                 <w:rStyle w:val="Hyperlink"/>
@@ -1062,7 +1062,7 @@
                 <w:noProof/>
                 <w:webHidden/>
               </w:rPr>
-              <w:instrText xml:space="preserve"> PAGEREF _Toc229219133 \h </w:instrText>
+              <w:instrText xml:space="preserve"> PAGEREF _Toc231375159 \h </w:instrText>
             </w:r>
             <w:r>
               <w:rPr>
@@ -1108,7 +1108,7 @@
               <w14:ligatures w14:val="standardContextual"/>
             </w:rPr>
           </w:pPr>
-          <w:hyperlink w:anchor="_Toc229219134" w:history="1">
+          <w:hyperlink w:anchor="_Toc231375160" w:history="1">
             <w:r>
               <w:rPr>
                 <w:rStyle w:val="Hyperlink"/>
@@ -1152,7 +1152,7 @@
                 <w:noProof/>
                 <w:webHidden/>
               </w:rPr>
-              <w:instrText xml:space="preserve"> PAGEREF _Toc229219134 \h </w:instrText>
+              <w:instrText xml:space="preserve"> PAGEREF _Toc231375160 \h </w:instrText>
             </w:r>
             <w:r>
               <w:rPr>
@@ -1198,7 +1198,7 @@
               <w14:ligatures w14:val="standardContextual"/>
             </w:rPr>
           </w:pPr>
-          <w:hyperlink w:anchor="_Toc229219135" w:history="1">
+          <w:hyperlink w:anchor="_Toc231375161" w:history="1">
             <w:r>
               <w:rPr>
                 <w:rStyle w:val="Hyperlink"/>
@@ -1242,7 +1242,7 @@
                 <w:noProof/>
                 <w:webHidden/>
               </w:rPr>
-              <w:instrText xml:space="preserve"> PAGEREF _Toc229219135 \h </w:instrText>
+              <w:instrText xml:space="preserve"> PAGEREF _Toc231375161 \h </w:instrText>
             </w:r>
             <w:r>
               <w:rPr>
@@ -1288,7 +1288,7 @@
               <w14:ligatures w14:val="standardContextual"/>
             </w:rPr>
           </w:pPr>
-          <w:hyperlink w:anchor="_Toc229219136" w:history="1">
+          <w:hyperlink w:anchor="_Toc231375162" w:history="1">
             <w:r>
               <w:rPr>
                 <w:rStyle w:val="Hyperlink"/>
@@ -1332,7 +1332,7 @@
                 <w:noProof/>
                 <w:webHidden/>
               </w:rPr>
-              <w:instrText xml:space="preserve"> PAGEREF _Toc229219136 \h </w:instrText>
+              <w:instrText xml:space="preserve"> PAGEREF _Toc231375162 \h </w:instrText>
             </w:r>
             <w:r>
               <w:rPr>
@@ -1378,7 +1378,7 @@
               <w14:ligatures w14:val="standardContextual"/>
             </w:rPr>
           </w:pPr>
-          <w:hyperlink w:anchor="_Toc229219137" w:history="1">
+          <w:hyperlink w:anchor="_Toc231375163" w:history="1">
             <w:r>
               <w:rPr>
                 <w:rStyle w:val="Hyperlink"/>
@@ -1422,7 +1422,7 @@
                 <w:noProof/>
                 <w:webHidden/>
               </w:rPr>
-              <w:instrText xml:space="preserve"> PAGEREF _Toc229219137 \h </w:instrText>
+              <w:instrText xml:space="preserve"> PAGEREF _Toc231375163 \h </w:instrText>
             </w:r>
             <w:r>
               <w:rPr>
@@ -1468,7 +1468,7 @@
               <w14:ligatures w14:val="standardContextual"/>
             </w:rPr>
           </w:pPr>
-          <w:hyperlink w:anchor="_Toc229219138" w:history="1">
+          <w:hyperlink w:anchor="_Toc231375164" w:history="1">
             <w:r>
               <w:rPr>
                 <w:rStyle w:val="Hyperlink"/>
@@ -1512,7 +1512,7 @@
                 <w:noProof/>
                 <w:webHidden/>
               </w:rPr>
-              <w:instrText xml:space="preserve"> PAGEREF _Toc229219138 \h </w:instrText>
+              <w:instrText xml:space="preserve"> PAGEREF _Toc231375164 \h </w:instrText>
             </w:r>
             <w:r>
               <w:rPr>
@@ -1558,7 +1558,7 @@
               <w14:ligatures w14:val="standardContextual"/>
             </w:rPr>
           </w:pPr>
-          <w:hyperlink w:anchor="_Toc229219139" w:history="1">
+          <w:hyperlink w:anchor="_Toc231375165" w:history="1">
             <w:r>
               <w:rPr>
                 <w:rStyle w:val="Hyperlink"/>
@@ -1602,7 +1602,7 @@
                 <w:noProof/>
                 <w:webHidden/>
               </w:rPr>
-              <w:instrText xml:space="preserve"> PAGEREF _Toc229219139 \h </w:instrText>
+              <w:instrText xml:space="preserve"> PAGEREF _Toc231375165 \h </w:instrText>
             </w:r>
             <w:r>
               <w:rPr>
@@ -1648,7 +1648,7 @@
               <w14:ligatures w14:val="standardContextual"/>
             </w:rPr>
           </w:pPr>
-          <w:hyperlink w:anchor="_Toc229219140" w:history="1">
+          <w:hyperlink w:anchor="_Toc231375166" w:history="1">
             <w:r>
               <w:rPr>
                 <w:rStyle w:val="Hyperlink"/>
@@ -1692,7 +1692,7 @@
                 <w:noProof/>
                 <w:webHidden/>
               </w:rPr>
-              <w:instrText xml:space="preserve"> PAGEREF _Toc229219140 \h </w:instrText>
+              <w:instrText xml:space="preserve"> PAGEREF _Toc231375166 \h </w:instrText>
             </w:r>
             <w:r>
               <w:rPr>
@@ -1738,7 +1738,7 @@
               <w14:ligatures w14:val="standardContextual"/>
             </w:rPr>
           </w:pPr>
-          <w:hyperlink w:anchor="_Toc229219141" w:history="1">
+          <w:hyperlink w:anchor="_Toc231375167" w:history="1">
             <w:r>
               <w:rPr>
                 <w:rStyle w:val="Hyperlink"/>
@@ -1782,7 +1782,7 @@
                 <w:noProof/>
                 <w:webHidden/>
               </w:rPr>
-              <w:instrText xml:space="preserve"> PAGEREF _Toc229219141 \h </w:instrText>
+              <w:instrText xml:space="preserve"> PAGEREF _Toc231375167 \h </w:instrText>
             </w:r>
             <w:r>
               <w:rPr>
@@ -1828,7 +1828,7 @@
               <w14:ligatures w14:val="standardContextual"/>
             </w:rPr>
           </w:pPr>
-          <w:hyperlink w:anchor="_Toc229219142" w:history="1">
+          <w:hyperlink w:anchor="_Toc231375168" w:history="1">
             <w:r>
               <w:rPr>
                 <w:rStyle w:val="Hyperlink"/>
@@ -1872,7 +1872,7 @@
                 <w:noProof/>
                 <w:webHidden/>
               </w:rPr>
-              <w:instrText xml:space="preserve"> PAGEREF _Toc229219142 \h </w:instrText>
+              <w:instrText xml:space="preserve"> PAGEREF _Toc231375168 \h </w:instrText>
             </w:r>
             <w:r>
               <w:rPr>
@@ -1918,7 +1918,7 @@
               <w14:ligatures w14:val="standardContextual"/>
             </w:rPr>
           </w:pPr>
-          <w:hyperlink w:anchor="_Toc229219143" w:history="1">
+          <w:hyperlink w:anchor="_Toc231375169" w:history="1">
             <w:r>
               <w:rPr>
                 <w:rStyle w:val="Hyperlink"/>
@@ -1962,7 +1962,7 @@
                 <w:noProof/>
                 <w:webHidden/>
               </w:rPr>
-              <w:instrText xml:space="preserve"> PAGEREF _Toc229219143 \h </w:instrText>
+              <w:instrText xml:space="preserve"> PAGEREF _Toc231375169 \h </w:instrText>
             </w:r>
             <w:r>
               <w:rPr>
@@ -2008,7 +2008,7 @@
               <w14:ligatures w14:val="standardContextual"/>
             </w:rPr>
           </w:pPr>
-          <w:hyperlink w:anchor="_Toc229219144" w:history="1">
+          <w:hyperlink w:anchor="_Toc231375170" w:history="1">
             <w:r>
               <w:rPr>
                 <w:rStyle w:val="Hyperlink"/>
@@ -2052,7 +2052,7 @@
                 <w:noProof/>
                 <w:webHidden/>
               </w:rPr>
-              <w:instrText xml:space="preserve"> PAGEREF _Toc229219144 \h </w:instrText>
+              <w:instrText xml:space="preserve"> PAGEREF _Toc231375170 \h </w:instrText>
             </w:r>
             <w:r>
               <w:rPr>
@@ -2098,7 +2098,7 @@
               <w14:ligatures w14:val="standardContextual"/>
             </w:rPr>
           </w:pPr>
-          <w:hyperlink w:anchor="_Toc229219145" w:history="1">
+          <w:hyperlink w:anchor="_Toc231375171" w:history="1">
             <w:r>
               <w:rPr>
                 <w:rStyle w:val="Hyperlink"/>
@@ -2142,7 +2142,7 @@
                 <w:noProof/>
                 <w:webHidden/>
               </w:rPr>
-              <w:instrText xml:space="preserve"> PAGEREF _Toc229219145 \h </w:instrText>
+              <w:instrText xml:space="preserve"> PAGEREF _Toc231375171 \h </w:instrText>
             </w:r>
             <w:r>
               <w:rPr>
@@ -2188,7 +2188,7 @@
               <w14:ligatures w14:val="standardContextual"/>
             </w:rPr>
           </w:pPr>
-          <w:hyperlink w:anchor="_Toc229219146" w:history="1">
+          <w:hyperlink w:anchor="_Toc231375172" w:history="1">
             <w:r>
               <w:rPr>
                 <w:rStyle w:val="Hyperlink"/>
@@ -2232,7 +2232,7 @@
                 <w:noProof/>
                 <w:webHidden/>
               </w:rPr>
-              <w:instrText xml:space="preserve"> PAGEREF _Toc229219146 \h </w:instrText>
+              <w:instrText xml:space="preserve"> PAGEREF _Toc231375172 \h </w:instrText>
             </w:r>
             <w:r>
               <w:rPr>
@@ -2278,7 +2278,7 @@
               <w14:ligatures w14:val="standardContextual"/>
             </w:rPr>
           </w:pPr>
-          <w:hyperlink w:anchor="_Toc229219147" w:history="1">
+          <w:hyperlink w:anchor="_Toc231375173" w:history="1">
             <w:r>
               <w:rPr>
                 <w:rStyle w:val="Hyperlink"/>
@@ -2322,7 +2322,7 @@
                 <w:noProof/>
                 <w:webHidden/>
               </w:rPr>
-              <w:instrText xml:space="preserve"> PAGEREF _Toc229219147 \h </w:instrText>
+              <w:instrText xml:space="preserve"> PAGEREF _Toc231375173 \h </w:instrText>
             </w:r>
             <w:r>
               <w:rPr>
@@ -2342,7 +2342,7 @@
                 <w:noProof/>
                 <w:webHidden/>
               </w:rPr>
-              <w:t>17</w:t>
+              <w:t>18</w:t>
             </w:r>
             <w:r>
               <w:rPr>
@@ -2368,7 +2368,7 @@
               <w14:ligatures w14:val="standardContextual"/>
             </w:rPr>
           </w:pPr>
-          <w:hyperlink w:anchor="_Toc229219148" w:history="1">
+          <w:hyperlink w:anchor="_Toc231375174" w:history="1">
             <w:r>
               <w:rPr>
                 <w:rStyle w:val="Hyperlink"/>
@@ -2412,7 +2412,7 @@
                 <w:noProof/>
                 <w:webHidden/>
               </w:rPr>
-              <w:instrText xml:space="preserve"> PAGEREF _Toc229219148 \h </w:instrText>
+              <w:instrText xml:space="preserve"> PAGEREF _Toc231375174 \h </w:instrText>
             </w:r>
             <w:r>
               <w:rPr>
@@ -2432,7 +2432,7 @@
                 <w:noProof/>
                 <w:webHidden/>
               </w:rPr>
-              <w:t>17</w:t>
+              <w:t>18</w:t>
             </w:r>
             <w:r>
               <w:rPr>
@@ -2458,7 +2458,7 @@
               <w14:ligatures w14:val="standardContextual"/>
             </w:rPr>
           </w:pPr>
-          <w:hyperlink w:anchor="_Toc229219149" w:history="1">
+          <w:hyperlink w:anchor="_Toc231375175" w:history="1">
             <w:r>
               <w:rPr>
                 <w:rStyle w:val="Hyperlink"/>
@@ -2502,7 +2502,7 @@
                 <w:noProof/>
                 <w:webHidden/>
               </w:rPr>
-              <w:instrText xml:space="preserve"> PAGEREF _Toc229219149 \h </w:instrText>
+              <w:instrText xml:space="preserve"> PAGEREF _Toc231375175 \h </w:instrText>
             </w:r>
             <w:r>
               <w:rPr>
@@ -2522,7 +2522,7 @@
                 <w:noProof/>
                 <w:webHidden/>
               </w:rPr>
-              <w:t>18</w:t>
+              <w:t>20</w:t>
             </w:r>
             <w:r>
               <w:rPr>
@@ -2548,7 +2548,7 @@
               <w14:ligatures w14:val="standardContextual"/>
             </w:rPr>
           </w:pPr>
-          <w:hyperlink w:anchor="_Toc229219150" w:history="1">
+          <w:hyperlink w:anchor="_Toc231375176" w:history="1">
             <w:r>
               <w:rPr>
                 <w:rStyle w:val="Hyperlink"/>
@@ -2592,7 +2592,7 @@
                 <w:noProof/>
                 <w:webHidden/>
               </w:rPr>
-              <w:instrText xml:space="preserve"> PAGEREF _Toc229219150 \h </w:instrText>
+              <w:instrText xml:space="preserve"> PAGEREF _Toc231375176 \h </w:instrText>
             </w:r>
             <w:r>
               <w:rPr>
@@ -2612,7 +2612,7 @@
                 <w:noProof/>
                 <w:webHidden/>
               </w:rPr>
-              <w:t>18</w:t>
+              <w:t>20</w:t>
             </w:r>
             <w:r>
               <w:rPr>
@@ -2638,7 +2638,7 @@
               <w14:ligatures w14:val="standardContextual"/>
             </w:rPr>
           </w:pPr>
-          <w:hyperlink w:anchor="_Toc229219151" w:history="1">
+          <w:hyperlink w:anchor="_Toc231375177" w:history="1">
             <w:r>
               <w:rPr>
                 <w:rStyle w:val="Hyperlink"/>
@@ -2682,7 +2682,7 @@
                 <w:noProof/>
                 <w:webHidden/>
               </w:rPr>
-              <w:instrText xml:space="preserve"> PAGEREF _Toc229219151 \h </w:instrText>
+              <w:instrText xml:space="preserve"> PAGEREF _Toc231375177 \h </w:instrText>
             </w:r>
             <w:r>
               <w:rPr>
@@ -2702,7 +2702,7 @@
                 <w:noProof/>
                 <w:webHidden/>
               </w:rPr>
-              <w:t>18</w:t>
+              <w:t>20</w:t>
             </w:r>
             <w:r>
               <w:rPr>
@@ -2728,7 +2728,7 @@
               <w14:ligatures w14:val="standardContextual"/>
             </w:rPr>
           </w:pPr>
-          <w:hyperlink w:anchor="_Toc229219152" w:history="1">
+          <w:hyperlink w:anchor="_Toc231375178" w:history="1">
             <w:r>
               <w:rPr>
                 <w:rStyle w:val="Hyperlink"/>
@@ -2772,7 +2772,7 @@
                 <w:noProof/>
                 <w:webHidden/>
               </w:rPr>
-              <w:instrText xml:space="preserve"> PAGEREF _Toc229219152 \h </w:instrText>
+              <w:instrText xml:space="preserve"> PAGEREF _Toc231375178 \h </w:instrText>
             </w:r>
             <w:r>
               <w:rPr>
@@ -2792,7 +2792,7 @@
                 <w:noProof/>
                 <w:webHidden/>
               </w:rPr>
-              <w:t>18</w:t>
+              <w:t>20</w:t>
             </w:r>
             <w:r>
               <w:rPr>
@@ -2818,7 +2818,7 @@
               <w14:ligatures w14:val="standardContextual"/>
             </w:rPr>
           </w:pPr>
-          <w:hyperlink w:anchor="_Toc229219153" w:history="1">
+          <w:hyperlink w:anchor="_Toc231375179" w:history="1">
             <w:r>
               <w:rPr>
                 <w:rStyle w:val="Hyperlink"/>
@@ -2862,7 +2862,7 @@
                 <w:noProof/>
                 <w:webHidden/>
               </w:rPr>
-              <w:instrText xml:space="preserve"> PAGEREF _Toc229219153 \h </w:instrText>
+              <w:instrText xml:space="preserve"> PAGEREF _Toc231375179 \h </w:instrText>
             </w:r>
             <w:r>
               <w:rPr>
@@ -2882,7 +2882,7 @@
                 <w:noProof/>
                 <w:webHidden/>
               </w:rPr>
-              <w:t>19</w:t>
+              <w:t>22</w:t>
             </w:r>
             <w:r>
               <w:rPr>
@@ -2908,7 +2908,7 @@
               <w14:ligatures w14:val="standardContextual"/>
             </w:rPr>
           </w:pPr>
-          <w:hyperlink w:anchor="_Toc229219154" w:history="1">
+          <w:hyperlink w:anchor="_Toc231375180" w:history="1">
             <w:r>
               <w:rPr>
                 <w:rStyle w:val="Hyperlink"/>
@@ -2952,7 +2952,7 @@
                 <w:noProof/>
                 <w:webHidden/>
               </w:rPr>
-              <w:instrText xml:space="preserve"> PAGEREF _Toc229219154 \h </w:instrText>
+              <w:instrText xml:space="preserve"> PAGEREF _Toc231375180 \h </w:instrText>
             </w:r>
             <w:r>
               <w:rPr>
@@ -2972,7 +2972,7 @@
                 <w:noProof/>
                 <w:webHidden/>
               </w:rPr>
-              <w:t>20</w:t>
+              <w:t>23</w:t>
             </w:r>
             <w:r>
               <w:rPr>
@@ -2998,7 +2998,7 @@
               <w14:ligatures w14:val="standardContextual"/>
             </w:rPr>
           </w:pPr>
-          <w:hyperlink w:anchor="_Toc229219155" w:history="1">
+          <w:hyperlink w:anchor="_Toc231375181" w:history="1">
             <w:r>
               <w:rPr>
                 <w:rStyle w:val="Hyperlink"/>
@@ -3042,7 +3042,7 @@
                 <w:noProof/>
                 <w:webHidden/>
               </w:rPr>
-              <w:instrText xml:space="preserve"> PAGEREF _Toc229219155 \h </w:instrText>
+              <w:instrText xml:space="preserve"> PAGEREF _Toc231375181 \h </w:instrText>
             </w:r>
             <w:r>
               <w:rPr>
@@ -3062,7 +3062,7 @@
                 <w:noProof/>
                 <w:webHidden/>
               </w:rPr>
-              <w:t>20</w:t>
+              <w:t>23</w:t>
             </w:r>
             <w:r>
               <w:rPr>
@@ -3088,7 +3088,7 @@
               <w14:ligatures w14:val="standardContextual"/>
             </w:rPr>
           </w:pPr>
-          <w:hyperlink w:anchor="_Toc229219156" w:history="1">
+          <w:hyperlink w:anchor="_Toc231375182" w:history="1">
             <w:r>
               <w:rPr>
                 <w:rStyle w:val="Hyperlink"/>
@@ -3132,7 +3132,7 @@
                 <w:noProof/>
                 <w:webHidden/>
               </w:rPr>
-              <w:instrText xml:space="preserve"> PAGEREF _Toc229219156 \h </w:instrText>
+              <w:instrText xml:space="preserve"> PAGEREF _Toc231375182 \h </w:instrText>
             </w:r>
             <w:r>
               <w:rPr>
@@ -3152,7 +3152,7 @@
                 <w:noProof/>
                 <w:webHidden/>
               </w:rPr>
-              <w:t>21</w:t>
+              <w:t>24</w:t>
             </w:r>
             <w:r>
               <w:rPr>
@@ -3178,7 +3178,7 @@
               <w14:ligatures w14:val="standardContextual"/>
             </w:rPr>
           </w:pPr>
-          <w:hyperlink w:anchor="_Toc229219157" w:history="1">
+          <w:hyperlink w:anchor="_Toc231375183" w:history="1">
             <w:r>
               <w:rPr>
                 <w:rStyle w:val="Hyperlink"/>
@@ -3222,7 +3222,7 @@
                 <w:noProof/>
                 <w:webHidden/>
               </w:rPr>
-              <w:instrText xml:space="preserve"> PAGEREF _Toc229219157 \h </w:instrText>
+              <w:instrText xml:space="preserve"> PAGEREF _Toc231375183 \h </w:instrText>
             </w:r>
             <w:r>
               <w:rPr>
@@ -3242,7 +3242,7 @@
                 <w:noProof/>
                 <w:webHidden/>
               </w:rPr>
-              <w:t>23</w:t>
+              <w:t>26</w:t>
             </w:r>
             <w:r>
               <w:rPr>
@@ -3268,7 +3268,7 @@
               <w14:ligatures w14:val="standardContextual"/>
             </w:rPr>
           </w:pPr>
-          <w:hyperlink w:anchor="_Toc229219158" w:history="1">
+          <w:hyperlink w:anchor="_Toc231375184" w:history="1">
             <w:r>
               <w:rPr>
                 <w:rStyle w:val="Hyperlink"/>
@@ -3312,7 +3312,7 @@
                 <w:noProof/>
                 <w:webHidden/>
               </w:rPr>
-              <w:instrText xml:space="preserve"> PAGEREF _Toc229219158 \h </w:instrText>
+              <w:instrText xml:space="preserve"> PAGEREF _Toc231375184 \h </w:instrText>
             </w:r>
             <w:r>
               <w:rPr>
@@ -3332,7 +3332,7 @@
                 <w:noProof/>
                 <w:webHidden/>
               </w:rPr>
-              <w:t>26</w:t>
+              <w:t>29</w:t>
             </w:r>
             <w:r>
               <w:rPr>
@@ -3358,7 +3358,7 @@
               <w14:ligatures w14:val="standardContextual"/>
             </w:rPr>
           </w:pPr>
-          <w:hyperlink w:anchor="_Toc229219159" w:history="1">
+          <w:hyperlink w:anchor="_Toc231375185" w:history="1">
             <w:r>
               <w:rPr>
                 <w:rStyle w:val="Hyperlink"/>
@@ -3402,7 +3402,7 @@
                 <w:noProof/>
                 <w:webHidden/>
               </w:rPr>
-              <w:instrText xml:space="preserve"> PAGEREF _Toc229219159 \h </w:instrText>
+              <w:instrText xml:space="preserve"> PAGEREF _Toc231375185 \h </w:instrText>
             </w:r>
             <w:r>
               <w:rPr>
@@ -3422,7 +3422,7 @@
                 <w:noProof/>
                 <w:webHidden/>
               </w:rPr>
-              <w:t>27</w:t>
+              <w:t>30</w:t>
             </w:r>
             <w:r>
               <w:rPr>
@@ -3448,7 +3448,7 @@
               <w14:ligatures w14:val="standardContextual"/>
             </w:rPr>
           </w:pPr>
-          <w:hyperlink w:anchor="_Toc229219160" w:history="1">
+          <w:hyperlink w:anchor="_Toc231375186" w:history="1">
             <w:r>
               <w:rPr>
                 <w:rStyle w:val="Hyperlink"/>
@@ -3492,7 +3492,7 @@
                 <w:noProof/>
                 <w:webHidden/>
               </w:rPr>
-              <w:instrText xml:space="preserve"> PAGEREF _Toc229219160 \h </w:instrText>
+              <w:instrText xml:space="preserve"> PAGEREF _Toc231375186 \h </w:instrText>
             </w:r>
             <w:r>
               <w:rPr>
@@ -3512,7 +3512,7 @@
                 <w:noProof/>
                 <w:webHidden/>
               </w:rPr>
-              <w:t>28</w:t>
+              <w:t>31</w:t>
             </w:r>
             <w:r>
               <w:rPr>
@@ -3558,7 +3558,7 @@
       </w:pPr>
       <w:bookmarkStart w:id="0" w:name="_Ref222687105"/>
       <w:bookmarkStart w:id="1" w:name="_Toc224026870"/>
-      <w:bookmarkStart w:id="2" w:name="_Toc229219123"/>
+      <w:bookmarkStart w:id="2" w:name="_Toc231375149"/>
       <w:r>
         <w:lastRenderedPageBreak/>
         <w:t>Algemene informatie</w:t>
@@ -3579,7 +3579,7 @@
         </w:rPr>
       </w:pPr>
       <w:bookmarkStart w:id="3" w:name="_Toc224026871"/>
-      <w:bookmarkStart w:id="4" w:name="_Toc229219124"/>
+      <w:bookmarkStart w:id="4" w:name="_Toc231375150"/>
       <w:r>
         <w:rPr>
           <w:lang w:val="nl-NL"/>
@@ -3808,7 +3808,7 @@
         </w:rPr>
       </w:pPr>
       <w:bookmarkStart w:id="5" w:name="_Toc224026872"/>
-      <w:bookmarkStart w:id="6" w:name="_Toc229219125"/>
+      <w:bookmarkStart w:id="6" w:name="_Toc231375151"/>
       <w:r>
         <w:rPr>
           <w:lang w:val="nl-NL"/>
@@ -4023,7 +4023,10 @@
           </w:tcPr>
           <w:p>
             <w:r>
-              <w:t>11-06-2026</w:t>
+              <w:t>03</w:t>
+            </w:r>
+            <w:r>
+              <w:t>-06-2026</w:t>
             </w:r>
           </w:p>
         </w:tc>
@@ -4079,7 +4082,7 @@
         <w:pStyle w:val="Heading1"/>
       </w:pPr>
       <w:bookmarkStart w:id="7" w:name="_Toc224026873"/>
-      <w:bookmarkStart w:id="8" w:name="_Toc229219126"/>
+      <w:bookmarkStart w:id="8" w:name="_Toc231375152"/>
       <w:r>
         <w:lastRenderedPageBreak/>
         <w:t>Inleiding</w:t>
@@ -4225,7 +4228,7 @@
       <w:pPr>
         <w:pStyle w:val="Heading1"/>
       </w:pPr>
-      <w:bookmarkStart w:id="9" w:name="_Toc229219127"/>
+      <w:bookmarkStart w:id="9" w:name="_Toc231375153"/>
       <w:proofErr w:type="spellStart"/>
       <w:r>
         <w:lastRenderedPageBreak/>
@@ -4255,7 +4258,7 @@
       <w:pPr>
         <w:pStyle w:val="Heading2"/>
       </w:pPr>
-      <w:bookmarkStart w:id="10" w:name="_Toc229219128"/>
+      <w:bookmarkStart w:id="10" w:name="_Toc231375154"/>
       <w:proofErr w:type="spellStart"/>
       <w:r>
         <w:t>Doelgroepanalyse</w:t>
@@ -4458,7 +4461,7 @@
       <w:pPr>
         <w:pStyle w:val="Heading2"/>
       </w:pPr>
-      <w:bookmarkStart w:id="11" w:name="_Toc229219129"/>
+      <w:bookmarkStart w:id="11" w:name="_Toc231375155"/>
       <w:proofErr w:type="spellStart"/>
       <w:r>
         <w:t>Analyse</w:t>
@@ -4549,7 +4552,7 @@
       <w:pPr>
         <w:pStyle w:val="Heading2"/>
       </w:pPr>
-      <w:bookmarkStart w:id="12" w:name="_Toc229219130"/>
+      <w:bookmarkStart w:id="12" w:name="_Toc231375156"/>
       <w:proofErr w:type="spellStart"/>
       <w:r>
         <w:t>Moodboard</w:t>
@@ -4616,7 +4619,7 @@
           <w:lang w:val="en-US"/>
         </w:rPr>
       </w:pPr>
-      <w:bookmarkStart w:id="13" w:name="_Toc231217939"/>
+      <w:bookmarkStart w:id="13" w:name="_Toc231375385"/>
       <w:r>
         <w:t xml:space="preserve">Figuur </w:t>
       </w:r>
@@ -4641,7 +4644,7 @@
           <w:lang w:val="nl-NL"/>
         </w:rPr>
       </w:pPr>
-      <w:bookmarkStart w:id="14" w:name="_Toc229219131"/>
+      <w:bookmarkStart w:id="14" w:name="_Toc231375157"/>
       <w:r>
         <w:rPr>
           <w:lang w:val="nl-NL"/>
@@ -4950,7 +4953,7 @@
       <w:pPr>
         <w:pStyle w:val="Heading1"/>
       </w:pPr>
-      <w:bookmarkStart w:id="16" w:name="_Toc229219132"/>
+      <w:bookmarkStart w:id="16" w:name="_Toc231375158"/>
       <w:proofErr w:type="spellStart"/>
       <w:r>
         <w:lastRenderedPageBreak/>
@@ -5066,7 +5069,7 @@
           <w:lang w:val="nl-NL"/>
         </w:rPr>
       </w:pPr>
-      <w:bookmarkStart w:id="17" w:name="_Toc229219133"/>
+      <w:bookmarkStart w:id="17" w:name="_Toc231375159"/>
       <w:proofErr w:type="spellStart"/>
       <w:r>
         <w:rPr>
@@ -5110,7 +5113,7 @@
           <w:lang w:val="nl-NL"/>
         </w:rPr>
       </w:pPr>
-      <w:bookmarkStart w:id="18" w:name="_Toc229219134"/>
+      <w:bookmarkStart w:id="18" w:name="_Toc231375160"/>
       <w:proofErr w:type="spellStart"/>
       <w:r>
         <w:rPr>
@@ -5279,7 +5282,7 @@
       <w:pPr>
         <w:pStyle w:val="Caption"/>
       </w:pPr>
-      <w:bookmarkStart w:id="19" w:name="_Toc231217940"/>
+      <w:bookmarkStart w:id="19" w:name="_Toc231375386"/>
       <w:r>
         <w:t xml:space="preserve">Figuur </w:t>
       </w:r>
@@ -5544,7 +5547,7 @@
       <w:pPr>
         <w:pStyle w:val="Heading2"/>
       </w:pPr>
-      <w:bookmarkStart w:id="20" w:name="_Toc229219135"/>
+      <w:bookmarkStart w:id="20" w:name="_Toc231375161"/>
       <w:r>
         <w:t>POV</w:t>
       </w:r>
@@ -5572,7 +5575,7 @@
           <w:lang w:val="nl-NL"/>
         </w:rPr>
       </w:pPr>
-      <w:bookmarkStart w:id="21" w:name="_Toc229219136"/>
+      <w:bookmarkStart w:id="21" w:name="_Toc231375162"/>
       <w:r>
         <w:rPr>
           <w:lang w:val="nl-NL"/>
@@ -5621,7 +5624,7 @@
           <w:lang w:val="nl-NL"/>
         </w:rPr>
       </w:pPr>
-      <w:bookmarkStart w:id="22" w:name="_Toc229219137"/>
+      <w:bookmarkStart w:id="22" w:name="_Toc231375163"/>
       <w:r>
         <w:rPr>
           <w:lang w:val="nl-NL"/>
@@ -5735,7 +5738,7 @@
       <w:pPr>
         <w:pStyle w:val="Caption"/>
       </w:pPr>
-      <w:bookmarkStart w:id="23" w:name="_Toc231217941"/>
+      <w:bookmarkStart w:id="23" w:name="_Toc231375387"/>
       <w:r>
         <w:t xml:space="preserve">Figuur </w:t>
       </w:r>
@@ -5768,7 +5771,7 @@
           <w:lang w:val="nl-NL"/>
         </w:rPr>
       </w:pPr>
-      <w:bookmarkStart w:id="24" w:name="_Toc229219138"/>
+      <w:bookmarkStart w:id="24" w:name="_Toc231375164"/>
       <w:r>
         <w:rPr>
           <w:lang w:val="nl-NL"/>
@@ -6265,7 +6268,7 @@
           <w:lang w:val="nl-NL"/>
         </w:rPr>
       </w:pPr>
-      <w:bookmarkStart w:id="25" w:name="_Toc229219139"/>
+      <w:bookmarkStart w:id="25" w:name="_Toc231375165"/>
       <w:r>
         <w:rPr>
           <w:lang w:val="nl-NL"/>
@@ -6617,7 +6620,7 @@
           <w:lang w:val="nl-NL"/>
         </w:rPr>
       </w:pPr>
-      <w:bookmarkStart w:id="26" w:name="_Toc229219140"/>
+      <w:bookmarkStart w:id="26" w:name="_Toc231375166"/>
       <w:proofErr w:type="spellStart"/>
       <w:r>
         <w:rPr>
@@ -8162,7 +8165,7 @@
       <w:pPr>
         <w:pStyle w:val="Heading1"/>
       </w:pPr>
-      <w:bookmarkStart w:id="28" w:name="_Toc229219141"/>
+      <w:bookmarkStart w:id="28" w:name="_Toc231375167"/>
       <w:proofErr w:type="spellStart"/>
       <w:r>
         <w:lastRenderedPageBreak/>
@@ -8186,7 +8189,7 @@
           <w:lang w:val="nl-NL"/>
         </w:rPr>
       </w:pPr>
-      <w:bookmarkStart w:id="29" w:name="_Toc229219142"/>
+      <w:bookmarkStart w:id="29" w:name="_Toc231375168"/>
       <w:r>
         <w:rPr>
           <w:lang w:val="nl-NL"/>
@@ -8218,7 +8221,7 @@
           <w:noProof/>
         </w:rPr>
         <w:drawing>
-          <wp:inline distT="0" distB="0" distL="0" distR="0" wp14:anchorId="49A6505F" wp14:editId="34933D49">
+          <wp:inline distT="0" distB="0" distL="0" distR="0" wp14:anchorId="49A6505F" wp14:editId="63E784F2">
             <wp:extent cx="5731510" cy="4079240"/>
             <wp:effectExtent l="0" t="0" r="0" b="0"/>
             <wp:docPr id="69312833" name="Picture 2"/>
@@ -8264,7 +8267,7 @@
       <w:pPr>
         <w:pStyle w:val="Caption"/>
       </w:pPr>
-      <w:bookmarkStart w:id="30" w:name="_Toc231217942"/>
+      <w:bookmarkStart w:id="30" w:name="_Toc231375388"/>
       <w:r>
         <w:t xml:space="preserve">Figuur </w:t>
       </w:r>
@@ -8301,7 +8304,7 @@
       <w:pPr>
         <w:pStyle w:val="Heading2"/>
       </w:pPr>
-      <w:bookmarkStart w:id="31" w:name="_Toc229219143"/>
+      <w:bookmarkStart w:id="31" w:name="_Toc231375169"/>
       <w:r>
         <w:lastRenderedPageBreak/>
         <w:t xml:space="preserve">High-fidelity </w:t>
@@ -8325,10 +8328,10 @@
           <w:noProof/>
         </w:rPr>
         <w:drawing>
-          <wp:inline distT="0" distB="0" distL="0" distR="0" wp14:anchorId="6307281B" wp14:editId="183088CA">
-            <wp:extent cx="5731510" cy="4080510"/>
+          <wp:inline distT="0" distB="0" distL="0" distR="0" wp14:anchorId="3BAF8432" wp14:editId="345B9056">
+            <wp:extent cx="5731510" cy="4017645"/>
             <wp:effectExtent l="0" t="0" r="0" b="0"/>
-            <wp:docPr id="2120208483" name="Picture 3"/>
+            <wp:docPr id="1563476283" name="Picture 1"/>
             <wp:cNvGraphicFramePr>
               <a:graphicFrameLocks xmlns:a="http://schemas.openxmlformats.org/drawingml/2006/main" noChangeAspect="1"/>
             </wp:cNvGraphicFramePr>
@@ -8336,11 +8339,11 @@
               <a:graphicData uri="http://schemas.openxmlformats.org/drawingml/2006/picture">
                 <pic:pic xmlns:pic="http://schemas.openxmlformats.org/drawingml/2006/picture">
                   <pic:nvPicPr>
-                    <pic:cNvPr id="2120208483" name="Picture 2120208483"/>
+                    <pic:cNvPr id="1563476283" name="Picture 1563476283"/>
                     <pic:cNvPicPr/>
                   </pic:nvPicPr>
                   <pic:blipFill>
-                    <a:blip r:embed="rId16" cstate="print">
+                    <a:blip r:embed="rId16">
                       <a:extLst>
                         <a:ext uri="{28A0092B-C50C-407E-A947-70E740481C1C}">
                           <a14:useLocalDpi xmlns:a14="http://schemas.microsoft.com/office/drawing/2010/main" val="0"/>
@@ -8354,7 +8357,7 @@
                   <pic:spPr>
                     <a:xfrm>
                       <a:off x="0" y="0"/>
-                      <a:ext cx="5731510" cy="4080510"/>
+                      <a:ext cx="5731510" cy="4017645"/>
                     </a:xfrm>
                     <a:prstGeom prst="rect">
                       <a:avLst/>
@@ -8371,7 +8374,7 @@
       <w:pPr>
         <w:pStyle w:val="Caption"/>
       </w:pPr>
-      <w:bookmarkStart w:id="32" w:name="_Toc231217943"/>
+      <w:bookmarkStart w:id="32" w:name="_Toc231375389"/>
       <w:r>
         <w:t xml:space="preserve">Figuur </w:t>
       </w:r>
@@ -8409,7 +8412,7 @@
       <w:pPr>
         <w:pStyle w:val="Heading2"/>
       </w:pPr>
-      <w:bookmarkStart w:id="33" w:name="_Toc229219144"/>
+      <w:bookmarkStart w:id="33" w:name="_Toc231375170"/>
       <w:proofErr w:type="spellStart"/>
       <w:r>
         <w:t>Testplan</w:t>
@@ -9309,7 +9312,7 @@
       <w:pPr>
         <w:pStyle w:val="Heading2"/>
       </w:pPr>
-      <w:bookmarkStart w:id="35" w:name="_Toc229219145"/>
+      <w:bookmarkStart w:id="35" w:name="_Toc231375171"/>
       <w:proofErr w:type="spellStart"/>
       <w:r>
         <w:lastRenderedPageBreak/>
@@ -9477,7 +9480,7 @@
           <w:lang w:val="nl-NL"/>
         </w:rPr>
       </w:pPr>
-      <w:bookmarkStart w:id="36" w:name="_Toc229219146"/>
+      <w:bookmarkStart w:id="36" w:name="_Toc231375172"/>
       <w:r>
         <w:rPr>
           <w:lang w:val="nl-NL"/>
@@ -9760,7 +9763,7 @@
           <w:lang w:val="nl-NL"/>
         </w:rPr>
       </w:pPr>
-      <w:bookmarkStart w:id="37" w:name="_Toc229219147"/>
+      <w:bookmarkStart w:id="37" w:name="_Toc231375173"/>
       <w:r>
         <w:rPr>
           <w:lang w:val="nl-NL"/>
@@ -10206,7 +10209,7 @@
       <w:pPr>
         <w:pStyle w:val="Heading2"/>
       </w:pPr>
-      <w:bookmarkStart w:id="38" w:name="_Toc229219148"/>
+      <w:bookmarkStart w:id="38" w:name="_Toc231375174"/>
       <w:r>
         <w:t xml:space="preserve">AR </w:t>
       </w:r>
@@ -10604,7 +10607,7 @@
       <w:pPr>
         <w:pStyle w:val="Heading1"/>
       </w:pPr>
-      <w:bookmarkStart w:id="39" w:name="_Toc229219149"/>
+      <w:bookmarkStart w:id="39" w:name="_Toc231375175"/>
       <w:proofErr w:type="spellStart"/>
       <w:r>
         <w:lastRenderedPageBreak/>
@@ -10620,7 +10623,7 @@
           <w:lang w:val="nl-NL"/>
         </w:rPr>
       </w:pPr>
-      <w:bookmarkStart w:id="40" w:name="_Toc229219150"/>
+      <w:bookmarkStart w:id="40" w:name="_Toc231375176"/>
       <w:r>
         <w:rPr>
           <w:lang w:val="nl-NL"/>
@@ -10766,7 +10769,7 @@
           <w:lang w:val="nl-NL"/>
         </w:rPr>
       </w:pPr>
-      <w:bookmarkStart w:id="41" w:name="_Toc229219151"/>
+      <w:bookmarkStart w:id="41" w:name="_Toc231375177"/>
       <w:r>
         <w:rPr>
           <w:lang w:val="nl-NL"/>
@@ -10950,7 +10953,7 @@
           <w:lang w:val="nl-NL"/>
         </w:rPr>
       </w:pPr>
-      <w:bookmarkStart w:id="42" w:name="_Toc229219152"/>
+      <w:bookmarkStart w:id="42" w:name="_Toc231375178"/>
       <w:r>
         <w:rPr>
           <w:lang w:val="nl-NL"/>
@@ -11144,14 +11147,6 @@
       </w:r>
       <w:proofErr w:type="gramEnd"/>
       <w:r>
-        <w:t>-</w:t>
-      </w:r>
-      <w:proofErr w:type="spellStart"/>
-      <w:r>
-        <w:t>text</w:t>
-      </w:r>
-      <w:proofErr w:type="spellEnd"/>
-      <w:r>
         <w:t> klasse voor gedeelde stijlen zoals font-</w:t>
       </w:r>
       <w:proofErr w:type="spellStart"/>
@@ -11186,7 +11181,7 @@
       <w:pPr>
         <w:pStyle w:val="Heading1"/>
       </w:pPr>
-      <w:bookmarkStart w:id="43" w:name="_Toc229219153"/>
+      <w:bookmarkStart w:id="43" w:name="_Toc231375179"/>
       <w:r>
         <w:lastRenderedPageBreak/>
         <w:t>Reflectie</w:t>
@@ -11315,7 +11310,7 @@
           <w:szCs w:val="32"/>
         </w:rPr>
       </w:pPr>
-      <w:bookmarkStart w:id="44" w:name="_Toc229219154"/>
+      <w:bookmarkStart w:id="44" w:name="_Toc231375180"/>
       <w:r>
         <w:lastRenderedPageBreak/>
         <w:t>Peer checklist</w:t>
@@ -11326,7 +11321,7 @@
       <w:pPr>
         <w:pStyle w:val="Heading2"/>
       </w:pPr>
-      <w:bookmarkStart w:id="45" w:name="_Toc229219155"/>
+      <w:bookmarkStart w:id="45" w:name="_Toc231375181"/>
       <w:r>
         <w:t>Peer 1</w:t>
       </w:r>
@@ -13368,7 +13363,7 @@
       <w:pPr>
         <w:pStyle w:val="Heading2"/>
       </w:pPr>
-      <w:bookmarkStart w:id="46" w:name="_Toc229219156"/>
+      <w:bookmarkStart w:id="46" w:name="_Toc231375182"/>
       <w:r>
         <w:t>Peer 2</w:t>
       </w:r>
@@ -15416,7 +15411,7 @@
       <w:pPr>
         <w:pStyle w:val="Heading2"/>
       </w:pPr>
-      <w:bookmarkStart w:id="47" w:name="_Toc229219157"/>
+      <w:bookmarkStart w:id="47" w:name="_Toc231375183"/>
       <w:r>
         <w:t xml:space="preserve">Peer 3: </w:t>
       </w:r>
@@ -17441,7 +17436,7 @@
       <w:pPr>
         <w:pStyle w:val="Heading1"/>
       </w:pPr>
-      <w:bookmarkStart w:id="48" w:name="_Toc229219158"/>
+      <w:bookmarkStart w:id="48" w:name="_Toc231375184"/>
       <w:r>
         <w:lastRenderedPageBreak/>
         <w:t>AI-v</w:t>
@@ -17470,7 +17465,7 @@
           <w:color w:val="000000"/>
           <w:shd w:val="clear" w:color="auto" w:fill="FFFFFF"/>
         </w:rPr>
-        <w:t> </w:t>
+        <w:t>.</w:t>
       </w:r>
     </w:p>
     <w:p>
@@ -17574,7 +17569,25 @@
           <w:color w:val="000000"/>
           <w:bdr w:val="none" w:sz="0" w:space="0" w:color="auto" w:frame="1"/>
         </w:rPr>
-        <w:t>Tijdens deze opdracht hebben wij geen gebruik gemaakt van AI.</w:t>
+        <w:t>Tijdens deze opdracht he</w:t>
+      </w:r>
+      <w:r>
+        <w:rPr>
+          <w:rStyle w:val="normaltextrun"/>
+          <w:iCs/>
+          <w:color w:val="000000"/>
+          <w:bdr w:val="none" w:sz="0" w:space="0" w:color="auto" w:frame="1"/>
+        </w:rPr>
+        <w:t>b ik</w:t>
+      </w:r>
+      <w:r>
+        <w:rPr>
+          <w:rStyle w:val="normaltextrun"/>
+          <w:iCs/>
+          <w:color w:val="000000"/>
+          <w:bdr w:val="none" w:sz="0" w:space="0" w:color="auto" w:frame="1"/>
+        </w:rPr>
+        <w:t xml:space="preserve"> geen gebruik gemaakt van AI.</w:t>
       </w:r>
     </w:p>
     <w:p>
@@ -17828,7 +17841,7 @@
       <w:pPr>
         <w:pStyle w:val="Heading1"/>
       </w:pPr>
-      <w:bookmarkStart w:id="49" w:name="_Toc229219159"/>
+      <w:bookmarkStart w:id="49" w:name="_Toc231375185"/>
       <w:r>
         <w:lastRenderedPageBreak/>
         <w:t>Figurenlijst</w:t>
@@ -17861,7 +17874,7 @@
       <w:r>
         <w:fldChar w:fldCharType="separate"/>
       </w:r>
-      <w:hyperlink w:anchor="_Toc231217939" w:history="1">
+      <w:hyperlink w:anchor="_Toc231375385" w:history="1">
         <w:r>
           <w:rPr>
             <w:rStyle w:val="Hyperlink"/>
@@ -17888,7 +17901,7 @@
             <w:noProof/>
             <w:webHidden/>
           </w:rPr>
-          <w:instrText xml:space="preserve"> PAGEREF _Toc231217939 \h </w:instrText>
+          <w:instrText xml:space="preserve"> PAGEREF _Toc231375385 \h </w:instrText>
         </w:r>
         <w:r>
           <w:rPr>
@@ -17933,7 +17946,7 @@
           <w14:ligatures w14:val="standardContextual"/>
         </w:rPr>
       </w:pPr>
-      <w:hyperlink w:anchor="_Toc231217940" w:history="1">
+      <w:hyperlink w:anchor="_Toc231375386" w:history="1">
         <w:r>
           <w:rPr>
             <w:rStyle w:val="Hyperlink"/>
@@ -17960,7 +17973,7 @@
             <w:noProof/>
             <w:webHidden/>
           </w:rPr>
-          <w:instrText xml:space="preserve"> PAGEREF _Toc231217940 \h </w:instrText>
+          <w:instrText xml:space="preserve"> PAGEREF _Toc231375386 \h </w:instrText>
         </w:r>
         <w:r>
           <w:rPr>
@@ -18005,7 +18018,7 @@
           <w14:ligatures w14:val="standardContextual"/>
         </w:rPr>
       </w:pPr>
-      <w:hyperlink w:anchor="_Toc231217941" w:history="1">
+      <w:hyperlink w:anchor="_Toc231375387" w:history="1">
         <w:r>
           <w:rPr>
             <w:rStyle w:val="Hyperlink"/>
@@ -18032,7 +18045,7 @@
             <w:noProof/>
             <w:webHidden/>
           </w:rPr>
-          <w:instrText xml:space="preserve"> PAGEREF _Toc231217941 \h </w:instrText>
+          <w:instrText xml:space="preserve"> PAGEREF _Toc231375387 \h </w:instrText>
         </w:r>
         <w:r>
           <w:rPr>
@@ -18077,7 +18090,7 @@
           <w14:ligatures w14:val="standardContextual"/>
         </w:rPr>
       </w:pPr>
-      <w:hyperlink w:anchor="_Toc231217942" w:history="1">
+      <w:hyperlink w:anchor="_Toc231375388" w:history="1">
         <w:r>
           <w:rPr>
             <w:rStyle w:val="Hyperlink"/>
@@ -18104,7 +18117,7 @@
             <w:noProof/>
             <w:webHidden/>
           </w:rPr>
-          <w:instrText xml:space="preserve"> PAGEREF _Toc231217942 \h </w:instrText>
+          <w:instrText xml:space="preserve"> PAGEREF _Toc231375388 \h </w:instrText>
         </w:r>
         <w:r>
           <w:rPr>
@@ -18149,7 +18162,7 @@
           <w14:ligatures w14:val="standardContextual"/>
         </w:rPr>
       </w:pPr>
-      <w:hyperlink w:anchor="_Toc231217943" w:history="1">
+      <w:hyperlink w:anchor="_Toc231375389" w:history="1">
         <w:r>
           <w:rPr>
             <w:rStyle w:val="Hyperlink"/>
@@ -18176,7 +18189,7 @@
             <w:noProof/>
             <w:webHidden/>
           </w:rPr>
-          <w:instrText xml:space="preserve"> PAGEREF _Toc231217943 \h </w:instrText>
+          <w:instrText xml:space="preserve"> PAGEREF _Toc231375389 \h </w:instrText>
         </w:r>
         <w:r>
           <w:rPr>
@@ -18245,7 +18258,7 @@
         <w:lastRenderedPageBreak/>
         <w:t xml:space="preserve"> </w:t>
       </w:r>
-      <w:bookmarkStart w:id="50" w:name="_Toc229219160"/>
+      <w:bookmarkStart w:id="50" w:name="_Toc231375186"/>
       <w:r>
         <w:t>Literatuurlijst</w:t>
       </w:r>
@@ -18469,7 +18482,7 @@
       <w:t>-0</w:t>
     </w:r>
     <w:r>
-      <w:t>5</w:t>
+      <w:t>6</w:t>
     </w:r>
     <w:r>
       <w:t>-2026</w:t>
@@ -27310,15 +27323,6 @@
 </file>
 
 <file path=customXml/item1.xml><?xml version="1.0" encoding="utf-8"?>
-<?mso-contentType ?>
-<FormTemplates xmlns="http://schemas.microsoft.com/sharepoint/v3/contenttype/forms">
-  <Display>DocumentLibraryForm</Display>
-  <Edit>DocumentLibraryForm</Edit>
-  <New>DocumentLibraryForm</New>
-</FormTemplates>
-</file>
-
-<file path=customXml/item2.xml><?xml version="1.0" encoding="utf-8"?>
 <ct:contentTypeSchema xmlns:ct="http://schemas.microsoft.com/office/2006/metadata/contentType" xmlns:ma="http://schemas.microsoft.com/office/2006/metadata/properties/metaAttributes" ct:_="" ma:_="" ma:contentTypeName="Document" ma:contentTypeID="0x010100D0BB77D65DB97745B835076E0EF123F1" ma:contentTypeVersion="3" ma:contentTypeDescription="Een nieuw document maken." ma:contentTypeScope="" ma:versionID="f5e20feff643aae03d305ed3501b9de7">
   <xsd:schema xmlns:xsd="http://www.w3.org/2001/XMLSchema" xmlns:xs="http://www.w3.org/2001/XMLSchema" xmlns:p="http://schemas.microsoft.com/office/2006/metadata/properties" xmlns:ns2="9c4fc8d7-28d9-45de-9015-6a9b5ed128f7" targetNamespace="http://schemas.microsoft.com/office/2006/metadata/properties" ma:root="true" ma:fieldsID="e4c8b2eb8dfeb271dd91865265868f5e" ns2:_="">
     <xsd:import namespace="9c4fc8d7-28d9-45de-9015-6a9b5ed128f7"/>
@@ -27456,13 +27460,16 @@
 </ct:contentTypeSchema>
 </file>
 
-<file path=customXml/item3.xml><?xml version="1.0" encoding="utf-8"?>
-<p:properties xmlns:p="http://schemas.microsoft.com/office/2006/metadata/properties" xmlns:xsi="http://www.w3.org/2001/XMLSchema-instance" xmlns:pc="http://schemas.microsoft.com/office/infopath/2007/PartnerControls">
-  <documentManagement/>
-</p:properties>
+<file path=customXml/item2.xml><?xml version="1.0" encoding="utf-8"?>
+<?mso-contentType ?>
+<FormTemplates xmlns="http://schemas.microsoft.com/sharepoint/v3/contenttype/forms">
+  <Display>DocumentLibraryForm</Display>
+  <Edit>DocumentLibraryForm</Edit>
+  <New>DocumentLibraryForm</New>
+</FormTemplates>
 </file>
 
-<file path=customXml/item4.xml><?xml version="1.0" encoding="utf-8"?>
+<file path=customXml/item3.xml><?xml version="1.0" encoding="utf-8"?>
 <b:Sources xmlns:b="http://schemas.openxmlformats.org/officeDocument/2006/bibliography" xmlns="http://schemas.openxmlformats.org/officeDocument/2006/bibliography" SelectedStyle="/APASixthEditionOfficeOnline.xsl" StyleName="APA" Version="6">
   <b:Source>
     <b:Tag>Vin22</b:Tag>
@@ -27557,15 +27564,13 @@
 </b:Sources>
 </file>
 
-<file path=customXml/itemProps1.xml><?xml version="1.0" encoding="utf-8"?>
-<ds:datastoreItem xmlns:ds="http://schemas.openxmlformats.org/officeDocument/2006/customXml" ds:itemID="{82D9BFC6-F333-43E5-9205-C8904E48ED3D}">
-  <ds:schemaRefs>
-    <ds:schemaRef ds:uri="http://schemas.microsoft.com/sharepoint/v3/contenttype/forms"/>
-  </ds:schemaRefs>
-</ds:datastoreItem>
+<file path=customXml/item4.xml><?xml version="1.0" encoding="utf-8"?>
+<p:properties xmlns:p="http://schemas.microsoft.com/office/2006/metadata/properties" xmlns:xsi="http://www.w3.org/2001/XMLSchema-instance" xmlns:pc="http://schemas.microsoft.com/office/infopath/2007/PartnerControls">
+  <documentManagement/>
+</p:properties>
 </file>
 
-<file path=customXml/itemProps2.xml><?xml version="1.0" encoding="utf-8"?>
+<file path=customXml/itemProps1.xml><?xml version="1.0" encoding="utf-8"?>
 <ds:datastoreItem xmlns:ds="http://schemas.openxmlformats.org/officeDocument/2006/customXml" ds:itemID="{BCB0D87B-C877-4F66-B5F5-352EF415DDF1}">
   <ds:schemaRefs>
     <ds:schemaRef ds:uri="http://schemas.microsoft.com/office/2006/metadata/contentType"/>
@@ -27583,19 +27588,27 @@
 </ds:datastoreItem>
 </file>
 
+<file path=customXml/itemProps2.xml><?xml version="1.0" encoding="utf-8"?>
+<ds:datastoreItem xmlns:ds="http://schemas.openxmlformats.org/officeDocument/2006/customXml" ds:itemID="{82D9BFC6-F333-43E5-9205-C8904E48ED3D}">
+  <ds:schemaRefs>
+    <ds:schemaRef ds:uri="http://schemas.microsoft.com/sharepoint/v3/contenttype/forms"/>
+  </ds:schemaRefs>
+</ds:datastoreItem>
+</file>
+
 <file path=customXml/itemProps3.xml><?xml version="1.0" encoding="utf-8"?>
-<ds:datastoreItem xmlns:ds="http://schemas.openxmlformats.org/officeDocument/2006/customXml" ds:itemID="{F6733805-3435-4F94-A33F-6225E5CBCD31}">
+<ds:datastoreItem xmlns:ds="http://schemas.openxmlformats.org/officeDocument/2006/customXml" ds:itemID="{8C6B7691-150B-3140-AF98-66DE9E0B84E1}">
   <ds:schemaRefs>
-    <ds:schemaRef ds:uri="http://schemas.microsoft.com/office/2006/metadata/properties"/>
-    <ds:schemaRef ds:uri="http://schemas.microsoft.com/office/infopath/2007/PartnerControls"/>
+    <ds:schemaRef ds:uri="http://schemas.openxmlformats.org/officeDocument/2006/bibliography"/>
   </ds:schemaRefs>
 </ds:datastoreItem>
 </file>
 
 <file path=customXml/itemProps4.xml><?xml version="1.0" encoding="utf-8"?>
-<ds:datastoreItem xmlns:ds="http://schemas.openxmlformats.org/officeDocument/2006/customXml" ds:itemID="{8C6B7691-150B-3140-AF98-66DE9E0B84E1}">
+<ds:datastoreItem xmlns:ds="http://schemas.openxmlformats.org/officeDocument/2006/customXml" ds:itemID="{F6733805-3435-4F94-A33F-6225E5CBCD31}">
   <ds:schemaRefs>
-    <ds:schemaRef ds:uri="http://schemas.openxmlformats.org/officeDocument/2006/bibliography"/>
+    <ds:schemaRef ds:uri="http://schemas.microsoft.com/office/2006/metadata/properties"/>
+    <ds:schemaRef ds:uri="http://schemas.microsoft.com/office/infopath/2007/PartnerControls"/>
   </ds:schemaRefs>
 </ds:datastoreItem>
 </file>

</xml_diff>